<commit_message>
Add P/B vs ROE regression slide to Halyk IC memo
New page 7 plots price/book (x) against ROE (y) for Halyk and seven
listed peers with an all-peer OLS line and an ex-Kaspi line, and
cross-references it from the valuation pages.

Co-Authored-By: Claude Opus 5.5 <noreply@anthropic.com>
Claude-Session: https://claude.ai/code/session_01MSRWC6xH2xKWna17Gucs2t
</commit_message>
<xml_diff>
--- a/Halyk_Bank_HSBK_IC_Memo.docx
+++ b/Halyk_Bank_HSBK_IC_Memo.docx
@@ -6494,7 +6494,7 @@
                 <w:color w:val="1F2937"/>
                 <w:sz w:val="17"/>
               </w:rPr>
-              <w:t>On the P/B-ROE line (R2 0.24) Halyk 'should' trade at ~1.9x book; it trades at 1.1x</w:t>
+              <w:t>On the peer P/B-ROE regression Halyk's 27% ROE maps to ~1.55x book (page 7); it trades at 1.1x</w:t>
             </w:r>
           </w:p>
           <w:p>
@@ -6803,7 +6803,7 @@
             <w:r>
               <w:drawing>
                 <wp:inline xmlns:a="http://schemas.openxmlformats.org/drawingml/2006/main" xmlns:pic="http://schemas.openxmlformats.org/drawingml/2006/picture">
-                  <wp:extent cx="6949440" cy="4197462"/>
+                  <wp:extent cx="6720840" cy="4059387"/>
                   <wp:docPr id="2" name="Picture 2"/>
                   <wp:cNvGraphicFramePr>
                     <a:graphicFrameLocks noChangeAspect="1"/>
@@ -6824,7 +6824,7 @@
                         <pic:spPr>
                           <a:xfrm>
                             <a:off x="0" y="0"/>
-                            <a:ext cx="6949440" cy="4197462"/>
+                            <a:ext cx="6720840" cy="4059387"/>
                           </a:xfrm>
                           <a:prstGeom prst="rect"/>
                         </pic:spPr>
@@ -6989,7 +6989,7 @@
                 <w:color w:val="1F2937"/>
                 <w:sz w:val="17"/>
               </w:rPr>
-              <w:t xml:space="preserve"> P/B = 0.93 + 0.037 x ROE (R2 0.24) implies 1.92x for Halyk vs 1.12x - but Kaspi drives the slope</w:t>
+              <w:t xml:space="preserve"> see next page - Halyk's ROE maps to ~1.55x book vs 1.12x actual</w:t>
             </w:r>
           </w:p>
           <w:p>
@@ -7023,6 +7023,483 @@
                 <w:sz w:val="17"/>
               </w:rPr>
               <w:t xml:space="preserve"> cheap on every relative screen; the gap is a country/governance discount we expect to narrow only partly</w:t>
+            </w:r>
+          </w:p>
+        </w:tc>
+      </w:tr>
+    </w:tbl>
+    <w:p>
+      <w:pPr>
+        <w:spacing w:after="0" w:before="0"/>
+      </w:pPr>
+      <w:r>
+        <w:rPr>
+          <w:sz w:val="2"/>
+        </w:rPr>
+        <w:br w:type="page"/>
+      </w:r>
+    </w:p>
+    <w:tbl>
+      <w:tblPr>
+        <w:tblW w:type="auto" w:w="0"/>
+        <w:tblLook w:firstColumn="1" w:firstRow="1" w:lastColumn="0" w:lastRow="0" w:noHBand="0" w:noVBand="1" w:val="04A0"/>
+        <w:tblInd w:w="0" w:type="dxa"/>
+        <w:tblCellMar>
+          <w:left w:w="0" w:type="dxa"/>
+          <w:right w:w="0" w:type="dxa"/>
+        </w:tblCellMar>
+        <w:tblBorders>
+          <w:top w:val="nil"/>
+          <w:left w:val="nil"/>
+          <w:bottom w:val="nil"/>
+          <w:right w:val="nil"/>
+          <w:insideH w:val="nil"/>
+          <w:insideV w:val="nil"/>
+        </w:tblBorders>
+        <w:tblLayout w:type="fixed"/>
+      </w:tblPr>
+      <w:tblGrid>
+        <w:gridCol w:w="14735"/>
+        <w:gridCol w:w="3168"/>
+      </w:tblGrid>
+      <w:tr>
+        <w:tc>
+          <w:tcPr>
+            <w:tcW w:type="dxa" w:w="14736"/>
+            <w:tcMar>
+              <w:top w:w="0" w:type="dxa"/>
+              <w:left w:w="0" w:type="dxa"/>
+              <w:bottom w:w="0" w:type="dxa"/>
+              <w:right w:w="0" w:type="dxa"/>
+            </w:tcMar>
+            <w:vAlign w:val="center"/>
+          </w:tcPr>
+          <w:p>
+            <w:r>
+              <w:rPr>
+                <w:rFonts w:ascii="Arial" w:hAnsi="Arial"/>
+                <w:b/>
+                <w:i w:val="0"/>
+                <w:color w:val="2F6FD0"/>
+                <w:sz w:val="17"/>
+              </w:rPr>
+              <w:t>QUESTION 1 - IS HALYK UNDERVALUED?</w:t>
+            </w:r>
+          </w:p>
+        </w:tc>
+        <w:tc>
+          <w:tcPr>
+            <w:tcW w:type="dxa" w:w="3168"/>
+            <w:tcMar>
+              <w:top w:w="0" w:type="dxa"/>
+              <w:left w:w="0" w:type="dxa"/>
+              <w:bottom w:w="0" w:type="dxa"/>
+              <w:right w:w="0" w:type="dxa"/>
+            </w:tcMar>
+          </w:tcPr>
+          <w:tbl>
+            <w:tblPr>
+              <w:tblW w:type="auto" w:w="0"/>
+              <w:tblLook w:firstColumn="1" w:firstRow="1" w:lastColumn="0" w:lastRow="0" w:noHBand="0" w:noVBand="1" w:val="04A0"/>
+              <w:jc w:val="right"/>
+              <w:tblInd w:w="0" w:type="dxa"/>
+              <w:tblCellMar>
+                <w:left w:w="0" w:type="dxa"/>
+                <w:right w:w="0" w:type="dxa"/>
+              </w:tblCellMar>
+              <w:tblBorders>
+                <w:top w:val="nil"/>
+                <w:left w:val="nil"/>
+                <w:bottom w:val="nil"/>
+                <w:right w:val="nil"/>
+                <w:insideH w:val="nil"/>
+                <w:insideV w:val="nil"/>
+              </w:tblBorders>
+              <w:tblLayout w:type="fixed"/>
+            </w:tblPr>
+            <w:tblGrid>
+              <w:gridCol w:w="2145"/>
+            </w:tblGrid>
+            <w:tr>
+              <w:tc>
+                <w:tcPr>
+                  <w:tcW w:type="dxa" w:w="2146"/>
+                  <w:shd w:val="clear" w:color="auto" w:fill="13213F"/>
+                  <w:tcMar>
+                    <w:top w:w="90" w:type="dxa"/>
+                    <w:left w:w="80" w:type="dxa"/>
+                    <w:bottom w:w="90" w:type="dxa"/>
+                    <w:right w:w="80" w:type="dxa"/>
+                  </w:tcMar>
+                  <w:vAlign w:val="center"/>
+                </w:tcPr>
+                <w:p>
+                  <w:pPr>
+                    <w:jc w:val="center"/>
+                  </w:pPr>
+                  <w:r>
+                    <w:rPr>
+                      <w:rFonts w:ascii="Arial" w:hAnsi="Arial"/>
+                      <w:b/>
+                      <w:i w:val="0"/>
+                      <w:color w:val="FFFFFF"/>
+                      <w:sz w:val="15"/>
+                    </w:rPr>
+                    <w:t>VALUATION</w:t>
+                  </w:r>
+                </w:p>
+              </w:tc>
+            </w:tr>
+          </w:tbl>
+          <w:p/>
+          <w:p>
+            <w:pPr>
+              <w:spacing w:after="0" w:line="20" w:lineRule="exact"/>
+            </w:pPr>
+            <w:r>
+              <w:rPr>
+                <w:sz w:val="2"/>
+              </w:rPr>
+            </w:r>
+          </w:p>
+        </w:tc>
+      </w:tr>
+    </w:tbl>
+    <w:p>
+      <w:pPr>
+        <w:spacing w:before="0" w:after="80" w:line="40" w:lineRule="exact"/>
+        <w:pBdr>
+          <w:bottom w:val="single" w:sz="6" w:space="2" w:color="1F2937"/>
+        </w:pBdr>
+      </w:pPr>
+    </w:p>
+    <w:p>
+      <w:pPr>
+        <w:spacing w:before="80" w:after="160" w:line="240" w:lineRule="auto"/>
+      </w:pPr>
+      <w:r>
+        <w:rPr>
+          <w:rFonts w:ascii="Arial" w:hAnsi="Arial"/>
+          <w:b/>
+          <w:i w:val="0"/>
+          <w:color w:val="13213F"/>
+          <w:sz w:val="36"/>
+        </w:rPr>
+        <w:t>Regression: P/B vs ROE - more return per unit of book multiple than any peer</w:t>
+      </w:r>
+    </w:p>
+    <w:tbl>
+      <w:tblPr>
+        <w:tblW w:type="auto" w:w="0"/>
+        <w:tblLook w:firstColumn="1" w:firstRow="1" w:lastColumn="0" w:lastRow="0" w:noHBand="0" w:noVBand="1" w:val="04A0"/>
+        <w:tblInd w:w="0" w:type="dxa"/>
+        <w:tblCellMar>
+          <w:left w:w="0" w:type="dxa"/>
+          <w:right w:w="0" w:type="dxa"/>
+        </w:tblCellMar>
+        <w:tblBorders>
+          <w:top w:val="nil"/>
+          <w:left w:val="nil"/>
+          <w:bottom w:val="nil"/>
+          <w:right w:val="nil"/>
+          <w:insideH w:val="nil"/>
+          <w:insideV w:val="nil"/>
+        </w:tblBorders>
+        <w:tblLayout w:type="fixed"/>
+      </w:tblPr>
+      <w:tblGrid>
+        <w:gridCol w:w="10944"/>
+        <w:gridCol w:w="503"/>
+        <w:gridCol w:w="6451"/>
+      </w:tblGrid>
+      <w:tr>
+        <w:tc>
+          <w:tcPr>
+            <w:tcW w:type="dxa" w:w="10944"/>
+            <w:tcMar>
+              <w:top w:w="0" w:type="dxa"/>
+              <w:left w:w="0" w:type="dxa"/>
+              <w:bottom w:w="0" w:type="dxa"/>
+              <w:right w:w="0" w:type="dxa"/>
+            </w:tcMar>
+          </w:tcPr>
+          <w:p>
+            <w:r>
+              <w:drawing>
+                <wp:inline xmlns:a="http://schemas.openxmlformats.org/drawingml/2006/main" xmlns:pic="http://schemas.openxmlformats.org/drawingml/2006/picture">
+                  <wp:extent cx="6720840" cy="4188637"/>
+                  <wp:docPr id="3" name="Picture 3"/>
+                  <wp:cNvGraphicFramePr>
+                    <a:graphicFrameLocks noChangeAspect="1"/>
+                  </wp:cNvGraphicFramePr>
+                  <a:graphic>
+                    <a:graphicData uri="http://schemas.openxmlformats.org/drawingml/2006/picture">
+                      <pic:pic>
+                        <pic:nvPicPr>
+                          <pic:cNvPr id="0" name="regression_pb_x_roe_y.png"/>
+                          <pic:cNvPicPr/>
+                        </pic:nvPicPr>
+                        <pic:blipFill>
+                          <a:blip r:embed="rId13"/>
+                          <a:stretch>
+                            <a:fillRect/>
+                          </a:stretch>
+                        </pic:blipFill>
+                        <pic:spPr>
+                          <a:xfrm>
+                            <a:off x="0" y="0"/>
+                            <a:ext cx="6720840" cy="4188637"/>
+                          </a:xfrm>
+                          <a:prstGeom prst="rect"/>
+                        </pic:spPr>
+                      </pic:pic>
+                    </a:graphicData>
+                  </a:graphic>
+                </wp:inline>
+              </w:drawing>
+            </w:r>
+          </w:p>
+        </w:tc>
+        <w:tc>
+          <w:tcPr>
+            <w:tcW w:type="dxa" w:w="504"/>
+          </w:tcPr>
+          <w:p/>
+        </w:tc>
+        <w:tc>
+          <w:tcPr>
+            <w:tcW w:type="dxa" w:w="6451"/>
+            <w:tcMar>
+              <w:top w:w="0" w:type="dxa"/>
+              <w:left w:w="0" w:type="dxa"/>
+              <w:bottom w:w="0" w:type="dxa"/>
+              <w:right w:w="0" w:type="dxa"/>
+            </w:tcMar>
+          </w:tcPr>
+          <w:p>
+            <w:pPr>
+              <w:spacing w:after="120"/>
+              <w:pBdr>
+                <w:bottom w:val="single" w:sz="4" w:space="2" w:color="C9CCD3"/>
+              </w:pBdr>
+            </w:pPr>
+            <w:r>
+              <w:rPr>
+                <w:rFonts w:ascii="Arial" w:hAnsi="Arial"/>
+                <w:b/>
+                <w:i w:val="0"/>
+                <w:color w:val="13213F"/>
+                <w:sz w:val="21"/>
+              </w:rPr>
+              <w:t>How to read it</w:t>
+            </w:r>
+          </w:p>
+          <w:p>
+            <w:pPr>
+              <w:spacing w:after="80" w:line="269" w:lineRule="auto"/>
+              <w:ind w:left="259" w:hanging="259"/>
+            </w:pPr>
+            <w:r>
+              <w:rPr>
+                <w:color w:val="2F6FD0"/>
+                <w:sz w:val="12"/>
+              </w:rPr>
+              <w:t xml:space="preserve">■  </w:t>
+            </w:r>
+            <w:r>
+              <w:rPr>
+                <w:rFonts w:ascii="Arial" w:hAnsi="Arial"/>
+                <w:b w:val="0"/>
+                <w:i w:val="0"/>
+                <w:color w:val="1F2937"/>
+                <w:sz w:val="17"/>
+              </w:rPr>
+              <w:t>x-axis = price / book value; y-axis = return on equity. Points above the line earn more ROE than their P/B implies - i.e. they are cheaper</w:t>
+            </w:r>
+          </w:p>
+          <w:p>
+            <w:pPr>
+              <w:spacing w:after="80" w:line="269" w:lineRule="auto"/>
+              <w:ind w:left="259" w:hanging="259"/>
+            </w:pPr>
+            <w:r>
+              <w:rPr>
+                <w:color w:val="2F6FD0"/>
+                <w:sz w:val="12"/>
+              </w:rPr>
+              <w:t xml:space="preserve">■  </w:t>
+            </w:r>
+            <w:r>
+              <w:rPr>
+                <w:rFonts w:ascii="Arial" w:hAnsi="Arial"/>
+                <w:b/>
+                <w:i w:val="0"/>
+                <w:color w:val="1F2937"/>
+                <w:sz w:val="17"/>
+              </w:rPr>
+              <w:t>Peer OLS (7 banks):</w:t>
+            </w:r>
+            <w:r>
+              <w:rPr>
+                <w:rFonts w:ascii="Arial" w:hAnsi="Arial"/>
+                <w:b w:val="0"/>
+                <w:i w:val="0"/>
+                <w:color w:val="1F2937"/>
+                <w:sz w:val="17"/>
+              </w:rPr>
+              <w:t xml:space="preserve"> ROE = 16.8 + 6.59 x P/B; R2 = 0.24</w:t>
+            </w:r>
+          </w:p>
+          <w:p>
+            <w:pPr>
+              <w:spacing w:after="80" w:line="269" w:lineRule="auto"/>
+              <w:ind w:left="259" w:hanging="259"/>
+            </w:pPr>
+            <w:r>
+              <w:rPr>
+                <w:color w:val="2F6FD0"/>
+                <w:sz w:val="12"/>
+              </w:rPr>
+              <w:t xml:space="preserve">■  </w:t>
+            </w:r>
+            <w:r>
+              <w:rPr>
+                <w:rFonts w:ascii="Arial" w:hAnsi="Arial"/>
+                <w:b/>
+                <w:i w:val="0"/>
+                <w:color w:val="1F2937"/>
+                <w:sz w:val="17"/>
+              </w:rPr>
+              <w:t>Halyk sits ~3pp above the line:</w:t>
+            </w:r>
+            <w:r>
+              <w:rPr>
+                <w:rFonts w:ascii="Arial" w:hAnsi="Arial"/>
+                <w:b w:val="0"/>
+                <w:i w:val="0"/>
+                <w:color w:val="1F2937"/>
+                <w:sz w:val="17"/>
+              </w:rPr>
+              <w:t xml:space="preserve"> at 1.12x book the peer line implies a 24.1% ROE; Halyk earns ~27% (LTM)</w:t>
+            </w:r>
+          </w:p>
+          <w:p>
+            <w:pPr>
+              <w:spacing w:after="80" w:line="269" w:lineRule="auto"/>
+              <w:ind w:left="259" w:hanging="259"/>
+            </w:pPr>
+            <w:r>
+              <w:rPr>
+                <w:color w:val="2F6FD0"/>
+                <w:sz w:val="12"/>
+              </w:rPr>
+              <w:t xml:space="preserve">■  </w:t>
+            </w:r>
+            <w:r>
+              <w:rPr>
+                <w:rFonts w:ascii="Arial" w:hAnsi="Arial"/>
+                <w:b/>
+                <w:i w:val="0"/>
+                <w:color w:val="1F2937"/>
+                <w:sz w:val="17"/>
+              </w:rPr>
+              <w:t>Read the other way:</w:t>
+            </w:r>
+            <w:r>
+              <w:rPr>
+                <w:rFonts w:ascii="Arial" w:hAnsi="Arial"/>
+                <w:b w:val="0"/>
+                <w:i w:val="0"/>
+                <w:color w:val="1F2937"/>
+                <w:sz w:val="17"/>
+              </w:rPr>
+              <w:t xml:space="preserve"> Halyk's 27% ROE maps to </w:t>
+            </w:r>
+            <w:r>
+              <w:rPr>
+                <w:rFonts w:ascii="Arial" w:hAnsi="Arial"/>
+                <w:b/>
+                <w:i w:val="0"/>
+                <w:color w:val="1F2937"/>
+                <w:sz w:val="17"/>
+              </w:rPr>
+              <w:t>~1.55x P/B</w:t>
+            </w:r>
+            <w:r>
+              <w:rPr>
+                <w:rFonts w:ascii="Arial" w:hAnsi="Arial"/>
+                <w:b w:val="0"/>
+                <w:i w:val="0"/>
+                <w:color w:val="1F2937"/>
+                <w:sz w:val="17"/>
+              </w:rPr>
+              <w:t xml:space="preserve"> on the line - ~39% above today's 1.12x (KZT~520, ~US$46/GDR at spot) [e]</w:t>
+            </w:r>
+          </w:p>
+          <w:p>
+            <w:pPr>
+              <w:spacing w:after="80" w:line="269" w:lineRule="auto"/>
+              <w:ind w:left="259" w:hanging="259"/>
+            </w:pPr>
+            <w:r>
+              <w:rPr>
+                <w:color w:val="2F6FD0"/>
+                <w:sz w:val="12"/>
+              </w:rPr>
+              <w:t xml:space="preserve">■  </w:t>
+            </w:r>
+            <w:r>
+              <w:rPr>
+                <w:rFonts w:ascii="Arial" w:hAnsi="Arial"/>
+                <w:b/>
+                <w:i w:val="0"/>
+                <w:color w:val="1F2937"/>
+                <w:sz w:val="17"/>
+              </w:rPr>
+              <w:t>Caveat:</w:t>
+            </w:r>
+            <w:r>
+              <w:rPr>
+                <w:rFonts w:ascii="Arial" w:hAnsi="Arial"/>
+                <w:b w:val="0"/>
+                <w:i w:val="0"/>
+                <w:color w:val="1F2937"/>
+                <w:sz w:val="17"/>
+              </w:rPr>
+              <w:t xml:space="preserve"> Kaspi (3.7x, 55%) drives the positive slope. Ex-Kaspi the line slopes down (R2 0.75): CEE banks with lower ROE trade at higher P/B - country risk dominates</w:t>
+            </w:r>
+          </w:p>
+          <w:p>
+            <w:pPr>
+              <w:spacing w:after="80" w:line="269" w:lineRule="auto"/>
+              <w:ind w:left="259" w:hanging="259"/>
+            </w:pPr>
+            <w:r>
+              <w:rPr>
+                <w:color w:val="2F6FD0"/>
+                <w:sz w:val="12"/>
+              </w:rPr>
+              <w:t xml:space="preserve">■  </w:t>
+            </w:r>
+            <w:r>
+              <w:rPr>
+                <w:rFonts w:ascii="Arial" w:hAnsi="Arial"/>
+                <w:b/>
+                <w:i w:val="0"/>
+                <w:color w:val="1F2937"/>
+                <w:sz w:val="17"/>
+              </w:rPr>
+              <w:t>Use:</w:t>
+            </w:r>
+            <w:r>
+              <w:rPr>
+                <w:rFonts w:ascii="Arial" w:hAnsi="Arial"/>
+                <w:b w:val="0"/>
+                <w:i w:val="0"/>
+                <w:color w:val="1F2937"/>
+                <w:sz w:val="17"/>
+              </w:rPr>
+              <w:t xml:space="preserve"> supports a P/B of 1.2-1.55x; our target uses 1.14x 2027E book (and our justified P/B is 1.35x), so we do not underwrite the full gap</w:t>
             </w:r>
           </w:p>
         </w:tc>
@@ -7228,7 +7705,7 @@
               <w:drawing>
                 <wp:inline xmlns:a="http://schemas.openxmlformats.org/drawingml/2006/main" xmlns:pic="http://schemas.openxmlformats.org/drawingml/2006/picture">
                   <wp:extent cx="6675120" cy="2819831"/>
-                  <wp:docPr id="3" name="Picture 3"/>
+                  <wp:docPr id="4" name="Picture 4"/>
                   <wp:cNvGraphicFramePr>
                     <a:graphicFrameLocks noChangeAspect="1"/>
                   </wp:cNvGraphicFramePr>
@@ -7240,7 +7717,7 @@
                           <pic:cNvPicPr/>
                         </pic:nvPicPr>
                         <pic:blipFill>
-                          <a:blip r:embed="rId13"/>
+                          <a:blip r:embed="rId14"/>
                           <a:stretch>
                             <a:fillRect/>
                           </a:stretch>
@@ -8309,7 +8786,7 @@
               <w:drawing>
                 <wp:inline xmlns:a="http://schemas.openxmlformats.org/drawingml/2006/main" xmlns:pic="http://schemas.openxmlformats.org/drawingml/2006/picture">
                   <wp:extent cx="6675120" cy="2291250"/>
-                  <wp:docPr id="4" name="Picture 4"/>
+                  <wp:docPr id="5" name="Picture 5"/>
                   <wp:cNvGraphicFramePr>
                     <a:graphicFrameLocks noChangeAspect="1"/>
                   </wp:cNvGraphicFramePr>
@@ -8321,7 +8798,7 @@
                           <pic:cNvPicPr/>
                         </pic:nvPicPr>
                         <pic:blipFill>
-                          <a:blip r:embed="rId14"/>
+                          <a:blip r:embed="rId15"/>
                           <a:stretch>
                             <a:fillRect/>
                           </a:stretch>
@@ -10018,7 +10495,7 @@
               <w:drawing>
                 <wp:inline xmlns:a="http://schemas.openxmlformats.org/drawingml/2006/main" xmlns:pic="http://schemas.openxmlformats.org/drawingml/2006/picture">
                   <wp:extent cx="6675120" cy="3310074"/>
-                  <wp:docPr id="5" name="Picture 5"/>
+                  <wp:docPr id="6" name="Picture 6"/>
                   <wp:cNvGraphicFramePr>
                     <a:graphicFrameLocks noChangeAspect="1"/>
                   </wp:cNvGraphicFramePr>
@@ -10030,7 +10507,7 @@
                           <pic:cNvPicPr/>
                         </pic:nvPicPr>
                         <pic:blipFill>
-                          <a:blip r:embed="rId15"/>
+                          <a:blip r:embed="rId16"/>
                           <a:stretch>
                             <a:fillRect/>
                           </a:stretch>
@@ -10473,7 +10950,7 @@
               <w:drawing>
                 <wp:inline xmlns:a="http://schemas.openxmlformats.org/drawingml/2006/main" xmlns:pic="http://schemas.openxmlformats.org/drawingml/2006/picture">
                   <wp:extent cx="6949440" cy="2358017"/>
-                  <wp:docPr id="6" name="Picture 6"/>
+                  <wp:docPr id="7" name="Picture 7"/>
                   <wp:cNvGraphicFramePr>
                     <a:graphicFrameLocks noChangeAspect="1"/>
                   </wp:cNvGraphicFramePr>
@@ -10485,7 +10962,7 @@
                           <pic:cNvPicPr/>
                         </pic:nvPicPr>
                         <pic:blipFill>
-                          <a:blip r:embed="rId16"/>
+                          <a:blip r:embed="rId17"/>
                           <a:stretch>
                             <a:fillRect/>
                           </a:stretch>
@@ -14486,7 +14963,7 @@
               <w:drawing>
                 <wp:inline xmlns:a="http://schemas.openxmlformats.org/drawingml/2006/main" xmlns:pic="http://schemas.openxmlformats.org/drawingml/2006/picture">
                   <wp:extent cx="4937760" cy="2634336"/>
-                  <wp:docPr id="7" name="Picture 7"/>
+                  <wp:docPr id="8" name="Picture 8"/>
                   <wp:cNvGraphicFramePr>
                     <a:graphicFrameLocks noChangeAspect="1"/>
                   </wp:cNvGraphicFramePr>
@@ -14498,7 +14975,7 @@
                           <pic:cNvPicPr/>
                         </pic:nvPicPr>
                         <pic:blipFill>
-                          <a:blip r:embed="rId17"/>
+                          <a:blip r:embed="rId18"/>
                           <a:stretch>
                             <a:fillRect/>
                           </a:stretch>
@@ -17349,8 +17826,8 @@
       </w:tr>
     </w:tbl>
     <w:sectPr>
-      <w:footerReference w:type="default" r:id="rId18"/>
-      <w:headerReference w:type="default" r:id="rId19"/>
+      <w:footerReference w:type="default" r:id="rId19"/>
+      <w:headerReference w:type="default" r:id="rId20"/>
       <w:pgSz w:w="19200" w:h="10800" w:orient="landscape"/>
       <w:pgMar w:top="0" w:right="0" w:bottom="0" w:left="0" w:header="0" w:footer="0" w:gutter="0"/>
       <w:cols w:space="720"/>

</xml_diff>

<commit_message>
Reformat Halyk research report and IC memo to US Letter
Research report moves from A4 to US Letter portrait (36 pages); the
IC memo moves from 16:9 to US Letter landscape (18 pages). Content is
unchanged.

Co-Authored-By: Claude Opus 5.5 <noreply@anthropic.com>
Claude-Session: https://claude.ai/code/session_01MSRWC6xH2xKWna17Gucs2t
</commit_message>
<xml_diff>
--- a/Halyk_Bank_HSBK_IC_Memo.docx
+++ b/Halyk_Bank_HSBK_IC_Memo.docx
@@ -22,16 +22,16 @@
         <w:tblLayout w:type="fixed"/>
       </w:tblPr>
       <w:tblGrid>
-        <w:gridCol w:w="12816"/>
-        <w:gridCol w:w="6383"/>
+        <w:gridCol w:w="10573"/>
+        <w:gridCol w:w="5266"/>
       </w:tblGrid>
       <w:tr>
         <w:trPr>
-          <w:trHeight w:val="10368" w:hRule="exact"/>
+          <w:trHeight w:val="11808" w:hRule="exact"/>
         </w:trPr>
         <w:tc>
           <w:tcPr>
-            <w:tcW w:type="dxa" w:w="12816"/>
+            <w:tcW w:type="dxa" w:w="10573"/>
             <w:shd w:val="clear" w:color="auto" w:fill="13213F"/>
             <w:tcMar>
               <w:top w:w="1100" w:type="dxa"/>
@@ -114,14 +114,14 @@
               <w:tblLayout w:type="fixed"/>
             </w:tblPr>
             <w:tblGrid>
-              <w:gridCol w:w="3456"/>
+              <w:gridCol w:w="2851"/>
               <w:gridCol w:w="216"/>
-              <w:gridCol w:w="4752"/>
+              <w:gridCol w:w="3920"/>
             </w:tblGrid>
             <w:tr>
               <w:tc>
                 <w:tcPr>
-                  <w:tcW w:type="dxa" w:w="3456"/>
+                  <w:tcW w:type="dxa" w:w="2851"/>
                   <w:shd w:val="clear" w:color="auto" w:fill="2F6FD0"/>
                   <w:tcMar>
                     <w:top w:w="90" w:type="dxa"/>
@@ -154,7 +154,7 @@
               </w:tc>
               <w:tc>
                 <w:tcPr>
-                  <w:tcW w:type="dxa" w:w="4752"/>
+                  <w:tcW w:type="dxa" w:w="3920"/>
                   <w:tcMar>
                     <w:top w:w="90" w:type="dxa"/>
                     <w:left w:w="120" w:type="dxa"/>
@@ -212,15 +212,15 @@
               <w:tblLayout w:type="fixed"/>
             </w:tblPr>
             <w:tblGrid>
-              <w:gridCol w:w="2808"/>
-              <w:gridCol w:w="2808"/>
-              <w:gridCol w:w="2808"/>
-              <w:gridCol w:w="2808"/>
+              <w:gridCol w:w="2316"/>
+              <w:gridCol w:w="2316"/>
+              <w:gridCol w:w="2316"/>
+              <w:gridCol w:w="2316"/>
             </w:tblGrid>
             <w:tr>
               <w:tc>
                 <w:tcPr>
-                  <w:tcW w:type="dxa" w:w="2808"/>
+                  <w:tcW w:type="dxa" w:w="2317"/>
                   <w:tcMar>
                     <w:top w:w="140" w:type="dxa"/>
                     <w:left w:w="0" w:type="dxa"/>
@@ -243,7 +243,7 @@
               </w:tc>
               <w:tc>
                 <w:tcPr>
-                  <w:tcW w:type="dxa" w:w="2808"/>
+                  <w:tcW w:type="dxa" w:w="2317"/>
                   <w:tcMar>
                     <w:top w:w="140" w:type="dxa"/>
                     <w:left w:w="0" w:type="dxa"/>
@@ -266,7 +266,7 @@
               </w:tc>
               <w:tc>
                 <w:tcPr>
-                  <w:tcW w:type="dxa" w:w="2808"/>
+                  <w:tcW w:type="dxa" w:w="2317"/>
                   <w:tcMar>
                     <w:top w:w="140" w:type="dxa"/>
                     <w:left w:w="0" w:type="dxa"/>
@@ -289,7 +289,7 @@
               </w:tc>
               <w:tc>
                 <w:tcPr>
-                  <w:tcW w:type="dxa" w:w="2808"/>
+                  <w:tcW w:type="dxa" w:w="2317"/>
                   <w:tcMar>
                     <w:top w:w="140" w:type="dxa"/>
                     <w:left w:w="0" w:type="dxa"/>
@@ -314,7 +314,7 @@
             <w:tr>
               <w:tc>
                 <w:tcPr>
-                  <w:tcW w:type="dxa" w:w="2808"/>
+                  <w:tcW w:type="dxa" w:w="2317"/>
                   <w:tcMar>
                     <w:top w:w="0" w:type="dxa"/>
                     <w:left w:w="0" w:type="dxa"/>
@@ -337,7 +337,7 @@
               </w:tc>
               <w:tc>
                 <w:tcPr>
-                  <w:tcW w:type="dxa" w:w="2808"/>
+                  <w:tcW w:type="dxa" w:w="2317"/>
                   <w:tcMar>
                     <w:top w:w="0" w:type="dxa"/>
                     <w:left w:w="0" w:type="dxa"/>
@@ -360,7 +360,7 @@
               </w:tc>
               <w:tc>
                 <w:tcPr>
-                  <w:tcW w:type="dxa" w:w="2808"/>
+                  <w:tcW w:type="dxa" w:w="2317"/>
                   <w:tcMar>
                     <w:top w:w="0" w:type="dxa"/>
                     <w:left w:w="0" w:type="dxa"/>
@@ -383,7 +383,7 @@
               </w:tc>
               <w:tc>
                 <w:tcPr>
-                  <w:tcW w:type="dxa" w:w="2808"/>
+                  <w:tcW w:type="dxa" w:w="2317"/>
                   <w:tcMar>
                     <w:top w:w="0" w:type="dxa"/>
                     <w:left w:w="0" w:type="dxa"/>
@@ -408,7 +408,7 @@
             <w:tr>
               <w:tc>
                 <w:tcPr>
-                  <w:tcW w:type="dxa" w:w="2808"/>
+                  <w:tcW w:type="dxa" w:w="2317"/>
                   <w:tcMar>
                     <w:top w:w="140" w:type="dxa"/>
                     <w:left w:w="0" w:type="dxa"/>
@@ -431,7 +431,7 @@
               </w:tc>
               <w:tc>
                 <w:tcPr>
-                  <w:tcW w:type="dxa" w:w="2808"/>
+                  <w:tcW w:type="dxa" w:w="2317"/>
                   <w:tcMar>
                     <w:top w:w="140" w:type="dxa"/>
                     <w:left w:w="0" w:type="dxa"/>
@@ -454,7 +454,7 @@
               </w:tc>
               <w:tc>
                 <w:tcPr>
-                  <w:tcW w:type="dxa" w:w="2808"/>
+                  <w:tcW w:type="dxa" w:w="2317"/>
                   <w:tcMar>
                     <w:top w:w="140" w:type="dxa"/>
                     <w:left w:w="0" w:type="dxa"/>
@@ -477,7 +477,7 @@
               </w:tc>
               <w:tc>
                 <w:tcPr>
-                  <w:tcW w:type="dxa" w:w="2808"/>
+                  <w:tcW w:type="dxa" w:w="2317"/>
                   <w:tcMar>
                     <w:top w:w="140" w:type="dxa"/>
                     <w:left w:w="0" w:type="dxa"/>
@@ -502,7 +502,7 @@
             <w:tr>
               <w:tc>
                 <w:tcPr>
-                  <w:tcW w:type="dxa" w:w="2808"/>
+                  <w:tcW w:type="dxa" w:w="2317"/>
                   <w:tcMar>
                     <w:top w:w="0" w:type="dxa"/>
                     <w:left w:w="0" w:type="dxa"/>
@@ -525,7 +525,7 @@
               </w:tc>
               <w:tc>
                 <w:tcPr>
-                  <w:tcW w:type="dxa" w:w="2808"/>
+                  <w:tcW w:type="dxa" w:w="2317"/>
                   <w:tcMar>
                     <w:top w:w="0" w:type="dxa"/>
                     <w:left w:w="0" w:type="dxa"/>
@@ -548,7 +548,7 @@
               </w:tc>
               <w:tc>
                 <w:tcPr>
-                  <w:tcW w:type="dxa" w:w="2808"/>
+                  <w:tcW w:type="dxa" w:w="2317"/>
                   <w:tcMar>
                     <w:top w:w="0" w:type="dxa"/>
                     <w:left w:w="0" w:type="dxa"/>
@@ -571,7 +571,7 @@
               </w:tc>
               <w:tc>
                 <w:tcPr>
-                  <w:tcW w:type="dxa" w:w="2808"/>
+                  <w:tcW w:type="dxa" w:w="2317"/>
                   <w:tcMar>
                     <w:top w:w="0" w:type="dxa"/>
                     <w:left w:w="0" w:type="dxa"/>
@@ -618,7 +618,7 @@
         </w:tc>
         <w:tc>
           <w:tcPr>
-            <w:tcW w:type="dxa" w:w="6384"/>
+            <w:tcW w:type="dxa" w:w="5267"/>
             <w:shd w:val="clear" w:color="auto" w:fill="13213F"/>
             <w:tcMar>
               <w:top w:w="1100" w:type="dxa"/>
@@ -734,7 +734,7 @@
       <w:pPr>
         <w:spacing w:before="0" w:after="0" w:line="20" w:lineRule="exact"/>
         <w:sectPr>
-          <w:pgSz w:w="19200" w:h="10800" w:orient="landscape"/>
+          <w:pgSz w:w="15840" w:h="12240" w:orient="landscape"/>
           <w:pgMar w:top="0" w:right="0" w:bottom="0" w:left="0" w:header="0" w:footer="0" w:gutter="0"/>
           <w:cols w:space="720"/>
           <w:docGrid w:linePitch="360"/>
@@ -761,13 +761,13 @@
         <w:tblLayout w:type="fixed"/>
       </w:tblPr>
       <w:tblGrid>
-        <w:gridCol w:w="14735"/>
+        <w:gridCol w:w="11376"/>
         <w:gridCol w:w="3168"/>
       </w:tblGrid>
       <w:tr>
         <w:tc>
           <w:tcPr>
-            <w:tcW w:type="dxa" w:w="14736"/>
+            <w:tcW w:type="dxa" w:w="11376"/>
             <w:tcMar>
               <w:top w:w="0" w:type="dxa"/>
               <w:left w:w="0" w:type="dxa"/>
@@ -885,7 +885,7 @@
           <w:b/>
           <w:i w:val="0"/>
           <w:color w:val="13213F"/>
-          <w:sz w:val="36"/>
+          <w:sz w:val="32"/>
         </w:rPr>
         <w:t>Buy: a 25% ROE franchise at 4.5x earnings; use the ALMEX overhang to build the position</w:t>
       </w:r>
@@ -910,15 +910,15 @@
         <w:tblLayout w:type="fixed"/>
       </w:tblPr>
       <w:tblGrid>
-        <w:gridCol w:w="3465"/>
+        <w:gridCol w:w="2793"/>
         <w:gridCol w:w="144"/>
-        <w:gridCol w:w="3465"/>
+        <w:gridCol w:w="2793"/>
         <w:gridCol w:w="144"/>
-        <w:gridCol w:w="3465"/>
+        <w:gridCol w:w="2793"/>
         <w:gridCol w:w="144"/>
-        <w:gridCol w:w="3465"/>
+        <w:gridCol w:w="2793"/>
         <w:gridCol w:w="144"/>
-        <w:gridCol w:w="3465"/>
+        <w:gridCol w:w="2793"/>
       </w:tblGrid>
       <w:tr>
         <w:trPr>
@@ -926,7 +926,7 @@
         </w:trPr>
         <w:tc>
           <w:tcPr>
-            <w:tcW w:type="dxa" w:w="3466"/>
+            <w:tcW w:type="dxa" w:w="2794"/>
             <w:shd w:val="clear" w:color="auto" w:fill="EFF1F5"/>
             <w:tcMar>
               <w:top w:w="140" w:type="dxa"/>
@@ -974,7 +974,7 @@
         </w:tc>
         <w:tc>
           <w:tcPr>
-            <w:tcW w:type="dxa" w:w="3466"/>
+            <w:tcW w:type="dxa" w:w="2794"/>
             <w:shd w:val="clear" w:color="auto" w:fill="EFF1F5"/>
             <w:tcMar>
               <w:top w:w="140" w:type="dxa"/>
@@ -1022,7 +1022,7 @@
         </w:tc>
         <w:tc>
           <w:tcPr>
-            <w:tcW w:type="dxa" w:w="3466"/>
+            <w:tcW w:type="dxa" w:w="2794"/>
             <w:shd w:val="clear" w:color="auto" w:fill="EFF1F5"/>
             <w:tcMar>
               <w:top w:w="140" w:type="dxa"/>
@@ -1070,7 +1070,7 @@
         </w:tc>
         <w:tc>
           <w:tcPr>
-            <w:tcW w:type="dxa" w:w="3466"/>
+            <w:tcW w:type="dxa" w:w="2794"/>
             <w:shd w:val="clear" w:color="auto" w:fill="EFF1F5"/>
             <w:tcMar>
               <w:top w:w="140" w:type="dxa"/>
@@ -1118,7 +1118,7 @@
         </w:tc>
         <w:tc>
           <w:tcPr>
-            <w:tcW w:type="dxa" w:w="3466"/>
+            <w:tcW w:type="dxa" w:w="2794"/>
             <w:shd w:val="clear" w:color="auto" w:fill="EFF1F5"/>
             <w:tcMar>
               <w:top w:w="140" w:type="dxa"/>
@@ -1185,14 +1185,14 @@
         <w:tblLayout w:type="fixed"/>
       </w:tblPr>
       <w:tblGrid>
-        <w:gridCol w:w="8699"/>
+        <w:gridCol w:w="7020"/>
         <w:gridCol w:w="503"/>
-        <w:gridCol w:w="8699"/>
+        <w:gridCol w:w="7020"/>
       </w:tblGrid>
       <w:tr>
         <w:tc>
           <w:tcPr>
-            <w:tcW w:type="dxa" w:w="8700"/>
+            <w:tcW w:type="dxa" w:w="7020"/>
             <w:tcMar>
               <w:top w:w="0" w:type="dxa"/>
               <w:left w:w="0" w:type="dxa"/>
@@ -1359,7 +1359,7 @@
         </w:tc>
         <w:tc>
           <w:tcPr>
-            <w:tcW w:type="dxa" w:w="8700"/>
+            <w:tcW w:type="dxa" w:w="7020"/>
             <w:tcMar>
               <w:top w:w="0" w:type="dxa"/>
               <w:left w:w="0" w:type="dxa"/>
@@ -1505,12 +1505,12 @@
         <w:tblLayout w:type="fixed"/>
       </w:tblPr>
       <w:tblGrid>
-        <w:gridCol w:w="17903"/>
+        <w:gridCol w:w="14544"/>
       </w:tblGrid>
       <w:tr>
         <w:tc>
           <w:tcPr>
-            <w:tcW w:type="dxa" w:w="17904"/>
+            <w:tcW w:type="dxa" w:w="14544"/>
             <w:shd w:val="clear" w:color="auto" w:fill="EFF1F5"/>
             <w:tcBorders>
               <w:top w:val="nil"/>
@@ -1584,13 +1584,13 @@
         <w:tblLayout w:type="fixed"/>
       </w:tblPr>
       <w:tblGrid>
-        <w:gridCol w:w="14735"/>
+        <w:gridCol w:w="11376"/>
         <w:gridCol w:w="3168"/>
       </w:tblGrid>
       <w:tr>
         <w:tc>
           <w:tcPr>
-            <w:tcW w:type="dxa" w:w="14736"/>
+            <w:tcW w:type="dxa" w:w="11376"/>
             <w:tcMar>
               <w:top w:w="0" w:type="dxa"/>
               <w:left w:w="0" w:type="dxa"/>
@@ -1708,7 +1708,7 @@
           <w:b/>
           <w:i w:val="0"/>
           <w:color w:val="13213F"/>
-          <w:sz w:val="36"/>
+          <w:sz w:val="32"/>
         </w:rPr>
         <w:t>Halyk at a glance - #1 bank with 28% of assets and half of corporate lending</w:t>
       </w:r>
@@ -1733,14 +1733,14 @@
         <w:tblLayout w:type="fixed"/>
       </w:tblPr>
       <w:tblGrid>
-        <w:gridCol w:w="8640"/>
+        <w:gridCol w:w="7018"/>
         <w:gridCol w:w="503"/>
-        <w:gridCol w:w="8755"/>
+        <w:gridCol w:w="7112"/>
       </w:tblGrid>
       <w:tr>
         <w:tc>
           <w:tcPr>
-            <w:tcW w:type="dxa" w:w="8640"/>
+            <w:tcW w:type="dxa" w:w="7019"/>
             <w:tcMar>
               <w:top w:w="0" w:type="dxa"/>
               <w:left w:w="0" w:type="dxa"/>
@@ -1910,7 +1910,7 @@
         </w:tc>
         <w:tc>
           <w:tcPr>
-            <w:tcW w:type="dxa" w:w="8755"/>
+            <w:tcW w:type="dxa" w:w="7112"/>
             <w:tcMar>
               <w:top w:w="0" w:type="dxa"/>
               <w:left w:w="0" w:type="dxa"/>
@@ -1956,12 +1956,12 @@
               <w:tblLayout w:type="fixed"/>
             </w:tblPr>
             <w:tblGrid>
-              <w:gridCol w:w="2376"/>
-              <w:gridCol w:w="1080"/>
-              <w:gridCol w:w="1080"/>
-              <w:gridCol w:w="1080"/>
-              <w:gridCol w:w="1080"/>
-              <w:gridCol w:w="1872"/>
+              <w:gridCol w:w="1930"/>
+              <w:gridCol w:w="877"/>
+              <w:gridCol w:w="877"/>
+              <w:gridCol w:w="877"/>
+              <w:gridCol w:w="877"/>
+              <w:gridCol w:w="1520"/>
             </w:tblGrid>
             <w:tr>
               <w:trPr>
@@ -1970,7 +1970,7 @@
               </w:trPr>
               <w:tc>
                 <w:tcPr>
-                  <w:tcW w:type="dxa" w:w="2376"/>
+                  <w:tcW w:type="dxa" w:w="1930"/>
                   <w:shd w:val="clear" w:color="auto" w:fill="13213F"/>
                   <w:tcMar>
                     <w:top w:w="55" w:type="dxa"/>
@@ -1983,7 +1983,7 @@
               </w:tc>
               <w:tc>
                 <w:tcPr>
-                  <w:tcW w:type="dxa" w:w="1080"/>
+                  <w:tcW w:type="dxa" w:w="877"/>
                   <w:shd w:val="clear" w:color="auto" w:fill="13213F"/>
                   <w:tcMar>
                     <w:top w:w="55" w:type="dxa"/>
@@ -2007,7 +2007,7 @@
               </w:tc>
               <w:tc>
                 <w:tcPr>
-                  <w:tcW w:type="dxa" w:w="1080"/>
+                  <w:tcW w:type="dxa" w:w="877"/>
                   <w:shd w:val="clear" w:color="auto" w:fill="13213F"/>
                   <w:tcMar>
                     <w:top w:w="55" w:type="dxa"/>
@@ -2031,7 +2031,7 @@
               </w:tc>
               <w:tc>
                 <w:tcPr>
-                  <w:tcW w:type="dxa" w:w="1080"/>
+                  <w:tcW w:type="dxa" w:w="877"/>
                   <w:shd w:val="clear" w:color="auto" w:fill="13213F"/>
                   <w:tcMar>
                     <w:top w:w="55" w:type="dxa"/>
@@ -2055,7 +2055,7 @@
               </w:tc>
               <w:tc>
                 <w:tcPr>
-                  <w:tcW w:type="dxa" w:w="1080"/>
+                  <w:tcW w:type="dxa" w:w="877"/>
                   <w:shd w:val="clear" w:color="auto" w:fill="13213F"/>
                   <w:tcMar>
                     <w:top w:w="55" w:type="dxa"/>
@@ -2079,7 +2079,7 @@
               </w:tc>
               <w:tc>
                 <w:tcPr>
-                  <w:tcW w:type="dxa" w:w="1872"/>
+                  <w:tcW w:type="dxa" w:w="1521"/>
                   <w:shd w:val="clear" w:color="auto" w:fill="13213F"/>
                   <w:tcMar>
                     <w:top w:w="55" w:type="dxa"/>
@@ -2108,7 +2108,7 @@
               </w:trPr>
               <w:tc>
                 <w:tcPr>
-                  <w:tcW w:type="dxa" w:w="2376"/>
+                  <w:tcW w:type="dxa" w:w="1930"/>
                   <w:tcMar>
                     <w:top w:w="45" w:type="dxa"/>
                     <w:left w:w="80" w:type="dxa"/>
@@ -2137,7 +2137,7 @@
               </w:tc>
               <w:tc>
                 <w:tcPr>
-                  <w:tcW w:type="dxa" w:w="1080"/>
+                  <w:tcW w:type="dxa" w:w="877"/>
                   <w:tcMar>
                     <w:top w:w="45" w:type="dxa"/>
                     <w:left w:w="80" w:type="dxa"/>
@@ -2166,7 +2166,7 @@
               </w:tc>
               <w:tc>
                 <w:tcPr>
-                  <w:tcW w:type="dxa" w:w="1080"/>
+                  <w:tcW w:type="dxa" w:w="877"/>
                   <w:tcMar>
                     <w:top w:w="45" w:type="dxa"/>
                     <w:left w:w="80" w:type="dxa"/>
@@ -2195,7 +2195,7 @@
               </w:tc>
               <w:tc>
                 <w:tcPr>
-                  <w:tcW w:type="dxa" w:w="1080"/>
+                  <w:tcW w:type="dxa" w:w="877"/>
                   <w:tcMar>
                     <w:top w:w="45" w:type="dxa"/>
                     <w:left w:w="80" w:type="dxa"/>
@@ -2224,7 +2224,7 @@
               </w:tc>
               <w:tc>
                 <w:tcPr>
-                  <w:tcW w:type="dxa" w:w="1080"/>
+                  <w:tcW w:type="dxa" w:w="877"/>
                   <w:tcMar>
                     <w:top w:w="45" w:type="dxa"/>
                     <w:left w:w="80" w:type="dxa"/>
@@ -2253,7 +2253,7 @@
               </w:tc>
               <w:tc>
                 <w:tcPr>
-                  <w:tcW w:type="dxa" w:w="1872"/>
+                  <w:tcW w:type="dxa" w:w="1521"/>
                   <w:tcMar>
                     <w:top w:w="45" w:type="dxa"/>
                     <w:left w:w="80" w:type="dxa"/>
@@ -2287,7 +2287,7 @@
               </w:trPr>
               <w:tc>
                 <w:tcPr>
-                  <w:tcW w:type="dxa" w:w="2376"/>
+                  <w:tcW w:type="dxa" w:w="1930"/>
                   <w:tcMar>
                     <w:top w:w="45" w:type="dxa"/>
                     <w:left w:w="80" w:type="dxa"/>
@@ -2317,7 +2317,7 @@
               </w:tc>
               <w:tc>
                 <w:tcPr>
-                  <w:tcW w:type="dxa" w:w="1080"/>
+                  <w:tcW w:type="dxa" w:w="877"/>
                   <w:tcMar>
                     <w:top w:w="45" w:type="dxa"/>
                     <w:left w:w="80" w:type="dxa"/>
@@ -2347,7 +2347,7 @@
               </w:tc>
               <w:tc>
                 <w:tcPr>
-                  <w:tcW w:type="dxa" w:w="1080"/>
+                  <w:tcW w:type="dxa" w:w="877"/>
                   <w:tcMar>
                     <w:top w:w="45" w:type="dxa"/>
                     <w:left w:w="80" w:type="dxa"/>
@@ -2377,7 +2377,7 @@
               </w:tc>
               <w:tc>
                 <w:tcPr>
-                  <w:tcW w:type="dxa" w:w="1080"/>
+                  <w:tcW w:type="dxa" w:w="877"/>
                   <w:tcMar>
                     <w:top w:w="45" w:type="dxa"/>
                     <w:left w:w="80" w:type="dxa"/>
@@ -2407,7 +2407,7 @@
               </w:tc>
               <w:tc>
                 <w:tcPr>
-                  <w:tcW w:type="dxa" w:w="1080"/>
+                  <w:tcW w:type="dxa" w:w="877"/>
                   <w:tcMar>
                     <w:top w:w="45" w:type="dxa"/>
                     <w:left w:w="80" w:type="dxa"/>
@@ -2437,7 +2437,7 @@
               </w:tc>
               <w:tc>
                 <w:tcPr>
-                  <w:tcW w:type="dxa" w:w="1872"/>
+                  <w:tcW w:type="dxa" w:w="1521"/>
                   <w:tcMar>
                     <w:top w:w="45" w:type="dxa"/>
                     <w:left w:w="80" w:type="dxa"/>
@@ -2472,7 +2472,7 @@
               </w:trPr>
               <w:tc>
                 <w:tcPr>
-                  <w:tcW w:type="dxa" w:w="2376"/>
+                  <w:tcW w:type="dxa" w:w="1930"/>
                   <w:tcMar>
                     <w:top w:w="45" w:type="dxa"/>
                     <w:left w:w="80" w:type="dxa"/>
@@ -2501,7 +2501,7 @@
               </w:tc>
               <w:tc>
                 <w:tcPr>
-                  <w:tcW w:type="dxa" w:w="1080"/>
+                  <w:tcW w:type="dxa" w:w="877"/>
                   <w:tcMar>
                     <w:top w:w="45" w:type="dxa"/>
                     <w:left w:w="80" w:type="dxa"/>
@@ -2530,7 +2530,7 @@
               </w:tc>
               <w:tc>
                 <w:tcPr>
-                  <w:tcW w:type="dxa" w:w="1080"/>
+                  <w:tcW w:type="dxa" w:w="877"/>
                   <w:tcMar>
                     <w:top w:w="45" w:type="dxa"/>
                     <w:left w:w="80" w:type="dxa"/>
@@ -2559,7 +2559,7 @@
               </w:tc>
               <w:tc>
                 <w:tcPr>
-                  <w:tcW w:type="dxa" w:w="1080"/>
+                  <w:tcW w:type="dxa" w:w="877"/>
                   <w:tcMar>
                     <w:top w:w="45" w:type="dxa"/>
                     <w:left w:w="80" w:type="dxa"/>
@@ -2588,7 +2588,7 @@
               </w:tc>
               <w:tc>
                 <w:tcPr>
-                  <w:tcW w:type="dxa" w:w="1080"/>
+                  <w:tcW w:type="dxa" w:w="877"/>
                   <w:tcMar>
                     <w:top w:w="45" w:type="dxa"/>
                     <w:left w:w="80" w:type="dxa"/>
@@ -2617,7 +2617,7 @@
               </w:tc>
               <w:tc>
                 <w:tcPr>
-                  <w:tcW w:type="dxa" w:w="1872"/>
+                  <w:tcW w:type="dxa" w:w="1521"/>
                   <w:tcMar>
                     <w:top w:w="45" w:type="dxa"/>
                     <w:left w:w="80" w:type="dxa"/>
@@ -2651,7 +2651,7 @@
               </w:trPr>
               <w:tc>
                 <w:tcPr>
-                  <w:tcW w:type="dxa" w:w="2376"/>
+                  <w:tcW w:type="dxa" w:w="1930"/>
                   <w:tcMar>
                     <w:top w:w="45" w:type="dxa"/>
                     <w:left w:w="80" w:type="dxa"/>
@@ -2680,7 +2680,7 @@
               </w:tc>
               <w:tc>
                 <w:tcPr>
-                  <w:tcW w:type="dxa" w:w="1080"/>
+                  <w:tcW w:type="dxa" w:w="877"/>
                   <w:tcMar>
                     <w:top w:w="45" w:type="dxa"/>
                     <w:left w:w="80" w:type="dxa"/>
@@ -2709,7 +2709,7 @@
               </w:tc>
               <w:tc>
                 <w:tcPr>
-                  <w:tcW w:type="dxa" w:w="1080"/>
+                  <w:tcW w:type="dxa" w:w="877"/>
                   <w:tcMar>
                     <w:top w:w="45" w:type="dxa"/>
                     <w:left w:w="80" w:type="dxa"/>
@@ -2738,7 +2738,7 @@
               </w:tc>
               <w:tc>
                 <w:tcPr>
-                  <w:tcW w:type="dxa" w:w="1080"/>
+                  <w:tcW w:type="dxa" w:w="877"/>
                   <w:tcMar>
                     <w:top w:w="45" w:type="dxa"/>
                     <w:left w:w="80" w:type="dxa"/>
@@ -2767,7 +2767,7 @@
               </w:tc>
               <w:tc>
                 <w:tcPr>
-                  <w:tcW w:type="dxa" w:w="1080"/>
+                  <w:tcW w:type="dxa" w:w="877"/>
                   <w:tcMar>
                     <w:top w:w="45" w:type="dxa"/>
                     <w:left w:w="80" w:type="dxa"/>
@@ -2796,7 +2796,7 @@
               </w:tc>
               <w:tc>
                 <w:tcPr>
-                  <w:tcW w:type="dxa" w:w="1872"/>
+                  <w:tcW w:type="dxa" w:w="1521"/>
                   <w:tcMar>
                     <w:top w:w="45" w:type="dxa"/>
                     <w:left w:w="80" w:type="dxa"/>
@@ -2830,7 +2830,7 @@
               </w:trPr>
               <w:tc>
                 <w:tcPr>
-                  <w:tcW w:type="dxa" w:w="2376"/>
+                  <w:tcW w:type="dxa" w:w="1930"/>
                   <w:tcMar>
                     <w:top w:w="45" w:type="dxa"/>
                     <w:left w:w="80" w:type="dxa"/>
@@ -2859,7 +2859,7 @@
               </w:tc>
               <w:tc>
                 <w:tcPr>
-                  <w:tcW w:type="dxa" w:w="1080"/>
+                  <w:tcW w:type="dxa" w:w="877"/>
                   <w:tcMar>
                     <w:top w:w="45" w:type="dxa"/>
                     <w:left w:w="80" w:type="dxa"/>
@@ -2888,7 +2888,7 @@
               </w:tc>
               <w:tc>
                 <w:tcPr>
-                  <w:tcW w:type="dxa" w:w="1080"/>
+                  <w:tcW w:type="dxa" w:w="877"/>
                   <w:tcMar>
                     <w:top w:w="45" w:type="dxa"/>
                     <w:left w:w="80" w:type="dxa"/>
@@ -2917,7 +2917,7 @@
               </w:tc>
               <w:tc>
                 <w:tcPr>
-                  <w:tcW w:type="dxa" w:w="1080"/>
+                  <w:tcW w:type="dxa" w:w="877"/>
                   <w:tcMar>
                     <w:top w:w="45" w:type="dxa"/>
                     <w:left w:w="80" w:type="dxa"/>
@@ -2946,7 +2946,7 @@
               </w:tc>
               <w:tc>
                 <w:tcPr>
-                  <w:tcW w:type="dxa" w:w="1080"/>
+                  <w:tcW w:type="dxa" w:w="877"/>
                   <w:tcMar>
                     <w:top w:w="45" w:type="dxa"/>
                     <w:left w:w="80" w:type="dxa"/>
@@ -2975,7 +2975,7 @@
               </w:tc>
               <w:tc>
                 <w:tcPr>
-                  <w:tcW w:type="dxa" w:w="1872"/>
+                  <w:tcW w:type="dxa" w:w="1521"/>
                   <w:tcMar>
                     <w:top w:w="45" w:type="dxa"/>
                     <w:left w:w="80" w:type="dxa"/>
@@ -3009,7 +3009,7 @@
               </w:trPr>
               <w:tc>
                 <w:tcPr>
-                  <w:tcW w:type="dxa" w:w="2376"/>
+                  <w:tcW w:type="dxa" w:w="1930"/>
                   <w:tcMar>
                     <w:top w:w="45" w:type="dxa"/>
                     <w:left w:w="80" w:type="dxa"/>
@@ -3038,7 +3038,7 @@
               </w:tc>
               <w:tc>
                 <w:tcPr>
-                  <w:tcW w:type="dxa" w:w="1080"/>
+                  <w:tcW w:type="dxa" w:w="877"/>
                   <w:tcMar>
                     <w:top w:w="45" w:type="dxa"/>
                     <w:left w:w="80" w:type="dxa"/>
@@ -3067,7 +3067,7 @@
               </w:tc>
               <w:tc>
                 <w:tcPr>
-                  <w:tcW w:type="dxa" w:w="1080"/>
+                  <w:tcW w:type="dxa" w:w="877"/>
                   <w:tcMar>
                     <w:top w:w="45" w:type="dxa"/>
                     <w:left w:w="80" w:type="dxa"/>
@@ -3096,7 +3096,7 @@
               </w:tc>
               <w:tc>
                 <w:tcPr>
-                  <w:tcW w:type="dxa" w:w="1080"/>
+                  <w:tcW w:type="dxa" w:w="877"/>
                   <w:tcMar>
                     <w:top w:w="45" w:type="dxa"/>
                     <w:left w:w="80" w:type="dxa"/>
@@ -3125,7 +3125,7 @@
               </w:tc>
               <w:tc>
                 <w:tcPr>
-                  <w:tcW w:type="dxa" w:w="1080"/>
+                  <w:tcW w:type="dxa" w:w="877"/>
                   <w:tcMar>
                     <w:top w:w="45" w:type="dxa"/>
                     <w:left w:w="80" w:type="dxa"/>
@@ -3154,7 +3154,7 @@
               </w:tc>
               <w:tc>
                 <w:tcPr>
-                  <w:tcW w:type="dxa" w:w="1872"/>
+                  <w:tcW w:type="dxa" w:w="1521"/>
                   <w:tcMar>
                     <w:top w:w="45" w:type="dxa"/>
                     <w:left w:w="80" w:type="dxa"/>
@@ -3188,7 +3188,7 @@
               </w:trPr>
               <w:tc>
                 <w:tcPr>
-                  <w:tcW w:type="dxa" w:w="2376"/>
+                  <w:tcW w:type="dxa" w:w="1930"/>
                   <w:tcMar>
                     <w:top w:w="45" w:type="dxa"/>
                     <w:left w:w="80" w:type="dxa"/>
@@ -3217,7 +3217,7 @@
               </w:tc>
               <w:tc>
                 <w:tcPr>
-                  <w:tcW w:type="dxa" w:w="1080"/>
+                  <w:tcW w:type="dxa" w:w="877"/>
                   <w:tcMar>
                     <w:top w:w="45" w:type="dxa"/>
                     <w:left w:w="80" w:type="dxa"/>
@@ -3246,7 +3246,7 @@
               </w:tc>
               <w:tc>
                 <w:tcPr>
-                  <w:tcW w:type="dxa" w:w="1080"/>
+                  <w:tcW w:type="dxa" w:w="877"/>
                   <w:tcMar>
                     <w:top w:w="45" w:type="dxa"/>
                     <w:left w:w="80" w:type="dxa"/>
@@ -3275,7 +3275,7 @@
               </w:tc>
               <w:tc>
                 <w:tcPr>
-                  <w:tcW w:type="dxa" w:w="1080"/>
+                  <w:tcW w:type="dxa" w:w="877"/>
                   <w:tcMar>
                     <w:top w:w="45" w:type="dxa"/>
                     <w:left w:w="80" w:type="dxa"/>
@@ -3304,7 +3304,7 @@
               </w:tc>
               <w:tc>
                 <w:tcPr>
-                  <w:tcW w:type="dxa" w:w="1080"/>
+                  <w:tcW w:type="dxa" w:w="877"/>
                   <w:tcMar>
                     <w:top w:w="45" w:type="dxa"/>
                     <w:left w:w="80" w:type="dxa"/>
@@ -3333,7 +3333,7 @@
               </w:tc>
               <w:tc>
                 <w:tcPr>
-                  <w:tcW w:type="dxa" w:w="1872"/>
+                  <w:tcW w:type="dxa" w:w="1521"/>
                   <w:tcMar>
                     <w:top w:w="45" w:type="dxa"/>
                     <w:left w:w="80" w:type="dxa"/>
@@ -3406,12 +3406,12 @@
         <w:tblLayout w:type="fixed"/>
       </w:tblPr>
       <w:tblGrid>
-        <w:gridCol w:w="17903"/>
+        <w:gridCol w:w="14544"/>
       </w:tblGrid>
       <w:tr>
         <w:tc>
           <w:tcPr>
-            <w:tcW w:type="dxa" w:w="17904"/>
+            <w:tcW w:type="dxa" w:w="14544"/>
             <w:shd w:val="clear" w:color="auto" w:fill="EFF1F5"/>
             <w:tcBorders>
               <w:top w:val="nil"/>
@@ -3485,13 +3485,13 @@
         <w:tblLayout w:type="fixed"/>
       </w:tblPr>
       <w:tblGrid>
-        <w:gridCol w:w="14735"/>
+        <w:gridCol w:w="11376"/>
         <w:gridCol w:w="3168"/>
       </w:tblGrid>
       <w:tr>
         <w:tc>
           <w:tcPr>
-            <w:tcW w:type="dxa" w:w="14736"/>
+            <w:tcW w:type="dxa" w:w="11376"/>
             <w:tcMar>
               <w:top w:w="0" w:type="dxa"/>
               <w:left w:w="0" w:type="dxa"/>
@@ -3609,7 +3609,7 @@
           <w:b/>
           <w:i w:val="0"/>
           <w:color w:val="13213F"/>
-          <w:sz w:val="36"/>
+          <w:sz w:val="32"/>
         </w:rPr>
         <w:t>Unrest and war (2022), re-rating (2023-25), ALMEX placement (Nov-25), trough earnings (2026)</w:t>
       </w:r>
@@ -3634,14 +3634,14 @@
         <w:tblLayout w:type="fixed"/>
       </w:tblPr>
       <w:tblGrid>
-        <w:gridCol w:w="11376"/>
+        <w:gridCol w:w="9241"/>
         <w:gridCol w:w="503"/>
-        <w:gridCol w:w="6019"/>
+        <w:gridCol w:w="4889"/>
       </w:tblGrid>
       <w:tr>
         <w:tc>
           <w:tcPr>
-            <w:tcW w:type="dxa" w:w="11376"/>
+            <w:tcW w:type="dxa" w:w="9241"/>
             <w:tcMar>
               <w:top w:w="0" w:type="dxa"/>
               <w:left w:w="0" w:type="dxa"/>
@@ -3653,7 +3653,7 @@
             <w:r>
               <w:drawing>
                 <wp:inline xmlns:a="http://schemas.openxmlformats.org/drawingml/2006/main" xmlns:pic="http://schemas.openxmlformats.org/drawingml/2006/picture">
-                  <wp:extent cx="7223760" cy="3604471"/>
+                  <wp:extent cx="5868251" cy="2928107"/>
                   <wp:docPr id="1" name="Picture 1"/>
                   <wp:cNvGraphicFramePr>
                     <a:graphicFrameLocks noChangeAspect="1"/>
@@ -3674,7 +3674,7 @@
                         <pic:spPr>
                           <a:xfrm>
                             <a:off x="0" y="0"/>
-                            <a:ext cx="7223760" cy="3604471"/>
+                            <a:ext cx="5868251" cy="2928107"/>
                           </a:xfrm>
                           <a:prstGeom prst="rect"/>
                         </pic:spPr>
@@ -3694,7 +3694,7 @@
         </w:tc>
         <w:tc>
           <w:tcPr>
-            <w:tcW w:type="dxa" w:w="6019"/>
+            <w:tcW w:type="dxa" w:w="4890"/>
             <w:tcMar>
               <w:top w:w="0" w:type="dxa"/>
               <w:left w:w="0" w:type="dxa"/>
@@ -3740,8 +3740,8 @@
               <w:tblLayout w:type="fixed"/>
             </w:tblPr>
             <w:tblGrid>
-              <w:gridCol w:w="1800"/>
-              <w:gridCol w:w="4248"/>
+              <w:gridCol w:w="1462"/>
+              <w:gridCol w:w="3450"/>
             </w:tblGrid>
             <w:tr>
               <w:trPr>
@@ -3750,7 +3750,7 @@
               </w:trPr>
               <w:tc>
                 <w:tcPr>
-                  <w:tcW w:type="dxa" w:w="1800"/>
+                  <w:tcW w:type="dxa" w:w="1462"/>
                   <w:shd w:val="clear" w:color="auto" w:fill="13213F"/>
                   <w:tcMar>
                     <w:top w:w="55" w:type="dxa"/>
@@ -3774,7 +3774,7 @@
               </w:tc>
               <w:tc>
                 <w:tcPr>
-                  <w:tcW w:type="dxa" w:w="4248"/>
+                  <w:tcW w:type="dxa" w:w="3451"/>
                   <w:shd w:val="clear" w:color="auto" w:fill="13213F"/>
                   <w:tcMar>
                     <w:top w:w="55" w:type="dxa"/>
@@ -3803,7 +3803,7 @@
               </w:trPr>
               <w:tc>
                 <w:tcPr>
-                  <w:tcW w:type="dxa" w:w="1800"/>
+                  <w:tcW w:type="dxa" w:w="1462"/>
                   <w:tcMar>
                     <w:top w:w="45" w:type="dxa"/>
                     <w:left w:w="80" w:type="dxa"/>
@@ -3832,7 +3832,7 @@
               </w:tc>
               <w:tc>
                 <w:tcPr>
-                  <w:tcW w:type="dxa" w:w="4248"/>
+                  <w:tcW w:type="dxa" w:w="3451"/>
                   <w:tcMar>
                     <w:top w:w="45" w:type="dxa"/>
                     <w:left w:w="80" w:type="dxa"/>
@@ -3866,7 +3866,7 @@
               </w:trPr>
               <w:tc>
                 <w:tcPr>
-                  <w:tcW w:type="dxa" w:w="1800"/>
+                  <w:tcW w:type="dxa" w:w="1462"/>
                   <w:tcMar>
                     <w:top w:w="45" w:type="dxa"/>
                     <w:left w:w="80" w:type="dxa"/>
@@ -3895,7 +3895,7 @@
               </w:tc>
               <w:tc>
                 <w:tcPr>
-                  <w:tcW w:type="dxa" w:w="4248"/>
+                  <w:tcW w:type="dxa" w:w="3451"/>
                   <w:tcMar>
                     <w:top w:w="45" w:type="dxa"/>
                     <w:left w:w="80" w:type="dxa"/>
@@ -3929,7 +3929,7 @@
               </w:trPr>
               <w:tc>
                 <w:tcPr>
-                  <w:tcW w:type="dxa" w:w="1800"/>
+                  <w:tcW w:type="dxa" w:w="1462"/>
                   <w:tcMar>
                     <w:top w:w="45" w:type="dxa"/>
                     <w:left w:w="80" w:type="dxa"/>
@@ -3958,7 +3958,7 @@
               </w:tc>
               <w:tc>
                 <w:tcPr>
-                  <w:tcW w:type="dxa" w:w="4248"/>
+                  <w:tcW w:type="dxa" w:w="3451"/>
                   <w:tcMar>
                     <w:top w:w="45" w:type="dxa"/>
                     <w:left w:w="80" w:type="dxa"/>
@@ -3992,7 +3992,7 @@
               </w:trPr>
               <w:tc>
                 <w:tcPr>
-                  <w:tcW w:type="dxa" w:w="1800"/>
+                  <w:tcW w:type="dxa" w:w="1462"/>
                   <w:tcMar>
                     <w:top w:w="45" w:type="dxa"/>
                     <w:left w:w="80" w:type="dxa"/>
@@ -4021,7 +4021,7 @@
               </w:tc>
               <w:tc>
                 <w:tcPr>
-                  <w:tcW w:type="dxa" w:w="4248"/>
+                  <w:tcW w:type="dxa" w:w="3451"/>
                   <w:tcMar>
                     <w:top w:w="45" w:type="dxa"/>
                     <w:left w:w="80" w:type="dxa"/>
@@ -4055,7 +4055,7 @@
               </w:trPr>
               <w:tc>
                 <w:tcPr>
-                  <w:tcW w:type="dxa" w:w="1800"/>
+                  <w:tcW w:type="dxa" w:w="1462"/>
                   <w:tcMar>
                     <w:top w:w="45" w:type="dxa"/>
                     <w:left w:w="80" w:type="dxa"/>
@@ -4084,7 +4084,7 @@
               </w:tc>
               <w:tc>
                 <w:tcPr>
-                  <w:tcW w:type="dxa" w:w="4248"/>
+                  <w:tcW w:type="dxa" w:w="3451"/>
                   <w:tcMar>
                     <w:top w:w="45" w:type="dxa"/>
                     <w:left w:w="80" w:type="dxa"/>
@@ -4118,7 +4118,7 @@
               </w:trPr>
               <w:tc>
                 <w:tcPr>
-                  <w:tcW w:type="dxa" w:w="1800"/>
+                  <w:tcW w:type="dxa" w:w="1462"/>
                   <w:tcMar>
                     <w:top w:w="45" w:type="dxa"/>
                     <w:left w:w="80" w:type="dxa"/>
@@ -4147,7 +4147,7 @@
               </w:tc>
               <w:tc>
                 <w:tcPr>
-                  <w:tcW w:type="dxa" w:w="4248"/>
+                  <w:tcW w:type="dxa" w:w="3451"/>
                   <w:tcMar>
                     <w:top w:w="45" w:type="dxa"/>
                     <w:left w:w="80" w:type="dxa"/>
@@ -4181,7 +4181,7 @@
               </w:trPr>
               <w:tc>
                 <w:tcPr>
-                  <w:tcW w:type="dxa" w:w="1800"/>
+                  <w:tcW w:type="dxa" w:w="1462"/>
                   <w:tcMar>
                     <w:top w:w="45" w:type="dxa"/>
                     <w:left w:w="80" w:type="dxa"/>
@@ -4210,7 +4210,7 @@
               </w:tc>
               <w:tc>
                 <w:tcPr>
-                  <w:tcW w:type="dxa" w:w="4248"/>
+                  <w:tcW w:type="dxa" w:w="3451"/>
                   <w:tcMar>
                     <w:top w:w="45" w:type="dxa"/>
                     <w:left w:w="80" w:type="dxa"/>
@@ -4244,7 +4244,7 @@
               </w:trPr>
               <w:tc>
                 <w:tcPr>
-                  <w:tcW w:type="dxa" w:w="1800"/>
+                  <w:tcW w:type="dxa" w:w="1462"/>
                   <w:tcMar>
                     <w:top w:w="45" w:type="dxa"/>
                     <w:left w:w="80" w:type="dxa"/>
@@ -4273,7 +4273,7 @@
               </w:tc>
               <w:tc>
                 <w:tcPr>
-                  <w:tcW w:type="dxa" w:w="4248"/>
+                  <w:tcW w:type="dxa" w:w="3451"/>
                   <w:tcMar>
                     <w:top w:w="45" w:type="dxa"/>
                     <w:left w:w="80" w:type="dxa"/>
@@ -4307,7 +4307,7 @@
               </w:trPr>
               <w:tc>
                 <w:tcPr>
-                  <w:tcW w:type="dxa" w:w="1800"/>
+                  <w:tcW w:type="dxa" w:w="1462"/>
                   <w:tcMar>
                     <w:top w:w="45" w:type="dxa"/>
                     <w:left w:w="80" w:type="dxa"/>
@@ -4336,7 +4336,7 @@
               </w:tc>
               <w:tc>
                 <w:tcPr>
-                  <w:tcW w:type="dxa" w:w="4248"/>
+                  <w:tcW w:type="dxa" w:w="3451"/>
                   <w:tcMar>
                     <w:top w:w="45" w:type="dxa"/>
                     <w:left w:w="80" w:type="dxa"/>
@@ -4400,13 +4400,13 @@
         <w:tblLayout w:type="fixed"/>
       </w:tblPr>
       <w:tblGrid>
-        <w:gridCol w:w="14735"/>
+        <w:gridCol w:w="11376"/>
         <w:gridCol w:w="3168"/>
       </w:tblGrid>
       <w:tr>
         <w:tc>
           <w:tcPr>
-            <w:tcW w:type="dxa" w:w="14736"/>
+            <w:tcW w:type="dxa" w:w="11376"/>
             <w:tcMar>
               <w:top w:w="0" w:type="dxa"/>
               <w:left w:w="0" w:type="dxa"/>
@@ -4524,7 +4524,7 @@
           <w:b/>
           <w:i w:val="0"/>
           <w:color w:val="13213F"/>
-          <w:sz w:val="36"/>
+          <w:sz w:val="32"/>
         </w:rPr>
         <w:t>Cheapest high-ROE bank in the peer set - but at the top of its own range</w:t>
       </w:r>
@@ -4549,15 +4549,15 @@
         <w:tblLayout w:type="fixed"/>
       </w:tblPr>
       <w:tblGrid>
-        <w:gridCol w:w="3744"/>
-        <w:gridCol w:w="1756"/>
-        <w:gridCol w:w="1756"/>
-        <w:gridCol w:w="1756"/>
-        <w:gridCol w:w="1756"/>
-        <w:gridCol w:w="1756"/>
-        <w:gridCol w:w="1756"/>
-        <w:gridCol w:w="1756"/>
-        <w:gridCol w:w="1756"/>
+        <w:gridCol w:w="3041"/>
+        <w:gridCol w:w="1427"/>
+        <w:gridCol w:w="1427"/>
+        <w:gridCol w:w="1427"/>
+        <w:gridCol w:w="1427"/>
+        <w:gridCol w:w="1427"/>
+        <w:gridCol w:w="1427"/>
+        <w:gridCol w:w="1427"/>
+        <w:gridCol w:w="1427"/>
       </w:tblGrid>
       <w:tr>
         <w:trPr>
@@ -4566,7 +4566,7 @@
         </w:trPr>
         <w:tc>
           <w:tcPr>
-            <w:tcW w:type="dxa" w:w="3744"/>
+            <w:tcW w:type="dxa" w:w="3041"/>
             <w:shd w:val="clear" w:color="auto" w:fill="13213F"/>
             <w:tcMar>
               <w:top w:w="55" w:type="dxa"/>
@@ -4590,7 +4590,7 @@
         </w:tc>
         <w:tc>
           <w:tcPr>
-            <w:tcW w:type="dxa" w:w="1757"/>
+            <w:tcW w:type="dxa" w:w="1427"/>
             <w:shd w:val="clear" w:color="auto" w:fill="13213F"/>
             <w:tcMar>
               <w:top w:w="55" w:type="dxa"/>
@@ -4614,7 +4614,7 @@
         </w:tc>
         <w:tc>
           <w:tcPr>
-            <w:tcW w:type="dxa" w:w="1757"/>
+            <w:tcW w:type="dxa" w:w="1427"/>
             <w:shd w:val="clear" w:color="auto" w:fill="13213F"/>
             <w:tcMar>
               <w:top w:w="55" w:type="dxa"/>
@@ -4638,7 +4638,7 @@
         </w:tc>
         <w:tc>
           <w:tcPr>
-            <w:tcW w:type="dxa" w:w="1757"/>
+            <w:tcW w:type="dxa" w:w="1427"/>
             <w:shd w:val="clear" w:color="auto" w:fill="13213F"/>
             <w:tcMar>
               <w:top w:w="55" w:type="dxa"/>
@@ -4662,7 +4662,7 @@
         </w:tc>
         <w:tc>
           <w:tcPr>
-            <w:tcW w:type="dxa" w:w="1757"/>
+            <w:tcW w:type="dxa" w:w="1427"/>
             <w:shd w:val="clear" w:color="auto" w:fill="13213F"/>
             <w:tcMar>
               <w:top w:w="55" w:type="dxa"/>
@@ -4686,7 +4686,7 @@
         </w:tc>
         <w:tc>
           <w:tcPr>
-            <w:tcW w:type="dxa" w:w="1757"/>
+            <w:tcW w:type="dxa" w:w="1427"/>
             <w:shd w:val="clear" w:color="auto" w:fill="13213F"/>
             <w:tcMar>
               <w:top w:w="55" w:type="dxa"/>
@@ -4710,7 +4710,7 @@
         </w:tc>
         <w:tc>
           <w:tcPr>
-            <w:tcW w:type="dxa" w:w="1757"/>
+            <w:tcW w:type="dxa" w:w="1427"/>
             <w:shd w:val="clear" w:color="auto" w:fill="13213F"/>
             <w:tcMar>
               <w:top w:w="55" w:type="dxa"/>
@@ -4734,7 +4734,7 @@
         </w:tc>
         <w:tc>
           <w:tcPr>
-            <w:tcW w:type="dxa" w:w="1757"/>
+            <w:tcW w:type="dxa" w:w="1427"/>
             <w:shd w:val="clear" w:color="auto" w:fill="13213F"/>
             <w:tcMar>
               <w:top w:w="55" w:type="dxa"/>
@@ -4758,7 +4758,7 @@
         </w:tc>
         <w:tc>
           <w:tcPr>
-            <w:tcW w:type="dxa" w:w="1757"/>
+            <w:tcW w:type="dxa" w:w="1427"/>
             <w:shd w:val="clear" w:color="auto" w:fill="13213F"/>
             <w:tcMar>
               <w:top w:w="55" w:type="dxa"/>
@@ -4787,7 +4787,7 @@
         </w:trPr>
         <w:tc>
           <w:tcPr>
-            <w:tcW w:type="dxa" w:w="3744"/>
+            <w:tcW w:type="dxa" w:w="3041"/>
             <w:tcMar>
               <w:top w:w="45" w:type="dxa"/>
               <w:left w:w="80" w:type="dxa"/>
@@ -4816,7 +4816,7 @@
         </w:tc>
         <w:tc>
           <w:tcPr>
-            <w:tcW w:type="dxa" w:w="1757"/>
+            <w:tcW w:type="dxa" w:w="1427"/>
             <w:tcMar>
               <w:top w:w="45" w:type="dxa"/>
               <w:left w:w="80" w:type="dxa"/>
@@ -4845,7 +4845,7 @@
         </w:tc>
         <w:tc>
           <w:tcPr>
-            <w:tcW w:type="dxa" w:w="1757"/>
+            <w:tcW w:type="dxa" w:w="1427"/>
             <w:tcMar>
               <w:top w:w="45" w:type="dxa"/>
               <w:left w:w="80" w:type="dxa"/>
@@ -4874,7 +4874,7 @@
         </w:tc>
         <w:tc>
           <w:tcPr>
-            <w:tcW w:type="dxa" w:w="1757"/>
+            <w:tcW w:type="dxa" w:w="1427"/>
             <w:tcMar>
               <w:top w:w="45" w:type="dxa"/>
               <w:left w:w="80" w:type="dxa"/>
@@ -4903,7 +4903,7 @@
         </w:tc>
         <w:tc>
           <w:tcPr>
-            <w:tcW w:type="dxa" w:w="1757"/>
+            <w:tcW w:type="dxa" w:w="1427"/>
             <w:tcMar>
               <w:top w:w="45" w:type="dxa"/>
               <w:left w:w="80" w:type="dxa"/>
@@ -4932,7 +4932,7 @@
         </w:tc>
         <w:tc>
           <w:tcPr>
-            <w:tcW w:type="dxa" w:w="1757"/>
+            <w:tcW w:type="dxa" w:w="1427"/>
             <w:tcMar>
               <w:top w:w="45" w:type="dxa"/>
               <w:left w:w="80" w:type="dxa"/>
@@ -4961,7 +4961,7 @@
         </w:tc>
         <w:tc>
           <w:tcPr>
-            <w:tcW w:type="dxa" w:w="1757"/>
+            <w:tcW w:type="dxa" w:w="1427"/>
             <w:tcMar>
               <w:top w:w="45" w:type="dxa"/>
               <w:left w:w="80" w:type="dxa"/>
@@ -4990,7 +4990,7 @@
         </w:tc>
         <w:tc>
           <w:tcPr>
-            <w:tcW w:type="dxa" w:w="1757"/>
+            <w:tcW w:type="dxa" w:w="1427"/>
             <w:tcMar>
               <w:top w:w="45" w:type="dxa"/>
               <w:left w:w="80" w:type="dxa"/>
@@ -5019,7 +5019,7 @@
         </w:tc>
         <w:tc>
           <w:tcPr>
-            <w:tcW w:type="dxa" w:w="1757"/>
+            <w:tcW w:type="dxa" w:w="1427"/>
             <w:tcMar>
               <w:top w:w="45" w:type="dxa"/>
               <w:left w:w="80" w:type="dxa"/>
@@ -5053,7 +5053,7 @@
         </w:trPr>
         <w:tc>
           <w:tcPr>
-            <w:tcW w:type="dxa" w:w="3744"/>
+            <w:tcW w:type="dxa" w:w="3041"/>
             <w:tcMar>
               <w:top w:w="45" w:type="dxa"/>
               <w:left w:w="80" w:type="dxa"/>
@@ -5082,7 +5082,7 @@
         </w:tc>
         <w:tc>
           <w:tcPr>
-            <w:tcW w:type="dxa" w:w="1757"/>
+            <w:tcW w:type="dxa" w:w="1427"/>
             <w:tcMar>
               <w:top w:w="45" w:type="dxa"/>
               <w:left w:w="80" w:type="dxa"/>
@@ -5111,7 +5111,7 @@
         </w:tc>
         <w:tc>
           <w:tcPr>
-            <w:tcW w:type="dxa" w:w="1757"/>
+            <w:tcW w:type="dxa" w:w="1427"/>
             <w:tcMar>
               <w:top w:w="45" w:type="dxa"/>
               <w:left w:w="80" w:type="dxa"/>
@@ -5140,7 +5140,7 @@
         </w:tc>
         <w:tc>
           <w:tcPr>
-            <w:tcW w:type="dxa" w:w="1757"/>
+            <w:tcW w:type="dxa" w:w="1427"/>
             <w:tcMar>
               <w:top w:w="45" w:type="dxa"/>
               <w:left w:w="80" w:type="dxa"/>
@@ -5169,7 +5169,7 @@
         </w:tc>
         <w:tc>
           <w:tcPr>
-            <w:tcW w:type="dxa" w:w="1757"/>
+            <w:tcW w:type="dxa" w:w="1427"/>
             <w:tcMar>
               <w:top w:w="45" w:type="dxa"/>
               <w:left w:w="80" w:type="dxa"/>
@@ -5198,7 +5198,7 @@
         </w:tc>
         <w:tc>
           <w:tcPr>
-            <w:tcW w:type="dxa" w:w="1757"/>
+            <w:tcW w:type="dxa" w:w="1427"/>
             <w:tcMar>
               <w:top w:w="45" w:type="dxa"/>
               <w:left w:w="80" w:type="dxa"/>
@@ -5227,7 +5227,7 @@
         </w:tc>
         <w:tc>
           <w:tcPr>
-            <w:tcW w:type="dxa" w:w="1757"/>
+            <w:tcW w:type="dxa" w:w="1427"/>
             <w:tcMar>
               <w:top w:w="45" w:type="dxa"/>
               <w:left w:w="80" w:type="dxa"/>
@@ -5256,7 +5256,7 @@
         </w:tc>
         <w:tc>
           <w:tcPr>
-            <w:tcW w:type="dxa" w:w="1757"/>
+            <w:tcW w:type="dxa" w:w="1427"/>
             <w:tcMar>
               <w:top w:w="45" w:type="dxa"/>
               <w:left w:w="80" w:type="dxa"/>
@@ -5285,7 +5285,7 @@
         </w:tc>
         <w:tc>
           <w:tcPr>
-            <w:tcW w:type="dxa" w:w="1757"/>
+            <w:tcW w:type="dxa" w:w="1427"/>
             <w:tcMar>
               <w:top w:w="45" w:type="dxa"/>
               <w:left w:w="80" w:type="dxa"/>
@@ -5319,7 +5319,7 @@
         </w:trPr>
         <w:tc>
           <w:tcPr>
-            <w:tcW w:type="dxa" w:w="3744"/>
+            <w:tcW w:type="dxa" w:w="3041"/>
             <w:tcMar>
               <w:top w:w="45" w:type="dxa"/>
               <w:left w:w="80" w:type="dxa"/>
@@ -5348,7 +5348,7 @@
         </w:tc>
         <w:tc>
           <w:tcPr>
-            <w:tcW w:type="dxa" w:w="1757"/>
+            <w:tcW w:type="dxa" w:w="1427"/>
             <w:tcMar>
               <w:top w:w="45" w:type="dxa"/>
               <w:left w:w="80" w:type="dxa"/>
@@ -5377,7 +5377,7 @@
         </w:tc>
         <w:tc>
           <w:tcPr>
-            <w:tcW w:type="dxa" w:w="1757"/>
+            <w:tcW w:type="dxa" w:w="1427"/>
             <w:tcMar>
               <w:top w:w="45" w:type="dxa"/>
               <w:left w:w="80" w:type="dxa"/>
@@ -5406,7 +5406,7 @@
         </w:tc>
         <w:tc>
           <w:tcPr>
-            <w:tcW w:type="dxa" w:w="1757"/>
+            <w:tcW w:type="dxa" w:w="1427"/>
             <w:tcMar>
               <w:top w:w="45" w:type="dxa"/>
               <w:left w:w="80" w:type="dxa"/>
@@ -5435,7 +5435,7 @@
         </w:tc>
         <w:tc>
           <w:tcPr>
-            <w:tcW w:type="dxa" w:w="1757"/>
+            <w:tcW w:type="dxa" w:w="1427"/>
             <w:tcMar>
               <w:top w:w="45" w:type="dxa"/>
               <w:left w:w="80" w:type="dxa"/>
@@ -5464,7 +5464,7 @@
         </w:tc>
         <w:tc>
           <w:tcPr>
-            <w:tcW w:type="dxa" w:w="1757"/>
+            <w:tcW w:type="dxa" w:w="1427"/>
             <w:tcMar>
               <w:top w:w="45" w:type="dxa"/>
               <w:left w:w="80" w:type="dxa"/>
@@ -5493,7 +5493,7 @@
         </w:tc>
         <w:tc>
           <w:tcPr>
-            <w:tcW w:type="dxa" w:w="1757"/>
+            <w:tcW w:type="dxa" w:w="1427"/>
             <w:tcMar>
               <w:top w:w="45" w:type="dxa"/>
               <w:left w:w="80" w:type="dxa"/>
@@ -5522,7 +5522,7 @@
         </w:tc>
         <w:tc>
           <w:tcPr>
-            <w:tcW w:type="dxa" w:w="1757"/>
+            <w:tcW w:type="dxa" w:w="1427"/>
             <w:tcMar>
               <w:top w:w="45" w:type="dxa"/>
               <w:left w:w="80" w:type="dxa"/>
@@ -5551,7 +5551,7 @@
         </w:tc>
         <w:tc>
           <w:tcPr>
-            <w:tcW w:type="dxa" w:w="1757"/>
+            <w:tcW w:type="dxa" w:w="1427"/>
             <w:tcMar>
               <w:top w:w="45" w:type="dxa"/>
               <w:left w:w="80" w:type="dxa"/>
@@ -5585,7 +5585,7 @@
         </w:trPr>
         <w:tc>
           <w:tcPr>
-            <w:tcW w:type="dxa" w:w="3744"/>
+            <w:tcW w:type="dxa" w:w="3041"/>
             <w:tcMar>
               <w:top w:w="45" w:type="dxa"/>
               <w:left w:w="80" w:type="dxa"/>
@@ -5614,7 +5614,7 @@
         </w:tc>
         <w:tc>
           <w:tcPr>
-            <w:tcW w:type="dxa" w:w="1757"/>
+            <w:tcW w:type="dxa" w:w="1427"/>
             <w:tcMar>
               <w:top w:w="45" w:type="dxa"/>
               <w:left w:w="80" w:type="dxa"/>
@@ -5643,7 +5643,7 @@
         </w:tc>
         <w:tc>
           <w:tcPr>
-            <w:tcW w:type="dxa" w:w="1757"/>
+            <w:tcW w:type="dxa" w:w="1427"/>
             <w:tcMar>
               <w:top w:w="45" w:type="dxa"/>
               <w:left w:w="80" w:type="dxa"/>
@@ -5672,7 +5672,7 @@
         </w:tc>
         <w:tc>
           <w:tcPr>
-            <w:tcW w:type="dxa" w:w="1757"/>
+            <w:tcW w:type="dxa" w:w="1427"/>
             <w:tcMar>
               <w:top w:w="45" w:type="dxa"/>
               <w:left w:w="80" w:type="dxa"/>
@@ -5701,7 +5701,7 @@
         </w:tc>
         <w:tc>
           <w:tcPr>
-            <w:tcW w:type="dxa" w:w="1757"/>
+            <w:tcW w:type="dxa" w:w="1427"/>
             <w:tcMar>
               <w:top w:w="45" w:type="dxa"/>
               <w:left w:w="80" w:type="dxa"/>
@@ -5730,7 +5730,7 @@
         </w:tc>
         <w:tc>
           <w:tcPr>
-            <w:tcW w:type="dxa" w:w="1757"/>
+            <w:tcW w:type="dxa" w:w="1427"/>
             <w:tcMar>
               <w:top w:w="45" w:type="dxa"/>
               <w:left w:w="80" w:type="dxa"/>
@@ -5759,7 +5759,7 @@
         </w:tc>
         <w:tc>
           <w:tcPr>
-            <w:tcW w:type="dxa" w:w="1757"/>
+            <w:tcW w:type="dxa" w:w="1427"/>
             <w:tcMar>
               <w:top w:w="45" w:type="dxa"/>
               <w:left w:w="80" w:type="dxa"/>
@@ -5788,7 +5788,7 @@
         </w:tc>
         <w:tc>
           <w:tcPr>
-            <w:tcW w:type="dxa" w:w="1757"/>
+            <w:tcW w:type="dxa" w:w="1427"/>
             <w:tcMar>
               <w:top w:w="45" w:type="dxa"/>
               <w:left w:w="80" w:type="dxa"/>
@@ -5817,7 +5817,7 @@
         </w:tc>
         <w:tc>
           <w:tcPr>
-            <w:tcW w:type="dxa" w:w="1757"/>
+            <w:tcW w:type="dxa" w:w="1427"/>
             <w:tcMar>
               <w:top w:w="45" w:type="dxa"/>
               <w:left w:w="80" w:type="dxa"/>
@@ -5851,7 +5851,7 @@
         </w:trPr>
         <w:tc>
           <w:tcPr>
-            <w:tcW w:type="dxa" w:w="3744"/>
+            <w:tcW w:type="dxa" w:w="3041"/>
             <w:tcMar>
               <w:top w:w="45" w:type="dxa"/>
               <w:left w:w="80" w:type="dxa"/>
@@ -5880,7 +5880,7 @@
         </w:tc>
         <w:tc>
           <w:tcPr>
-            <w:tcW w:type="dxa" w:w="1757"/>
+            <w:tcW w:type="dxa" w:w="1427"/>
             <w:tcMar>
               <w:top w:w="45" w:type="dxa"/>
               <w:left w:w="80" w:type="dxa"/>
@@ -5909,7 +5909,7 @@
         </w:tc>
         <w:tc>
           <w:tcPr>
-            <w:tcW w:type="dxa" w:w="1757"/>
+            <w:tcW w:type="dxa" w:w="1427"/>
             <w:tcMar>
               <w:top w:w="45" w:type="dxa"/>
               <w:left w:w="80" w:type="dxa"/>
@@ -5938,7 +5938,7 @@
         </w:tc>
         <w:tc>
           <w:tcPr>
-            <w:tcW w:type="dxa" w:w="1757"/>
+            <w:tcW w:type="dxa" w:w="1427"/>
             <w:tcMar>
               <w:top w:w="45" w:type="dxa"/>
               <w:left w:w="80" w:type="dxa"/>
@@ -5967,7 +5967,7 @@
         </w:tc>
         <w:tc>
           <w:tcPr>
-            <w:tcW w:type="dxa" w:w="1757"/>
+            <w:tcW w:type="dxa" w:w="1427"/>
             <w:tcMar>
               <w:top w:w="45" w:type="dxa"/>
               <w:left w:w="80" w:type="dxa"/>
@@ -5996,7 +5996,7 @@
         </w:tc>
         <w:tc>
           <w:tcPr>
-            <w:tcW w:type="dxa" w:w="1757"/>
+            <w:tcW w:type="dxa" w:w="1427"/>
             <w:tcMar>
               <w:top w:w="45" w:type="dxa"/>
               <w:left w:w="80" w:type="dxa"/>
@@ -6025,7 +6025,7 @@
         </w:tc>
         <w:tc>
           <w:tcPr>
-            <w:tcW w:type="dxa" w:w="1757"/>
+            <w:tcW w:type="dxa" w:w="1427"/>
             <w:tcMar>
               <w:top w:w="45" w:type="dxa"/>
               <w:left w:w="80" w:type="dxa"/>
@@ -6054,7 +6054,7 @@
         </w:tc>
         <w:tc>
           <w:tcPr>
-            <w:tcW w:type="dxa" w:w="1757"/>
+            <w:tcW w:type="dxa" w:w="1427"/>
             <w:tcMar>
               <w:top w:w="45" w:type="dxa"/>
               <w:left w:w="80" w:type="dxa"/>
@@ -6083,7 +6083,7 @@
         </w:tc>
         <w:tc>
           <w:tcPr>
-            <w:tcW w:type="dxa" w:w="1757"/>
+            <w:tcW w:type="dxa" w:w="1427"/>
             <w:tcMar>
               <w:top w:w="45" w:type="dxa"/>
               <w:left w:w="80" w:type="dxa"/>
@@ -6117,7 +6117,7 @@
         </w:trPr>
         <w:tc>
           <w:tcPr>
-            <w:tcW w:type="dxa" w:w="3744"/>
+            <w:tcW w:type="dxa" w:w="3041"/>
             <w:tcMar>
               <w:top w:w="45" w:type="dxa"/>
               <w:left w:w="80" w:type="dxa"/>
@@ -6146,7 +6146,7 @@
         </w:tc>
         <w:tc>
           <w:tcPr>
-            <w:tcW w:type="dxa" w:w="1757"/>
+            <w:tcW w:type="dxa" w:w="1427"/>
             <w:tcMar>
               <w:top w:w="45" w:type="dxa"/>
               <w:left w:w="80" w:type="dxa"/>
@@ -6175,7 +6175,7 @@
         </w:tc>
         <w:tc>
           <w:tcPr>
-            <w:tcW w:type="dxa" w:w="1757"/>
+            <w:tcW w:type="dxa" w:w="1427"/>
             <w:tcMar>
               <w:top w:w="45" w:type="dxa"/>
               <w:left w:w="80" w:type="dxa"/>
@@ -6204,7 +6204,7 @@
         </w:tc>
         <w:tc>
           <w:tcPr>
-            <w:tcW w:type="dxa" w:w="1757"/>
+            <w:tcW w:type="dxa" w:w="1427"/>
             <w:tcMar>
               <w:top w:w="45" w:type="dxa"/>
               <w:left w:w="80" w:type="dxa"/>
@@ -6233,7 +6233,7 @@
         </w:tc>
         <w:tc>
           <w:tcPr>
-            <w:tcW w:type="dxa" w:w="1757"/>
+            <w:tcW w:type="dxa" w:w="1427"/>
             <w:tcMar>
               <w:top w:w="45" w:type="dxa"/>
               <w:left w:w="80" w:type="dxa"/>
@@ -6262,7 +6262,7 @@
         </w:tc>
         <w:tc>
           <w:tcPr>
-            <w:tcW w:type="dxa" w:w="1757"/>
+            <w:tcW w:type="dxa" w:w="1427"/>
             <w:tcMar>
               <w:top w:w="45" w:type="dxa"/>
               <w:left w:w="80" w:type="dxa"/>
@@ -6291,7 +6291,7 @@
         </w:tc>
         <w:tc>
           <w:tcPr>
-            <w:tcW w:type="dxa" w:w="1757"/>
+            <w:tcW w:type="dxa" w:w="1427"/>
             <w:tcMar>
               <w:top w:w="45" w:type="dxa"/>
               <w:left w:w="80" w:type="dxa"/>
@@ -6320,7 +6320,7 @@
         </w:tc>
         <w:tc>
           <w:tcPr>
-            <w:tcW w:type="dxa" w:w="1757"/>
+            <w:tcW w:type="dxa" w:w="1427"/>
             <w:tcMar>
               <w:top w:w="45" w:type="dxa"/>
               <w:left w:w="80" w:type="dxa"/>
@@ -6349,7 +6349,7 @@
         </w:tc>
         <w:tc>
           <w:tcPr>
-            <w:tcW w:type="dxa" w:w="1757"/>
+            <w:tcW w:type="dxa" w:w="1427"/>
             <w:tcMar>
               <w:top w:w="45" w:type="dxa"/>
               <w:left w:w="80" w:type="dxa"/>
@@ -6418,14 +6418,14 @@
         <w:tblLayout w:type="fixed"/>
       </w:tblPr>
       <w:tblGrid>
-        <w:gridCol w:w="8699"/>
+        <w:gridCol w:w="7020"/>
         <w:gridCol w:w="503"/>
-        <w:gridCol w:w="8699"/>
+        <w:gridCol w:w="7020"/>
       </w:tblGrid>
       <w:tr>
         <w:tc>
           <w:tcPr>
-            <w:tcW w:type="dxa" w:w="8700"/>
+            <w:tcW w:type="dxa" w:w="7020"/>
             <w:tcMar>
               <w:top w:w="0" w:type="dxa"/>
               <w:left w:w="0" w:type="dxa"/>
@@ -6529,7 +6529,7 @@
         </w:tc>
         <w:tc>
           <w:tcPr>
-            <w:tcW w:type="dxa" w:w="8700"/>
+            <w:tcW w:type="dxa" w:w="7020"/>
             <w:tcMar>
               <w:top w:w="0" w:type="dxa"/>
               <w:left w:w="0" w:type="dxa"/>
@@ -6635,13 +6635,13 @@
         <w:tblLayout w:type="fixed"/>
       </w:tblPr>
       <w:tblGrid>
-        <w:gridCol w:w="14735"/>
+        <w:gridCol w:w="11376"/>
         <w:gridCol w:w="3168"/>
       </w:tblGrid>
       <w:tr>
         <w:tc>
           <w:tcPr>
-            <w:tcW w:type="dxa" w:w="14736"/>
+            <w:tcW w:type="dxa" w:w="11376"/>
             <w:tcMar>
               <w:top w:w="0" w:type="dxa"/>
               <w:left w:w="0" w:type="dxa"/>
@@ -6759,7 +6759,7 @@
           <w:b/>
           <w:i w:val="0"/>
           <w:color w:val="13213F"/>
-          <w:sz w:val="36"/>
+          <w:sz w:val="32"/>
         </w:rPr>
         <w:t>Regression: highest margin, third-lowest revenue multiple</w:t>
       </w:r>
@@ -6784,14 +6784,14 @@
         <w:tblLayout w:type="fixed"/>
       </w:tblPr>
       <w:tblGrid>
-        <w:gridCol w:w="10944"/>
+        <w:gridCol w:w="8890"/>
         <w:gridCol w:w="503"/>
-        <w:gridCol w:w="6451"/>
+        <w:gridCol w:w="5240"/>
       </w:tblGrid>
       <w:tr>
         <w:tc>
           <w:tcPr>
-            <w:tcW w:type="dxa" w:w="10944"/>
+            <w:tcW w:type="dxa" w:w="8890"/>
             <w:tcMar>
               <w:top w:w="0" w:type="dxa"/>
               <w:left w:w="0" w:type="dxa"/>
@@ -6803,7 +6803,7 @@
             <w:r>
               <w:drawing>
                 <wp:inline xmlns:a="http://schemas.openxmlformats.org/drawingml/2006/main" xmlns:pic="http://schemas.openxmlformats.org/drawingml/2006/picture">
-                  <wp:extent cx="6720840" cy="4059387"/>
+                  <wp:extent cx="5459702" cy="3297660"/>
                   <wp:docPr id="2" name="Picture 2"/>
                   <wp:cNvGraphicFramePr>
                     <a:graphicFrameLocks noChangeAspect="1"/>
@@ -6824,7 +6824,7 @@
                         <pic:spPr>
                           <a:xfrm>
                             <a:off x="0" y="0"/>
-                            <a:ext cx="6720840" cy="4059387"/>
+                            <a:ext cx="5459702" cy="3297660"/>
                           </a:xfrm>
                           <a:prstGeom prst="rect"/>
                         </pic:spPr>
@@ -6844,7 +6844,7 @@
         </w:tc>
         <w:tc>
           <w:tcPr>
-            <w:tcW w:type="dxa" w:w="6451"/>
+            <w:tcW w:type="dxa" w:w="5241"/>
             <w:tcMar>
               <w:top w:w="0" w:type="dxa"/>
               <w:left w:w="0" w:type="dxa"/>
@@ -7059,13 +7059,13 @@
         <w:tblLayout w:type="fixed"/>
       </w:tblPr>
       <w:tblGrid>
-        <w:gridCol w:w="14735"/>
+        <w:gridCol w:w="11376"/>
         <w:gridCol w:w="3168"/>
       </w:tblGrid>
       <w:tr>
         <w:tc>
           <w:tcPr>
-            <w:tcW w:type="dxa" w:w="14736"/>
+            <w:tcW w:type="dxa" w:w="11376"/>
             <w:tcMar>
               <w:top w:w="0" w:type="dxa"/>
               <w:left w:w="0" w:type="dxa"/>
@@ -7183,7 +7183,7 @@
           <w:b/>
           <w:i w:val="0"/>
           <w:color w:val="13213F"/>
-          <w:sz w:val="36"/>
+          <w:sz w:val="32"/>
         </w:rPr>
         <w:t>Regression: P/B vs ROE - more return per unit of book multiple than any peer</w:t>
       </w:r>
@@ -7208,14 +7208,14 @@
         <w:tblLayout w:type="fixed"/>
       </w:tblPr>
       <w:tblGrid>
-        <w:gridCol w:w="10944"/>
+        <w:gridCol w:w="8890"/>
         <w:gridCol w:w="503"/>
-        <w:gridCol w:w="6451"/>
+        <w:gridCol w:w="5240"/>
       </w:tblGrid>
       <w:tr>
         <w:tc>
           <w:tcPr>
-            <w:tcW w:type="dxa" w:w="10944"/>
+            <w:tcW w:type="dxa" w:w="8890"/>
             <w:tcMar>
               <w:top w:w="0" w:type="dxa"/>
               <w:left w:w="0" w:type="dxa"/>
@@ -7227,7 +7227,7 @@
             <w:r>
               <w:drawing>
                 <wp:inline xmlns:a="http://schemas.openxmlformats.org/drawingml/2006/main" xmlns:pic="http://schemas.openxmlformats.org/drawingml/2006/picture">
-                  <wp:extent cx="6720840" cy="4188637"/>
+                  <wp:extent cx="5459702" cy="3402656"/>
                   <wp:docPr id="3" name="Picture 3"/>
                   <wp:cNvGraphicFramePr>
                     <a:graphicFrameLocks noChangeAspect="1"/>
@@ -7248,7 +7248,7 @@
                         <pic:spPr>
                           <a:xfrm>
                             <a:off x="0" y="0"/>
-                            <a:ext cx="6720840" cy="4188637"/>
+                            <a:ext cx="5459702" cy="3402656"/>
                           </a:xfrm>
                           <a:prstGeom prst="rect"/>
                         </pic:spPr>
@@ -7268,7 +7268,7 @@
         </w:tc>
         <w:tc>
           <w:tcPr>
-            <w:tcW w:type="dxa" w:w="6451"/>
+            <w:tcW w:type="dxa" w:w="5241"/>
             <w:tcMar>
               <w:top w:w="0" w:type="dxa"/>
               <w:left w:w="0" w:type="dxa"/>
@@ -7536,13 +7536,13 @@
         <w:tblLayout w:type="fixed"/>
       </w:tblPr>
       <w:tblGrid>
-        <w:gridCol w:w="14735"/>
+        <w:gridCol w:w="11376"/>
         <w:gridCol w:w="3168"/>
       </w:tblGrid>
       <w:tr>
         <w:tc>
           <w:tcPr>
-            <w:tcW w:type="dxa" w:w="14736"/>
+            <w:tcW w:type="dxa" w:w="11376"/>
             <w:tcMar>
               <w:top w:w="0" w:type="dxa"/>
               <w:left w:w="0" w:type="dxa"/>
@@ -7660,7 +7660,7 @@
           <w:b/>
           <w:i w:val="0"/>
           <w:color w:val="13213F"/>
-          <w:sz w:val="36"/>
+          <w:sz w:val="32"/>
         </w:rPr>
         <w:t>Blended value KZT449 (US$38.6); target US$38 rounded down for the overhang</w:t>
       </w:r>
@@ -7685,14 +7685,14 @@
         <w:tblLayout w:type="fixed"/>
       </w:tblPr>
       <w:tblGrid>
-        <w:gridCol w:w="10512"/>
+        <w:gridCol w:w="8539"/>
         <w:gridCol w:w="503"/>
-        <w:gridCol w:w="6883"/>
+        <w:gridCol w:w="5591"/>
       </w:tblGrid>
       <w:tr>
         <w:tc>
           <w:tcPr>
-            <w:tcW w:type="dxa" w:w="10512"/>
+            <w:tcW w:type="dxa" w:w="8539"/>
             <w:tcMar>
               <w:top w:w="0" w:type="dxa"/>
               <w:left w:w="0" w:type="dxa"/>
@@ -7704,7 +7704,7 @@
             <w:r>
               <w:drawing>
                 <wp:inline xmlns:a="http://schemas.openxmlformats.org/drawingml/2006/main" xmlns:pic="http://schemas.openxmlformats.org/drawingml/2006/picture">
-                  <wp:extent cx="6675120" cy="2819831"/>
+                  <wp:extent cx="5422561" cy="2290701"/>
                   <wp:docPr id="4" name="Picture 4"/>
                   <wp:cNvGraphicFramePr>
                     <a:graphicFrameLocks noChangeAspect="1"/>
@@ -7725,7 +7725,7 @@
                         <pic:spPr>
                           <a:xfrm>
                             <a:off x="0" y="0"/>
-                            <a:ext cx="6675120" cy="2819831"/>
+                            <a:ext cx="5422561" cy="2290701"/>
                           </a:xfrm>
                           <a:prstGeom prst="rect"/>
                         </pic:spPr>
@@ -7745,7 +7745,7 @@
         </w:tc>
         <w:tc>
           <w:tcPr>
-            <w:tcW w:type="dxa" w:w="6883"/>
+            <w:tcW w:type="dxa" w:w="5592"/>
             <w:tcMar>
               <w:top w:w="0" w:type="dxa"/>
               <w:left w:w="0" w:type="dxa"/>
@@ -7791,10 +7791,10 @@
               <w:tblLayout w:type="fixed"/>
             </w:tblPr>
             <w:tblGrid>
-              <w:gridCol w:w="1512"/>
-              <w:gridCol w:w="3096"/>
-              <w:gridCol w:w="864"/>
-              <w:gridCol w:w="1152"/>
+              <w:gridCol w:w="1228"/>
+              <w:gridCol w:w="2515"/>
+              <w:gridCol w:w="701"/>
+              <w:gridCol w:w="935"/>
             </w:tblGrid>
             <w:tr>
               <w:trPr>
@@ -7803,7 +7803,7 @@
               </w:trPr>
               <w:tc>
                 <w:tcPr>
-                  <w:tcW w:type="dxa" w:w="1512"/>
+                  <w:tcW w:type="dxa" w:w="1228"/>
                   <w:shd w:val="clear" w:color="auto" w:fill="13213F"/>
                   <w:tcMar>
                     <w:top w:w="55" w:type="dxa"/>
@@ -7827,7 +7827,7 @@
               </w:tc>
               <w:tc>
                 <w:tcPr>
-                  <w:tcW w:type="dxa" w:w="3096"/>
+                  <w:tcW w:type="dxa" w:w="2515"/>
                   <w:shd w:val="clear" w:color="auto" w:fill="13213F"/>
                   <w:tcMar>
                     <w:top w:w="55" w:type="dxa"/>
@@ -7851,7 +7851,7 @@
               </w:tc>
               <w:tc>
                 <w:tcPr>
-                  <w:tcW w:type="dxa" w:w="864"/>
+                  <w:tcW w:type="dxa" w:w="702"/>
                   <w:shd w:val="clear" w:color="auto" w:fill="13213F"/>
                   <w:tcMar>
                     <w:top w:w="55" w:type="dxa"/>
@@ -7875,7 +7875,7 @@
               </w:tc>
               <w:tc>
                 <w:tcPr>
-                  <w:tcW w:type="dxa" w:w="1152"/>
+                  <w:tcW w:type="dxa" w:w="936"/>
                   <w:shd w:val="clear" w:color="auto" w:fill="13213F"/>
                   <w:tcMar>
                     <w:top w:w="55" w:type="dxa"/>
@@ -7904,7 +7904,7 @@
               </w:trPr>
               <w:tc>
                 <w:tcPr>
-                  <w:tcW w:type="dxa" w:w="1512"/>
+                  <w:tcW w:type="dxa" w:w="1228"/>
                   <w:tcMar>
                     <w:top w:w="45" w:type="dxa"/>
                     <w:left w:w="80" w:type="dxa"/>
@@ -7933,7 +7933,7 @@
               </w:tc>
               <w:tc>
                 <w:tcPr>
-                  <w:tcW w:type="dxa" w:w="3096"/>
+                  <w:tcW w:type="dxa" w:w="2515"/>
                   <w:tcMar>
                     <w:top w:w="45" w:type="dxa"/>
                     <w:left w:w="80" w:type="dxa"/>
@@ -7962,7 +7962,7 @@
               </w:tc>
               <w:tc>
                 <w:tcPr>
-                  <w:tcW w:type="dxa" w:w="864"/>
+                  <w:tcW w:type="dxa" w:w="702"/>
                   <w:tcMar>
                     <w:top w:w="45" w:type="dxa"/>
                     <w:left w:w="80" w:type="dxa"/>
@@ -7991,7 +7991,7 @@
               </w:tc>
               <w:tc>
                 <w:tcPr>
-                  <w:tcW w:type="dxa" w:w="1152"/>
+                  <w:tcW w:type="dxa" w:w="936"/>
                   <w:tcMar>
                     <w:top w:w="45" w:type="dxa"/>
                     <w:left w:w="80" w:type="dxa"/>
@@ -8025,7 +8025,7 @@
               </w:trPr>
               <w:tc>
                 <w:tcPr>
-                  <w:tcW w:type="dxa" w:w="1512"/>
+                  <w:tcW w:type="dxa" w:w="1228"/>
                   <w:tcMar>
                     <w:top w:w="45" w:type="dxa"/>
                     <w:left w:w="80" w:type="dxa"/>
@@ -8054,7 +8054,7 @@
               </w:tc>
               <w:tc>
                 <w:tcPr>
-                  <w:tcW w:type="dxa" w:w="3096"/>
+                  <w:tcW w:type="dxa" w:w="2515"/>
                   <w:tcMar>
                     <w:top w:w="45" w:type="dxa"/>
                     <w:left w:w="80" w:type="dxa"/>
@@ -8083,7 +8083,7 @@
               </w:tc>
               <w:tc>
                 <w:tcPr>
-                  <w:tcW w:type="dxa" w:w="864"/>
+                  <w:tcW w:type="dxa" w:w="702"/>
                   <w:tcMar>
                     <w:top w:w="45" w:type="dxa"/>
                     <w:left w:w="80" w:type="dxa"/>
@@ -8112,7 +8112,7 @@
               </w:tc>
               <w:tc>
                 <w:tcPr>
-                  <w:tcW w:type="dxa" w:w="1152"/>
+                  <w:tcW w:type="dxa" w:w="936"/>
                   <w:tcMar>
                     <w:top w:w="45" w:type="dxa"/>
                     <w:left w:w="80" w:type="dxa"/>
@@ -8146,7 +8146,7 @@
               </w:trPr>
               <w:tc>
                 <w:tcPr>
-                  <w:tcW w:type="dxa" w:w="1512"/>
+                  <w:tcW w:type="dxa" w:w="1228"/>
                   <w:tcMar>
                     <w:top w:w="45" w:type="dxa"/>
                     <w:left w:w="80" w:type="dxa"/>
@@ -8175,7 +8175,7 @@
               </w:tc>
               <w:tc>
                 <w:tcPr>
-                  <w:tcW w:type="dxa" w:w="3096"/>
+                  <w:tcW w:type="dxa" w:w="2515"/>
                   <w:tcMar>
                     <w:top w:w="45" w:type="dxa"/>
                     <w:left w:w="80" w:type="dxa"/>
@@ -8204,7 +8204,7 @@
               </w:tc>
               <w:tc>
                 <w:tcPr>
-                  <w:tcW w:type="dxa" w:w="864"/>
+                  <w:tcW w:type="dxa" w:w="702"/>
                   <w:tcMar>
                     <w:top w:w="45" w:type="dxa"/>
                     <w:left w:w="80" w:type="dxa"/>
@@ -8233,7 +8233,7 @@
               </w:tc>
               <w:tc>
                 <w:tcPr>
-                  <w:tcW w:type="dxa" w:w="1152"/>
+                  <w:tcW w:type="dxa" w:w="936"/>
                   <w:tcMar>
                     <w:top w:w="45" w:type="dxa"/>
                     <w:left w:w="80" w:type="dxa"/>
@@ -8267,7 +8267,7 @@
               </w:trPr>
               <w:tc>
                 <w:tcPr>
-                  <w:tcW w:type="dxa" w:w="1512"/>
+                  <w:tcW w:type="dxa" w:w="1228"/>
                   <w:tcMar>
                     <w:top w:w="45" w:type="dxa"/>
                     <w:left w:w="80" w:type="dxa"/>
@@ -8296,7 +8296,7 @@
               </w:tc>
               <w:tc>
                 <w:tcPr>
-                  <w:tcW w:type="dxa" w:w="3096"/>
+                  <w:tcW w:type="dxa" w:w="2515"/>
                   <w:tcMar>
                     <w:top w:w="45" w:type="dxa"/>
                     <w:left w:w="80" w:type="dxa"/>
@@ -8325,7 +8325,7 @@
               </w:tc>
               <w:tc>
                 <w:tcPr>
-                  <w:tcW w:type="dxa" w:w="864"/>
+                  <w:tcW w:type="dxa" w:w="702"/>
                   <w:tcMar>
                     <w:top w:w="45" w:type="dxa"/>
                     <w:left w:w="80" w:type="dxa"/>
@@ -8354,7 +8354,7 @@
               </w:tc>
               <w:tc>
                 <w:tcPr>
-                  <w:tcW w:type="dxa" w:w="1152"/>
+                  <w:tcW w:type="dxa" w:w="936"/>
                   <w:tcMar>
                     <w:top w:w="45" w:type="dxa"/>
                     <w:left w:w="80" w:type="dxa"/>
@@ -8388,7 +8388,7 @@
               </w:trPr>
               <w:tc>
                 <w:tcPr>
-                  <w:tcW w:type="dxa" w:w="1512"/>
+                  <w:tcW w:type="dxa" w:w="1228"/>
                   <w:tcMar>
                     <w:top w:w="45" w:type="dxa"/>
                     <w:left w:w="80" w:type="dxa"/>
@@ -8418,7 +8418,7 @@
               </w:tc>
               <w:tc>
                 <w:tcPr>
-                  <w:tcW w:type="dxa" w:w="3096"/>
+                  <w:tcW w:type="dxa" w:w="2515"/>
                   <w:tcMar>
                     <w:top w:w="45" w:type="dxa"/>
                     <w:left w:w="80" w:type="dxa"/>
@@ -8448,7 +8448,7 @@
               </w:tc>
               <w:tc>
                 <w:tcPr>
-                  <w:tcW w:type="dxa" w:w="864"/>
+                  <w:tcW w:type="dxa" w:w="702"/>
                   <w:tcMar>
                     <w:top w:w="45" w:type="dxa"/>
                     <w:left w:w="80" w:type="dxa"/>
@@ -8478,7 +8478,7 @@
               </w:tc>
               <w:tc>
                 <w:tcPr>
-                  <w:tcW w:type="dxa" w:w="1152"/>
+                  <w:tcW w:type="dxa" w:w="936"/>
                   <w:tcMar>
                     <w:top w:w="45" w:type="dxa"/>
                     <w:left w:w="80" w:type="dxa"/>
@@ -8617,13 +8617,13 @@
         <w:tblLayout w:type="fixed"/>
       </w:tblPr>
       <w:tblGrid>
-        <w:gridCol w:w="14735"/>
+        <w:gridCol w:w="11376"/>
         <w:gridCol w:w="3168"/>
       </w:tblGrid>
       <w:tr>
         <w:tc>
           <w:tcPr>
-            <w:tcW w:type="dxa" w:w="14736"/>
+            <w:tcW w:type="dxa" w:w="11376"/>
             <w:tcMar>
               <w:top w:w="0" w:type="dxa"/>
               <w:left w:w="0" w:type="dxa"/>
@@ -8741,7 +8741,7 @@
           <w:b/>
           <w:i w:val="0"/>
           <w:color w:val="13213F"/>
-          <w:sz w:val="36"/>
+          <w:sz w:val="32"/>
         </w:rPr>
         <w:t>2026 is the trough: four regulatory hits at once, then ~9% EPS growth</w:t>
       </w:r>
@@ -8766,14 +8766,14 @@
         <w:tblLayout w:type="fixed"/>
       </w:tblPr>
       <w:tblGrid>
-        <w:gridCol w:w="10512"/>
+        <w:gridCol w:w="8539"/>
         <w:gridCol w:w="503"/>
-        <w:gridCol w:w="6883"/>
+        <w:gridCol w:w="5591"/>
       </w:tblGrid>
       <w:tr>
         <w:tc>
           <w:tcPr>
-            <w:tcW w:type="dxa" w:w="10512"/>
+            <w:tcW w:type="dxa" w:w="8539"/>
             <w:tcMar>
               <w:top w:w="0" w:type="dxa"/>
               <w:left w:w="0" w:type="dxa"/>
@@ -8785,7 +8785,7 @@
             <w:r>
               <w:drawing>
                 <wp:inline xmlns:a="http://schemas.openxmlformats.org/drawingml/2006/main" xmlns:pic="http://schemas.openxmlformats.org/drawingml/2006/picture">
-                  <wp:extent cx="6675120" cy="2291250"/>
+                  <wp:extent cx="5422561" cy="1861307"/>
                   <wp:docPr id="5" name="Picture 5"/>
                   <wp:cNvGraphicFramePr>
                     <a:graphicFrameLocks noChangeAspect="1"/>
@@ -8806,7 +8806,7 @@
                         <pic:spPr>
                           <a:xfrm>
                             <a:off x="0" y="0"/>
-                            <a:ext cx="6675120" cy="2291250"/>
+                            <a:ext cx="5422561" cy="1861307"/>
                           </a:xfrm>
                           <a:prstGeom prst="rect"/>
                         </pic:spPr>
@@ -8826,7 +8826,7 @@
         </w:tc>
         <w:tc>
           <w:tcPr>
-            <w:tcW w:type="dxa" w:w="6883"/>
+            <w:tcW w:type="dxa" w:w="5592"/>
             <w:tcMar>
               <w:top w:w="0" w:type="dxa"/>
               <w:left w:w="0" w:type="dxa"/>
@@ -8864,11 +8864,11 @@
               <w:tblLayout w:type="fixed"/>
             </w:tblPr>
             <w:tblGrid>
-              <w:gridCol w:w="2160"/>
-              <w:gridCol w:w="1152"/>
-              <w:gridCol w:w="1152"/>
-              <w:gridCol w:w="1224"/>
-              <w:gridCol w:w="1152"/>
+              <w:gridCol w:w="1754"/>
+              <w:gridCol w:w="935"/>
+              <w:gridCol w:w="935"/>
+              <w:gridCol w:w="994"/>
+              <w:gridCol w:w="935"/>
             </w:tblGrid>
             <w:tr>
               <w:trPr>
@@ -8877,7 +8877,7 @@
               </w:trPr>
               <w:tc>
                 <w:tcPr>
-                  <w:tcW w:type="dxa" w:w="2160"/>
+                  <w:tcW w:type="dxa" w:w="1755"/>
                   <w:shd w:val="clear" w:color="auto" w:fill="13213F"/>
                   <w:tcMar>
                     <w:top w:w="55" w:type="dxa"/>
@@ -8901,7 +8901,7 @@
               </w:tc>
               <w:tc>
                 <w:tcPr>
-                  <w:tcW w:type="dxa" w:w="1152"/>
+                  <w:tcW w:type="dxa" w:w="936"/>
                   <w:shd w:val="clear" w:color="auto" w:fill="13213F"/>
                   <w:tcMar>
                     <w:top w:w="55" w:type="dxa"/>
@@ -8925,7 +8925,7 @@
               </w:tc>
               <w:tc>
                 <w:tcPr>
-                  <w:tcW w:type="dxa" w:w="1152"/>
+                  <w:tcW w:type="dxa" w:w="936"/>
                   <w:shd w:val="clear" w:color="auto" w:fill="13213F"/>
                   <w:tcMar>
                     <w:top w:w="55" w:type="dxa"/>
@@ -8949,7 +8949,7 @@
               </w:tc>
               <w:tc>
                 <w:tcPr>
-                  <w:tcW w:type="dxa" w:w="1224"/>
+                  <w:tcW w:type="dxa" w:w="994"/>
                   <w:shd w:val="clear" w:color="auto" w:fill="13213F"/>
                   <w:tcMar>
                     <w:top w:w="55" w:type="dxa"/>
@@ -8973,7 +8973,7 @@
               </w:tc>
               <w:tc>
                 <w:tcPr>
-                  <w:tcW w:type="dxa" w:w="1152"/>
+                  <w:tcW w:type="dxa" w:w="936"/>
                   <w:shd w:val="clear" w:color="auto" w:fill="13213F"/>
                   <w:tcMar>
                     <w:top w:w="55" w:type="dxa"/>
@@ -9002,7 +9002,7 @@
               </w:trPr>
               <w:tc>
                 <w:tcPr>
-                  <w:tcW w:type="dxa" w:w="2160"/>
+                  <w:tcW w:type="dxa" w:w="1755"/>
                   <w:tcMar>
                     <w:top w:w="45" w:type="dxa"/>
                     <w:left w:w="80" w:type="dxa"/>
@@ -9031,7 +9031,7 @@
               </w:tc>
               <w:tc>
                 <w:tcPr>
-                  <w:tcW w:type="dxa" w:w="1152"/>
+                  <w:tcW w:type="dxa" w:w="936"/>
                   <w:tcMar>
                     <w:top w:w="45" w:type="dxa"/>
                     <w:left w:w="80" w:type="dxa"/>
@@ -9060,7 +9060,7 @@
               </w:tc>
               <w:tc>
                 <w:tcPr>
-                  <w:tcW w:type="dxa" w:w="1152"/>
+                  <w:tcW w:type="dxa" w:w="936"/>
                   <w:tcMar>
                     <w:top w:w="45" w:type="dxa"/>
                     <w:left w:w="80" w:type="dxa"/>
@@ -9089,7 +9089,7 @@
               </w:tc>
               <w:tc>
                 <w:tcPr>
-                  <w:tcW w:type="dxa" w:w="1224"/>
+                  <w:tcW w:type="dxa" w:w="994"/>
                   <w:tcMar>
                     <w:top w:w="45" w:type="dxa"/>
                     <w:left w:w="80" w:type="dxa"/>
@@ -9118,7 +9118,7 @@
               </w:tc>
               <w:tc>
                 <w:tcPr>
-                  <w:tcW w:type="dxa" w:w="1152"/>
+                  <w:tcW w:type="dxa" w:w="936"/>
                   <w:tcMar>
                     <w:top w:w="45" w:type="dxa"/>
                     <w:left w:w="80" w:type="dxa"/>
@@ -9152,7 +9152,7 @@
               </w:trPr>
               <w:tc>
                 <w:tcPr>
-                  <w:tcW w:type="dxa" w:w="2160"/>
+                  <w:tcW w:type="dxa" w:w="1755"/>
                   <w:tcMar>
                     <w:top w:w="45" w:type="dxa"/>
                     <w:left w:w="80" w:type="dxa"/>
@@ -9182,7 +9182,7 @@
               </w:tc>
               <w:tc>
                 <w:tcPr>
-                  <w:tcW w:type="dxa" w:w="1152"/>
+                  <w:tcW w:type="dxa" w:w="936"/>
                   <w:tcMar>
                     <w:top w:w="45" w:type="dxa"/>
                     <w:left w:w="80" w:type="dxa"/>
@@ -9212,7 +9212,7 @@
               </w:tc>
               <w:tc>
                 <w:tcPr>
-                  <w:tcW w:type="dxa" w:w="1152"/>
+                  <w:tcW w:type="dxa" w:w="936"/>
                   <w:tcMar>
                     <w:top w:w="45" w:type="dxa"/>
                     <w:left w:w="80" w:type="dxa"/>
@@ -9242,7 +9242,7 @@
               </w:tc>
               <w:tc>
                 <w:tcPr>
-                  <w:tcW w:type="dxa" w:w="1224"/>
+                  <w:tcW w:type="dxa" w:w="994"/>
                   <w:tcMar>
                     <w:top w:w="45" w:type="dxa"/>
                     <w:left w:w="80" w:type="dxa"/>
@@ -9272,7 +9272,7 @@
               </w:tc>
               <w:tc>
                 <w:tcPr>
-                  <w:tcW w:type="dxa" w:w="1152"/>
+                  <w:tcW w:type="dxa" w:w="936"/>
                   <w:tcMar>
                     <w:top w:w="45" w:type="dxa"/>
                     <w:left w:w="80" w:type="dxa"/>
@@ -9307,7 +9307,7 @@
               </w:trPr>
               <w:tc>
                 <w:tcPr>
-                  <w:tcW w:type="dxa" w:w="2160"/>
+                  <w:tcW w:type="dxa" w:w="1755"/>
                   <w:tcMar>
                     <w:top w:w="45" w:type="dxa"/>
                     <w:left w:w="80" w:type="dxa"/>
@@ -9336,7 +9336,7 @@
               </w:tc>
               <w:tc>
                 <w:tcPr>
-                  <w:tcW w:type="dxa" w:w="1152"/>
+                  <w:tcW w:type="dxa" w:w="936"/>
                   <w:tcMar>
                     <w:top w:w="45" w:type="dxa"/>
                     <w:left w:w="80" w:type="dxa"/>
@@ -9365,7 +9365,7 @@
               </w:tc>
               <w:tc>
                 <w:tcPr>
-                  <w:tcW w:type="dxa" w:w="1152"/>
+                  <w:tcW w:type="dxa" w:w="936"/>
                   <w:tcMar>
                     <w:top w:w="45" w:type="dxa"/>
                     <w:left w:w="80" w:type="dxa"/>
@@ -9394,7 +9394,7 @@
               </w:tc>
               <w:tc>
                 <w:tcPr>
-                  <w:tcW w:type="dxa" w:w="1224"/>
+                  <w:tcW w:type="dxa" w:w="994"/>
                   <w:tcMar>
                     <w:top w:w="45" w:type="dxa"/>
                     <w:left w:w="80" w:type="dxa"/>
@@ -9423,7 +9423,7 @@
               </w:tc>
               <w:tc>
                 <w:tcPr>
-                  <w:tcW w:type="dxa" w:w="1152"/>
+                  <w:tcW w:type="dxa" w:w="936"/>
                   <w:tcMar>
                     <w:top w:w="45" w:type="dxa"/>
                     <w:left w:w="80" w:type="dxa"/>
@@ -9457,7 +9457,7 @@
               </w:trPr>
               <w:tc>
                 <w:tcPr>
-                  <w:tcW w:type="dxa" w:w="2160"/>
+                  <w:tcW w:type="dxa" w:w="1755"/>
                   <w:tcMar>
                     <w:top w:w="45" w:type="dxa"/>
                     <w:left w:w="80" w:type="dxa"/>
@@ -9486,7 +9486,7 @@
               </w:tc>
               <w:tc>
                 <w:tcPr>
-                  <w:tcW w:type="dxa" w:w="1152"/>
+                  <w:tcW w:type="dxa" w:w="936"/>
                   <w:tcMar>
                     <w:top w:w="45" w:type="dxa"/>
                     <w:left w:w="80" w:type="dxa"/>
@@ -9515,7 +9515,7 @@
               </w:tc>
               <w:tc>
                 <w:tcPr>
-                  <w:tcW w:type="dxa" w:w="1152"/>
+                  <w:tcW w:type="dxa" w:w="936"/>
                   <w:tcMar>
                     <w:top w:w="45" w:type="dxa"/>
                     <w:left w:w="80" w:type="dxa"/>
@@ -9544,7 +9544,7 @@
               </w:tc>
               <w:tc>
                 <w:tcPr>
-                  <w:tcW w:type="dxa" w:w="1224"/>
+                  <w:tcW w:type="dxa" w:w="994"/>
                   <w:tcMar>
                     <w:top w:w="45" w:type="dxa"/>
                     <w:left w:w="80" w:type="dxa"/>
@@ -9573,7 +9573,7 @@
               </w:tc>
               <w:tc>
                 <w:tcPr>
-                  <w:tcW w:type="dxa" w:w="1152"/>
+                  <w:tcW w:type="dxa" w:w="936"/>
                   <w:tcMar>
                     <w:top w:w="45" w:type="dxa"/>
                     <w:left w:w="80" w:type="dxa"/>
@@ -9607,7 +9607,7 @@
               </w:trPr>
               <w:tc>
                 <w:tcPr>
-                  <w:tcW w:type="dxa" w:w="2160"/>
+                  <w:tcW w:type="dxa" w:w="1755"/>
                   <w:tcMar>
                     <w:top w:w="45" w:type="dxa"/>
                     <w:left w:w="80" w:type="dxa"/>
@@ -9636,7 +9636,7 @@
               </w:tc>
               <w:tc>
                 <w:tcPr>
-                  <w:tcW w:type="dxa" w:w="1152"/>
+                  <w:tcW w:type="dxa" w:w="936"/>
                   <w:tcMar>
                     <w:top w:w="45" w:type="dxa"/>
                     <w:left w:w="80" w:type="dxa"/>
@@ -9665,7 +9665,7 @@
               </w:tc>
               <w:tc>
                 <w:tcPr>
-                  <w:tcW w:type="dxa" w:w="1152"/>
+                  <w:tcW w:type="dxa" w:w="936"/>
                   <w:tcMar>
                     <w:top w:w="45" w:type="dxa"/>
                     <w:left w:w="80" w:type="dxa"/>
@@ -9694,7 +9694,7 @@
               </w:tc>
               <w:tc>
                 <w:tcPr>
-                  <w:tcW w:type="dxa" w:w="1224"/>
+                  <w:tcW w:type="dxa" w:w="994"/>
                   <w:tcMar>
                     <w:top w:w="45" w:type="dxa"/>
                     <w:left w:w="80" w:type="dxa"/>
@@ -9723,7 +9723,7 @@
               </w:tc>
               <w:tc>
                 <w:tcPr>
-                  <w:tcW w:type="dxa" w:w="1152"/>
+                  <w:tcW w:type="dxa" w:w="936"/>
                   <w:tcMar>
                     <w:top w:w="45" w:type="dxa"/>
                     <w:left w:w="80" w:type="dxa"/>
@@ -9757,7 +9757,7 @@
               </w:trPr>
               <w:tc>
                 <w:tcPr>
-                  <w:tcW w:type="dxa" w:w="2160"/>
+                  <w:tcW w:type="dxa" w:w="1755"/>
                   <w:tcMar>
                     <w:top w:w="45" w:type="dxa"/>
                     <w:left w:w="80" w:type="dxa"/>
@@ -9786,7 +9786,7 @@
               </w:tc>
               <w:tc>
                 <w:tcPr>
-                  <w:tcW w:type="dxa" w:w="1152"/>
+                  <w:tcW w:type="dxa" w:w="936"/>
                   <w:tcMar>
                     <w:top w:w="45" w:type="dxa"/>
                     <w:left w:w="80" w:type="dxa"/>
@@ -9815,7 +9815,7 @@
               </w:tc>
               <w:tc>
                 <w:tcPr>
-                  <w:tcW w:type="dxa" w:w="1152"/>
+                  <w:tcW w:type="dxa" w:w="936"/>
                   <w:tcMar>
                     <w:top w:w="45" w:type="dxa"/>
                     <w:left w:w="80" w:type="dxa"/>
@@ -9844,7 +9844,7 @@
               </w:tc>
               <w:tc>
                 <w:tcPr>
-                  <w:tcW w:type="dxa" w:w="1224"/>
+                  <w:tcW w:type="dxa" w:w="994"/>
                   <w:tcMar>
                     <w:top w:w="45" w:type="dxa"/>
                     <w:left w:w="80" w:type="dxa"/>
@@ -9873,7 +9873,7 @@
               </w:tc>
               <w:tc>
                 <w:tcPr>
-                  <w:tcW w:type="dxa" w:w="1152"/>
+                  <w:tcW w:type="dxa" w:w="936"/>
                   <w:tcMar>
                     <w:top w:w="45" w:type="dxa"/>
                     <w:left w:w="80" w:type="dxa"/>
@@ -9907,7 +9907,7 @@
               </w:trPr>
               <w:tc>
                 <w:tcPr>
-                  <w:tcW w:type="dxa" w:w="2160"/>
+                  <w:tcW w:type="dxa" w:w="1755"/>
                   <w:tcMar>
                     <w:top w:w="45" w:type="dxa"/>
                     <w:left w:w="80" w:type="dxa"/>
@@ -9936,7 +9936,7 @@
               </w:tc>
               <w:tc>
                 <w:tcPr>
-                  <w:tcW w:type="dxa" w:w="1152"/>
+                  <w:tcW w:type="dxa" w:w="936"/>
                   <w:tcMar>
                     <w:top w:w="45" w:type="dxa"/>
                     <w:left w:w="80" w:type="dxa"/>
@@ -9965,7 +9965,7 @@
               </w:tc>
               <w:tc>
                 <w:tcPr>
-                  <w:tcW w:type="dxa" w:w="1152"/>
+                  <w:tcW w:type="dxa" w:w="936"/>
                   <w:tcMar>
                     <w:top w:w="45" w:type="dxa"/>
                     <w:left w:w="80" w:type="dxa"/>
@@ -9994,7 +9994,7 @@
               </w:tc>
               <w:tc>
                 <w:tcPr>
-                  <w:tcW w:type="dxa" w:w="1224"/>
+                  <w:tcW w:type="dxa" w:w="994"/>
                   <w:tcMar>
                     <w:top w:w="45" w:type="dxa"/>
                     <w:left w:w="80" w:type="dxa"/>
@@ -10023,7 +10023,7 @@
               </w:tc>
               <w:tc>
                 <w:tcPr>
-                  <w:tcW w:type="dxa" w:w="1152"/>
+                  <w:tcW w:type="dxa" w:w="936"/>
                   <w:tcMar>
                     <w:top w:w="45" w:type="dxa"/>
                     <w:left w:w="80" w:type="dxa"/>
@@ -10057,7 +10057,7 @@
               </w:trPr>
               <w:tc>
                 <w:tcPr>
-                  <w:tcW w:type="dxa" w:w="2160"/>
+                  <w:tcW w:type="dxa" w:w="1755"/>
                   <w:tcMar>
                     <w:top w:w="45" w:type="dxa"/>
                     <w:left w:w="80" w:type="dxa"/>
@@ -10086,7 +10086,7 @@
               </w:tc>
               <w:tc>
                 <w:tcPr>
-                  <w:tcW w:type="dxa" w:w="1152"/>
+                  <w:tcW w:type="dxa" w:w="936"/>
                   <w:tcMar>
                     <w:top w:w="45" w:type="dxa"/>
                     <w:left w:w="80" w:type="dxa"/>
@@ -10115,7 +10115,7 @@
               </w:tc>
               <w:tc>
                 <w:tcPr>
-                  <w:tcW w:type="dxa" w:w="1152"/>
+                  <w:tcW w:type="dxa" w:w="936"/>
                   <w:tcMar>
                     <w:top w:w="45" w:type="dxa"/>
                     <w:left w:w="80" w:type="dxa"/>
@@ -10144,7 +10144,7 @@
               </w:tc>
               <w:tc>
                 <w:tcPr>
-                  <w:tcW w:type="dxa" w:w="1224"/>
+                  <w:tcW w:type="dxa" w:w="994"/>
                   <w:tcMar>
                     <w:top w:w="45" w:type="dxa"/>
                     <w:left w:w="80" w:type="dxa"/>
@@ -10173,7 +10173,7 @@
               </w:tc>
               <w:tc>
                 <w:tcPr>
-                  <w:tcW w:type="dxa" w:w="1152"/>
+                  <w:tcW w:type="dxa" w:w="936"/>
                   <w:tcMar>
                     <w:top w:w="45" w:type="dxa"/>
                     <w:left w:w="80" w:type="dxa"/>
@@ -10326,13 +10326,13 @@
         <w:tblLayout w:type="fixed"/>
       </w:tblPr>
       <w:tblGrid>
-        <w:gridCol w:w="14735"/>
+        <w:gridCol w:w="11376"/>
         <w:gridCol w:w="3168"/>
       </w:tblGrid>
       <w:tr>
         <w:tc>
           <w:tcPr>
-            <w:tcW w:type="dxa" w:w="14736"/>
+            <w:tcW w:type="dxa" w:w="11376"/>
             <w:tcMar>
               <w:top w:w="0" w:type="dxa"/>
               <w:left w:w="0" w:type="dxa"/>
@@ -10450,7 +10450,7 @@
           <w:b/>
           <w:i w:val="0"/>
           <w:color w:val="13213F"/>
-          <w:sz w:val="36"/>
+          <w:sz w:val="32"/>
         </w:rPr>
         <w:t>NIM rode the rate cycle up; cuts and reserve rules now reverse it</w:t>
       </w:r>
@@ -10475,14 +10475,14 @@
         <w:tblLayout w:type="fixed"/>
       </w:tblPr>
       <w:tblGrid>
-        <w:gridCol w:w="10512"/>
+        <w:gridCol w:w="8539"/>
         <w:gridCol w:w="503"/>
-        <w:gridCol w:w="6883"/>
+        <w:gridCol w:w="5591"/>
       </w:tblGrid>
       <w:tr>
         <w:tc>
           <w:tcPr>
-            <w:tcW w:type="dxa" w:w="10512"/>
+            <w:tcW w:type="dxa" w:w="8539"/>
             <w:tcMar>
               <w:top w:w="0" w:type="dxa"/>
               <w:left w:w="0" w:type="dxa"/>
@@ -10494,7 +10494,7 @@
             <w:r>
               <w:drawing>
                 <wp:inline xmlns:a="http://schemas.openxmlformats.org/drawingml/2006/main" xmlns:pic="http://schemas.openxmlformats.org/drawingml/2006/picture">
-                  <wp:extent cx="6675120" cy="3310074"/>
+                  <wp:extent cx="5422561" cy="2688952"/>
                   <wp:docPr id="6" name="Picture 6"/>
                   <wp:cNvGraphicFramePr>
                     <a:graphicFrameLocks noChangeAspect="1"/>
@@ -10515,7 +10515,7 @@
                         <pic:spPr>
                           <a:xfrm>
                             <a:off x="0" y="0"/>
-                            <a:ext cx="6675120" cy="3310074"/>
+                            <a:ext cx="5422561" cy="2688952"/>
                           </a:xfrm>
                           <a:prstGeom prst="rect"/>
                         </pic:spPr>
@@ -10535,7 +10535,7 @@
         </w:tc>
         <w:tc>
           <w:tcPr>
-            <w:tcW w:type="dxa" w:w="6883"/>
+            <w:tcW w:type="dxa" w:w="5592"/>
             <w:tcMar>
               <w:top w:w="0" w:type="dxa"/>
               <w:left w:w="0" w:type="dxa"/>
@@ -10781,13 +10781,13 @@
         <w:tblLayout w:type="fixed"/>
       </w:tblPr>
       <w:tblGrid>
-        <w:gridCol w:w="14735"/>
+        <w:gridCol w:w="11376"/>
         <w:gridCol w:w="3168"/>
       </w:tblGrid>
       <w:tr>
         <w:tc>
           <w:tcPr>
-            <w:tcW w:type="dxa" w:w="14736"/>
+            <w:tcW w:type="dxa" w:w="11376"/>
             <w:tcMar>
               <w:top w:w="0" w:type="dxa"/>
               <w:left w:w="0" w:type="dxa"/>
@@ -10905,7 +10905,7 @@
           <w:b/>
           <w:i w:val="0"/>
           <w:color w:val="13213F"/>
-          <w:sz w:val="36"/>
+          <w:sz w:val="32"/>
         </w:rPr>
         <w:t>NPL 90+ doubled to 5.3% - management says 'partly mechanical'</w:t>
       </w:r>
@@ -10930,14 +10930,14 @@
         <w:tblLayout w:type="fixed"/>
       </w:tblPr>
       <w:tblGrid>
-        <w:gridCol w:w="10944"/>
+        <w:gridCol w:w="8890"/>
         <w:gridCol w:w="503"/>
-        <w:gridCol w:w="6451"/>
+        <w:gridCol w:w="5240"/>
       </w:tblGrid>
       <w:tr>
         <w:tc>
           <w:tcPr>
-            <w:tcW w:type="dxa" w:w="10944"/>
+            <w:tcW w:type="dxa" w:w="8890"/>
             <w:tcMar>
               <w:top w:w="0" w:type="dxa"/>
               <w:left w:w="0" w:type="dxa"/>
@@ -10949,7 +10949,7 @@
             <w:r>
               <w:drawing>
                 <wp:inline xmlns:a="http://schemas.openxmlformats.org/drawingml/2006/main" xmlns:pic="http://schemas.openxmlformats.org/drawingml/2006/picture">
-                  <wp:extent cx="6949440" cy="2358017"/>
+                  <wp:extent cx="5645406" cy="1915545"/>
                   <wp:docPr id="7" name="Picture 7"/>
                   <wp:cNvGraphicFramePr>
                     <a:graphicFrameLocks noChangeAspect="1"/>
@@ -10970,7 +10970,7 @@
                         <pic:spPr>
                           <a:xfrm>
                             <a:off x="0" y="0"/>
-                            <a:ext cx="6949440" cy="2358017"/>
+                            <a:ext cx="5645406" cy="1915545"/>
                           </a:xfrm>
                           <a:prstGeom prst="rect"/>
                         </pic:spPr>
@@ -10990,7 +10990,7 @@
         </w:tc>
         <w:tc>
           <w:tcPr>
-            <w:tcW w:type="dxa" w:w="6451"/>
+            <w:tcW w:type="dxa" w:w="5241"/>
             <w:tcMar>
               <w:top w:w="0" w:type="dxa"/>
               <w:left w:w="0" w:type="dxa"/>
@@ -11206,13 +11206,13 @@
         <w:tblLayout w:type="fixed"/>
       </w:tblPr>
       <w:tblGrid>
-        <w:gridCol w:w="14735"/>
+        <w:gridCol w:w="11376"/>
         <w:gridCol w:w="3168"/>
       </w:tblGrid>
       <w:tr>
         <w:tc>
           <w:tcPr>
-            <w:tcW w:type="dxa" w:w="14736"/>
+            <w:tcW w:type="dxa" w:w="11376"/>
             <w:tcMar>
               <w:top w:w="0" w:type="dxa"/>
               <w:left w:w="0" w:type="dxa"/>
@@ -11330,7 +11330,7 @@
           <w:b/>
           <w:i w:val="0"/>
           <w:color w:val="13213F"/>
-          <w:sz w:val="36"/>
+          <w:sz w:val="32"/>
         </w:rPr>
         <w:t>Over-capitalised and self-funding - the payout is safe, buybacks are token</w:t>
       </w:r>
@@ -11355,13 +11355,13 @@
         <w:tblLayout w:type="fixed"/>
       </w:tblPr>
       <w:tblGrid>
-        <w:gridCol w:w="4367"/>
+        <w:gridCol w:w="3527"/>
         <w:gridCol w:w="144"/>
-        <w:gridCol w:w="4367"/>
+        <w:gridCol w:w="3527"/>
         <w:gridCol w:w="144"/>
-        <w:gridCol w:w="4367"/>
+        <w:gridCol w:w="3527"/>
         <w:gridCol w:w="144"/>
-        <w:gridCol w:w="4367"/>
+        <w:gridCol w:w="3527"/>
       </w:tblGrid>
       <w:tr>
         <w:trPr>
@@ -11369,7 +11369,7 @@
         </w:trPr>
         <w:tc>
           <w:tcPr>
-            <w:tcW w:type="dxa" w:w="4368"/>
+            <w:tcW w:type="dxa" w:w="3528"/>
             <w:shd w:val="clear" w:color="auto" w:fill="EFF1F5"/>
             <w:tcMar>
               <w:top w:w="140" w:type="dxa"/>
@@ -11417,7 +11417,7 @@
         </w:tc>
         <w:tc>
           <w:tcPr>
-            <w:tcW w:type="dxa" w:w="4368"/>
+            <w:tcW w:type="dxa" w:w="3528"/>
             <w:shd w:val="clear" w:color="auto" w:fill="EFF1F5"/>
             <w:tcMar>
               <w:top w:w="140" w:type="dxa"/>
@@ -11465,7 +11465,7 @@
         </w:tc>
         <w:tc>
           <w:tcPr>
-            <w:tcW w:type="dxa" w:w="4368"/>
+            <w:tcW w:type="dxa" w:w="3528"/>
             <w:shd w:val="clear" w:color="auto" w:fill="EFF1F5"/>
             <w:tcMar>
               <w:top w:w="140" w:type="dxa"/>
@@ -11513,7 +11513,7 @@
         </w:tc>
         <w:tc>
           <w:tcPr>
-            <w:tcW w:type="dxa" w:w="4368"/>
+            <w:tcW w:type="dxa" w:w="3528"/>
             <w:shd w:val="clear" w:color="auto" w:fill="EFF1F5"/>
             <w:tcMar>
               <w:top w:w="140" w:type="dxa"/>
@@ -11580,14 +11580,14 @@
         <w:tblLayout w:type="fixed"/>
       </w:tblPr>
       <w:tblGrid>
-        <w:gridCol w:w="8699"/>
+        <w:gridCol w:w="7020"/>
         <w:gridCol w:w="503"/>
-        <w:gridCol w:w="8699"/>
+        <w:gridCol w:w="7020"/>
       </w:tblGrid>
       <w:tr>
         <w:tc>
           <w:tcPr>
-            <w:tcW w:type="dxa" w:w="8700"/>
+            <w:tcW w:type="dxa" w:w="7020"/>
             <w:tcMar>
               <w:top w:w="0" w:type="dxa"/>
               <w:left w:w="0" w:type="dxa"/>
@@ -11721,7 +11721,7 @@
         </w:tc>
         <w:tc>
           <w:tcPr>
-            <w:tcW w:type="dxa" w:w="8700"/>
+            <w:tcW w:type="dxa" w:w="7020"/>
             <w:tcMar>
               <w:top w:w="0" w:type="dxa"/>
               <w:left w:w="0" w:type="dxa"/>
@@ -11873,13 +11873,13 @@
         <w:tblLayout w:type="fixed"/>
       </w:tblPr>
       <w:tblGrid>
-        <w:gridCol w:w="14735"/>
+        <w:gridCol w:w="11376"/>
         <w:gridCol w:w="3168"/>
       </w:tblGrid>
       <w:tr>
         <w:tc>
           <w:tcPr>
-            <w:tcW w:type="dxa" w:w="14736"/>
+            <w:tcW w:type="dxa" w:w="11376"/>
             <w:tcMar>
               <w:top w:w="0" w:type="dxa"/>
               <w:left w:w="0" w:type="dxa"/>
@@ -11997,7 +11997,7 @@
           <w:b/>
           <w:i w:val="0"/>
           <w:color w:val="13213F"/>
-          <w:sz w:val="36"/>
+          <w:sz w:val="32"/>
         </w:rPr>
         <w:t>No - ALMEX's ~62% blocks it; the controlling family's need for liquidity is the catalyst</w:t>
       </w:r>
@@ -12022,13 +12022,13 @@
         <w:tblLayout w:type="fixed"/>
       </w:tblPr>
       <w:tblGrid>
-        <w:gridCol w:w="4367"/>
+        <w:gridCol w:w="3527"/>
         <w:gridCol w:w="144"/>
-        <w:gridCol w:w="4367"/>
+        <w:gridCol w:w="3527"/>
         <w:gridCol w:w="144"/>
-        <w:gridCol w:w="4367"/>
+        <w:gridCol w:w="3527"/>
         <w:gridCol w:w="144"/>
-        <w:gridCol w:w="4367"/>
+        <w:gridCol w:w="3527"/>
       </w:tblGrid>
       <w:tr>
         <w:trPr>
@@ -12036,7 +12036,7 @@
         </w:trPr>
         <w:tc>
           <w:tcPr>
-            <w:tcW w:type="dxa" w:w="4368"/>
+            <w:tcW w:type="dxa" w:w="3528"/>
             <w:shd w:val="clear" w:color="auto" w:fill="EFF1F5"/>
             <w:tcMar>
               <w:top w:w="140" w:type="dxa"/>
@@ -12084,7 +12084,7 @@
         </w:tc>
         <w:tc>
           <w:tcPr>
-            <w:tcW w:type="dxa" w:w="4368"/>
+            <w:tcW w:type="dxa" w:w="3528"/>
             <w:shd w:val="clear" w:color="auto" w:fill="EFF1F5"/>
             <w:tcMar>
               <w:top w:w="140" w:type="dxa"/>
@@ -12132,7 +12132,7 @@
         </w:tc>
         <w:tc>
           <w:tcPr>
-            <w:tcW w:type="dxa" w:w="4368"/>
+            <w:tcW w:type="dxa" w:w="3528"/>
             <w:shd w:val="clear" w:color="auto" w:fill="EFF1F5"/>
             <w:tcMar>
               <w:top w:w="140" w:type="dxa"/>
@@ -12180,7 +12180,7 @@
         </w:tc>
         <w:tc>
           <w:tcPr>
-            <w:tcW w:type="dxa" w:w="4368"/>
+            <w:tcW w:type="dxa" w:w="3528"/>
             <w:shd w:val="clear" w:color="auto" w:fill="EFF1F5"/>
             <w:tcMar>
               <w:top w:w="140" w:type="dxa"/>
@@ -12247,14 +12247,14 @@
         <w:tblLayout w:type="fixed"/>
       </w:tblPr>
       <w:tblGrid>
-        <w:gridCol w:w="8699"/>
+        <w:gridCol w:w="7020"/>
         <w:gridCol w:w="503"/>
-        <w:gridCol w:w="8699"/>
+        <w:gridCol w:w="7020"/>
       </w:tblGrid>
       <w:tr>
         <w:tc>
           <w:tcPr>
-            <w:tcW w:type="dxa" w:w="8700"/>
+            <w:tcW w:type="dxa" w:w="7020"/>
             <w:tcMar>
               <w:top w:w="0" w:type="dxa"/>
               <w:left w:w="0" w:type="dxa"/>
@@ -12358,7 +12358,7 @@
         </w:tc>
         <w:tc>
           <w:tcPr>
-            <w:tcW w:type="dxa" w:w="8700"/>
+            <w:tcW w:type="dxa" w:w="7020"/>
             <w:tcMar>
               <w:top w:w="0" w:type="dxa"/>
               <w:left w:w="0" w:type="dxa"/>
@@ -12510,13 +12510,13 @@
         <w:tblLayout w:type="fixed"/>
       </w:tblPr>
       <w:tblGrid>
-        <w:gridCol w:w="14735"/>
+        <w:gridCol w:w="11376"/>
         <w:gridCol w:w="3168"/>
       </w:tblGrid>
       <w:tr>
         <w:tc>
           <w:tcPr>
-            <w:tcW w:type="dxa" w:w="14736"/>
+            <w:tcW w:type="dxa" w:w="11376"/>
             <w:tcMar>
               <w:top w:w="0" w:type="dxa"/>
               <w:left w:w="0" w:type="dxa"/>
@@ -12634,7 +12634,7 @@
           <w:b/>
           <w:i w:val="0"/>
           <w:color w:val="13213F"/>
-          <w:sz w:val="36"/>
+          <w:sz w:val="32"/>
         </w:rPr>
         <w:t>No - control is not for sale; the realistic event is ALMEX selling down to 51%</w:t>
       </w:r>
@@ -12659,14 +12659,14 @@
         <w:tblLayout w:type="fixed"/>
       </w:tblPr>
       <w:tblGrid>
-        <w:gridCol w:w="9648"/>
+        <w:gridCol w:w="7837"/>
         <w:gridCol w:w="503"/>
-        <w:gridCol w:w="7747"/>
+        <w:gridCol w:w="6293"/>
       </w:tblGrid>
       <w:tr>
         <w:tc>
           <w:tcPr>
-            <w:tcW w:type="dxa" w:w="9648"/>
+            <w:tcW w:type="dxa" w:w="7838"/>
             <w:tcMar>
               <w:top w:w="0" w:type="dxa"/>
               <w:left w:w="0" w:type="dxa"/>
@@ -12704,10 +12704,10 @@
               <w:tblLayout w:type="fixed"/>
             </w:tblPr>
             <w:tblGrid>
-              <w:gridCol w:w="3600"/>
-              <w:gridCol w:w="1080"/>
-              <w:gridCol w:w="1728"/>
-              <w:gridCol w:w="3240"/>
+              <w:gridCol w:w="2924"/>
+              <w:gridCol w:w="877"/>
+              <w:gridCol w:w="1403"/>
+              <w:gridCol w:w="2632"/>
             </w:tblGrid>
             <w:tr>
               <w:trPr>
@@ -12716,7 +12716,7 @@
               </w:trPr>
               <w:tc>
                 <w:tcPr>
-                  <w:tcW w:type="dxa" w:w="3600"/>
+                  <w:tcW w:type="dxa" w:w="2924"/>
                   <w:shd w:val="clear" w:color="auto" w:fill="13213F"/>
                   <w:tcMar>
                     <w:top w:w="55" w:type="dxa"/>
@@ -12740,7 +12740,7 @@
               </w:tc>
               <w:tc>
                 <w:tcPr>
-                  <w:tcW w:type="dxa" w:w="1080"/>
+                  <w:tcW w:type="dxa" w:w="877"/>
                   <w:shd w:val="clear" w:color="auto" w:fill="13213F"/>
                   <w:tcMar>
                     <w:top w:w="55" w:type="dxa"/>
@@ -12764,7 +12764,7 @@
               </w:tc>
               <w:tc>
                 <w:tcPr>
-                  <w:tcW w:type="dxa" w:w="1728"/>
+                  <w:tcW w:type="dxa" w:w="1404"/>
                   <w:shd w:val="clear" w:color="auto" w:fill="13213F"/>
                   <w:tcMar>
                     <w:top w:w="55" w:type="dxa"/>
@@ -12788,7 +12788,7 @@
               </w:tc>
               <w:tc>
                 <w:tcPr>
-                  <w:tcW w:type="dxa" w:w="3240"/>
+                  <w:tcW w:type="dxa" w:w="2632"/>
                   <w:shd w:val="clear" w:color="auto" w:fill="13213F"/>
                   <w:tcMar>
                     <w:top w:w="55" w:type="dxa"/>
@@ -12817,7 +12817,7 @@
               </w:trPr>
               <w:tc>
                 <w:tcPr>
-                  <w:tcW w:type="dxa" w:w="3600"/>
+                  <w:tcW w:type="dxa" w:w="2924"/>
                   <w:tcMar>
                     <w:top w:w="45" w:type="dxa"/>
                     <w:left w:w="80" w:type="dxa"/>
@@ -12846,7 +12846,7 @@
               </w:tc>
               <w:tc>
                 <w:tcPr>
-                  <w:tcW w:type="dxa" w:w="1080"/>
+                  <w:tcW w:type="dxa" w:w="877"/>
                   <w:tcMar>
                     <w:top w:w="45" w:type="dxa"/>
                     <w:left w:w="80" w:type="dxa"/>
@@ -12875,7 +12875,7 @@
               </w:tc>
               <w:tc>
                 <w:tcPr>
-                  <w:tcW w:type="dxa" w:w="1728"/>
+                  <w:tcW w:type="dxa" w:w="1404"/>
                   <w:tcMar>
                     <w:top w:w="45" w:type="dxa"/>
                     <w:left w:w="80" w:type="dxa"/>
@@ -12904,7 +12904,7 @@
               </w:tc>
               <w:tc>
                 <w:tcPr>
-                  <w:tcW w:type="dxa" w:w="3240"/>
+                  <w:tcW w:type="dxa" w:w="2632"/>
                   <w:tcMar>
                     <w:top w:w="45" w:type="dxa"/>
                     <w:left w:w="80" w:type="dxa"/>
@@ -12938,7 +12938,7 @@
               </w:trPr>
               <w:tc>
                 <w:tcPr>
-                  <w:tcW w:type="dxa" w:w="3600"/>
+                  <w:tcW w:type="dxa" w:w="2924"/>
                   <w:tcMar>
                     <w:top w:w="45" w:type="dxa"/>
                     <w:left w:w="80" w:type="dxa"/>
@@ -12967,7 +12967,7 @@
               </w:tc>
               <w:tc>
                 <w:tcPr>
-                  <w:tcW w:type="dxa" w:w="1080"/>
+                  <w:tcW w:type="dxa" w:w="877"/>
                   <w:tcMar>
                     <w:top w:w="45" w:type="dxa"/>
                     <w:left w:w="80" w:type="dxa"/>
@@ -12996,7 +12996,7 @@
               </w:tc>
               <w:tc>
                 <w:tcPr>
-                  <w:tcW w:type="dxa" w:w="1728"/>
+                  <w:tcW w:type="dxa" w:w="1404"/>
                   <w:tcMar>
                     <w:top w:w="45" w:type="dxa"/>
                     <w:left w:w="80" w:type="dxa"/>
@@ -13025,7 +13025,7 @@
               </w:tc>
               <w:tc>
                 <w:tcPr>
-                  <w:tcW w:type="dxa" w:w="3240"/>
+                  <w:tcW w:type="dxa" w:w="2632"/>
                   <w:tcMar>
                     <w:top w:w="45" w:type="dxa"/>
                     <w:left w:w="80" w:type="dxa"/>
@@ -13059,7 +13059,7 @@
               </w:trPr>
               <w:tc>
                 <w:tcPr>
-                  <w:tcW w:type="dxa" w:w="3600"/>
+                  <w:tcW w:type="dxa" w:w="2924"/>
                   <w:tcMar>
                     <w:top w:w="45" w:type="dxa"/>
                     <w:left w:w="80" w:type="dxa"/>
@@ -13088,7 +13088,7 @@
               </w:tc>
               <w:tc>
                 <w:tcPr>
-                  <w:tcW w:type="dxa" w:w="1080"/>
+                  <w:tcW w:type="dxa" w:w="877"/>
                   <w:tcMar>
                     <w:top w:w="45" w:type="dxa"/>
                     <w:left w:w="80" w:type="dxa"/>
@@ -13117,7 +13117,7 @@
               </w:tc>
               <w:tc>
                 <w:tcPr>
-                  <w:tcW w:type="dxa" w:w="1728"/>
+                  <w:tcW w:type="dxa" w:w="1404"/>
                   <w:tcMar>
                     <w:top w:w="45" w:type="dxa"/>
                     <w:left w:w="80" w:type="dxa"/>
@@ -13146,7 +13146,7 @@
               </w:tc>
               <w:tc>
                 <w:tcPr>
-                  <w:tcW w:type="dxa" w:w="3240"/>
+                  <w:tcW w:type="dxa" w:w="2632"/>
                   <w:tcMar>
                     <w:top w:w="45" w:type="dxa"/>
                     <w:left w:w="80" w:type="dxa"/>
@@ -13180,7 +13180,7 @@
               </w:trPr>
               <w:tc>
                 <w:tcPr>
-                  <w:tcW w:type="dxa" w:w="3600"/>
+                  <w:tcW w:type="dxa" w:w="2924"/>
                   <w:tcMar>
                     <w:top w:w="45" w:type="dxa"/>
                     <w:left w:w="80" w:type="dxa"/>
@@ -13209,7 +13209,7 @@
               </w:tc>
               <w:tc>
                 <w:tcPr>
-                  <w:tcW w:type="dxa" w:w="1080"/>
+                  <w:tcW w:type="dxa" w:w="877"/>
                   <w:tcMar>
                     <w:top w:w="45" w:type="dxa"/>
                     <w:left w:w="80" w:type="dxa"/>
@@ -13238,7 +13238,7 @@
               </w:tc>
               <w:tc>
                 <w:tcPr>
-                  <w:tcW w:type="dxa" w:w="1728"/>
+                  <w:tcW w:type="dxa" w:w="1404"/>
                   <w:tcMar>
                     <w:top w:w="45" w:type="dxa"/>
                     <w:left w:w="80" w:type="dxa"/>
@@ -13267,7 +13267,7 @@
               </w:tc>
               <w:tc>
                 <w:tcPr>
-                  <w:tcW w:type="dxa" w:w="3240"/>
+                  <w:tcW w:type="dxa" w:w="2632"/>
                   <w:tcMar>
                     <w:top w:w="45" w:type="dxa"/>
                     <w:left w:w="80" w:type="dxa"/>
@@ -13301,7 +13301,7 @@
               </w:trPr>
               <w:tc>
                 <w:tcPr>
-                  <w:tcW w:type="dxa" w:w="3600"/>
+                  <w:tcW w:type="dxa" w:w="2924"/>
                   <w:tcMar>
                     <w:top w:w="45" w:type="dxa"/>
                     <w:left w:w="80" w:type="dxa"/>
@@ -13330,7 +13330,7 @@
               </w:tc>
               <w:tc>
                 <w:tcPr>
-                  <w:tcW w:type="dxa" w:w="1080"/>
+                  <w:tcW w:type="dxa" w:w="877"/>
                   <w:tcMar>
                     <w:top w:w="45" w:type="dxa"/>
                     <w:left w:w="80" w:type="dxa"/>
@@ -13359,7 +13359,7 @@
               </w:tc>
               <w:tc>
                 <w:tcPr>
-                  <w:tcW w:type="dxa" w:w="1728"/>
+                  <w:tcW w:type="dxa" w:w="1404"/>
                   <w:tcMar>
                     <w:top w:w="45" w:type="dxa"/>
                     <w:left w:w="80" w:type="dxa"/>
@@ -13388,7 +13388,7 @@
               </w:tc>
               <w:tc>
                 <w:tcPr>
-                  <w:tcW w:type="dxa" w:w="3240"/>
+                  <w:tcW w:type="dxa" w:w="2632"/>
                   <w:tcMar>
                     <w:top w:w="45" w:type="dxa"/>
                     <w:left w:w="80" w:type="dxa"/>
@@ -13422,7 +13422,7 @@
               </w:trPr>
               <w:tc>
                 <w:tcPr>
-                  <w:tcW w:type="dxa" w:w="3600"/>
+                  <w:tcW w:type="dxa" w:w="2924"/>
                   <w:tcMar>
                     <w:top w:w="45" w:type="dxa"/>
                     <w:left w:w="80" w:type="dxa"/>
@@ -13451,7 +13451,7 @@
               </w:tc>
               <w:tc>
                 <w:tcPr>
-                  <w:tcW w:type="dxa" w:w="1080"/>
+                  <w:tcW w:type="dxa" w:w="877"/>
                   <w:tcMar>
                     <w:top w:w="45" w:type="dxa"/>
                     <w:left w:w="80" w:type="dxa"/>
@@ -13480,7 +13480,7 @@
               </w:tc>
               <w:tc>
                 <w:tcPr>
-                  <w:tcW w:type="dxa" w:w="1728"/>
+                  <w:tcW w:type="dxa" w:w="1404"/>
                   <w:tcMar>
                     <w:top w:w="45" w:type="dxa"/>
                     <w:left w:w="80" w:type="dxa"/>
@@ -13509,7 +13509,7 @@
               </w:tc>
               <w:tc>
                 <w:tcPr>
-                  <w:tcW w:type="dxa" w:w="3240"/>
+                  <w:tcW w:type="dxa" w:w="2632"/>
                   <w:tcMar>
                     <w:top w:w="45" w:type="dxa"/>
                     <w:left w:w="80" w:type="dxa"/>
@@ -13543,7 +13543,7 @@
               </w:trPr>
               <w:tc>
                 <w:tcPr>
-                  <w:tcW w:type="dxa" w:w="3600"/>
+                  <w:tcW w:type="dxa" w:w="2924"/>
                   <w:tcMar>
                     <w:top w:w="45" w:type="dxa"/>
                     <w:left w:w="80" w:type="dxa"/>
@@ -13572,7 +13572,7 @@
               </w:tc>
               <w:tc>
                 <w:tcPr>
-                  <w:tcW w:type="dxa" w:w="1080"/>
+                  <w:tcW w:type="dxa" w:w="877"/>
                   <w:tcMar>
                     <w:top w:w="45" w:type="dxa"/>
                     <w:left w:w="80" w:type="dxa"/>
@@ -13601,7 +13601,7 @@
               </w:tc>
               <w:tc>
                 <w:tcPr>
-                  <w:tcW w:type="dxa" w:w="1728"/>
+                  <w:tcW w:type="dxa" w:w="1404"/>
                   <w:tcMar>
                     <w:top w:w="45" w:type="dxa"/>
                     <w:left w:w="80" w:type="dxa"/>
@@ -13630,7 +13630,7 @@
               </w:tc>
               <w:tc>
                 <w:tcPr>
-                  <w:tcW w:type="dxa" w:w="3240"/>
+                  <w:tcW w:type="dxa" w:w="2632"/>
                   <w:tcMar>
                     <w:top w:w="45" w:type="dxa"/>
                     <w:left w:w="80" w:type="dxa"/>
@@ -13664,7 +13664,7 @@
               </w:trPr>
               <w:tc>
                 <w:tcPr>
-                  <w:tcW w:type="dxa" w:w="3600"/>
+                  <w:tcW w:type="dxa" w:w="2924"/>
                   <w:tcMar>
                     <w:top w:w="45" w:type="dxa"/>
                     <w:left w:w="80" w:type="dxa"/>
@@ -13693,7 +13693,7 @@
               </w:tc>
               <w:tc>
                 <w:tcPr>
-                  <w:tcW w:type="dxa" w:w="1080"/>
+                  <w:tcW w:type="dxa" w:w="877"/>
                   <w:tcMar>
                     <w:top w:w="45" w:type="dxa"/>
                     <w:left w:w="80" w:type="dxa"/>
@@ -13722,7 +13722,7 @@
               </w:tc>
               <w:tc>
                 <w:tcPr>
-                  <w:tcW w:type="dxa" w:w="1728"/>
+                  <w:tcW w:type="dxa" w:w="1404"/>
                   <w:tcMar>
                     <w:top w:w="45" w:type="dxa"/>
                     <w:left w:w="80" w:type="dxa"/>
@@ -13751,7 +13751,7 @@
               </w:tc>
               <w:tc>
                 <w:tcPr>
-                  <w:tcW w:type="dxa" w:w="3240"/>
+                  <w:tcW w:type="dxa" w:w="2632"/>
                   <w:tcMar>
                     <w:top w:w="45" w:type="dxa"/>
                     <w:left w:w="80" w:type="dxa"/>
@@ -13790,7 +13790,7 @@
         </w:tc>
         <w:tc>
           <w:tcPr>
-            <w:tcW w:type="dxa" w:w="7747"/>
+            <w:tcW w:type="dxa" w:w="6293"/>
             <w:tcMar>
               <w:top w:w="0" w:type="dxa"/>
               <w:left w:w="0" w:type="dxa"/>
@@ -13942,13 +13942,13 @@
         <w:tblLayout w:type="fixed"/>
       </w:tblPr>
       <w:tblGrid>
-        <w:gridCol w:w="14735"/>
+        <w:gridCol w:w="11376"/>
         <w:gridCol w:w="3168"/>
       </w:tblGrid>
       <w:tr>
         <w:tc>
           <w:tcPr>
-            <w:tcW w:type="dxa" w:w="14736"/>
+            <w:tcW w:type="dxa" w:w="11376"/>
             <w:tcMar>
               <w:top w:w="0" w:type="dxa"/>
               <w:left w:w="0" w:type="dxa"/>
@@ -14066,7 +14066,7 @@
           <w:b/>
           <w:i w:val="0"/>
           <w:color w:val="13213F"/>
-          <w:sz w:val="36"/>
+          <w:sz w:val="32"/>
         </w:rPr>
         <w:t>Upside/downside skew ~2.4:1 - and the dividend cushions the bear case</w:t>
       </w:r>
@@ -14091,10 +14091,10 @@
         <w:tblLayout w:type="fixed"/>
       </w:tblPr>
       <w:tblGrid>
-        <w:gridCol w:w="3744"/>
-        <w:gridCol w:w="4536"/>
-        <w:gridCol w:w="4536"/>
-        <w:gridCol w:w="4579"/>
+        <w:gridCol w:w="3041"/>
+        <w:gridCol w:w="3684"/>
+        <w:gridCol w:w="3684"/>
+        <w:gridCol w:w="3719"/>
       </w:tblGrid>
       <w:tr>
         <w:trPr>
@@ -14103,7 +14103,7 @@
         </w:trPr>
         <w:tc>
           <w:tcPr>
-            <w:tcW w:type="dxa" w:w="3744"/>
+            <w:tcW w:type="dxa" w:w="3041"/>
             <w:shd w:val="clear" w:color="auto" w:fill="13213F"/>
             <w:tcMar>
               <w:top w:w="55" w:type="dxa"/>
@@ -14116,7 +14116,7 @@
         </w:tc>
         <w:tc>
           <w:tcPr>
-            <w:tcW w:type="dxa" w:w="4536"/>
+            <w:tcW w:type="dxa" w:w="3685"/>
             <w:shd w:val="clear" w:color="auto" w:fill="13213F"/>
             <w:tcMar>
               <w:top w:w="55" w:type="dxa"/>
@@ -14140,7 +14140,7 @@
         </w:tc>
         <w:tc>
           <w:tcPr>
-            <w:tcW w:type="dxa" w:w="4536"/>
+            <w:tcW w:type="dxa" w:w="3685"/>
             <w:shd w:val="clear" w:color="auto" w:fill="13213F"/>
             <w:tcMar>
               <w:top w:w="55" w:type="dxa"/>
@@ -14164,7 +14164,7 @@
         </w:tc>
         <w:tc>
           <w:tcPr>
-            <w:tcW w:type="dxa" w:w="4579"/>
+            <w:tcW w:type="dxa" w:w="3720"/>
             <w:shd w:val="clear" w:color="auto" w:fill="13213F"/>
             <w:tcMar>
               <w:top w:w="55" w:type="dxa"/>
@@ -14193,7 +14193,7 @@
         </w:trPr>
         <w:tc>
           <w:tcPr>
-            <w:tcW w:type="dxa" w:w="3744"/>
+            <w:tcW w:type="dxa" w:w="3041"/>
             <w:tcMar>
               <w:top w:w="45" w:type="dxa"/>
               <w:left w:w="80" w:type="dxa"/>
@@ -14222,7 +14222,7 @@
         </w:tc>
         <w:tc>
           <w:tcPr>
-            <w:tcW w:type="dxa" w:w="4536"/>
+            <w:tcW w:type="dxa" w:w="3685"/>
             <w:tcMar>
               <w:top w:w="45" w:type="dxa"/>
               <w:left w:w="80" w:type="dxa"/>
@@ -14251,7 +14251,7 @@
         </w:tc>
         <w:tc>
           <w:tcPr>
-            <w:tcW w:type="dxa" w:w="4536"/>
+            <w:tcW w:type="dxa" w:w="3685"/>
             <w:tcMar>
               <w:top w:w="45" w:type="dxa"/>
               <w:left w:w="80" w:type="dxa"/>
@@ -14280,7 +14280,7 @@
         </w:tc>
         <w:tc>
           <w:tcPr>
-            <w:tcW w:type="dxa" w:w="4579"/>
+            <w:tcW w:type="dxa" w:w="3720"/>
             <w:tcMar>
               <w:top w:w="45" w:type="dxa"/>
               <w:left w:w="80" w:type="dxa"/>
@@ -14314,7 +14314,7 @@
         </w:trPr>
         <w:tc>
           <w:tcPr>
-            <w:tcW w:type="dxa" w:w="3744"/>
+            <w:tcW w:type="dxa" w:w="3041"/>
             <w:tcMar>
               <w:top w:w="45" w:type="dxa"/>
               <w:left w:w="80" w:type="dxa"/>
@@ -14343,7 +14343,7 @@
         </w:tc>
         <w:tc>
           <w:tcPr>
-            <w:tcW w:type="dxa" w:w="4536"/>
+            <w:tcW w:type="dxa" w:w="3685"/>
             <w:tcMar>
               <w:top w:w="45" w:type="dxa"/>
               <w:left w:w="80" w:type="dxa"/>
@@ -14372,7 +14372,7 @@
         </w:tc>
         <w:tc>
           <w:tcPr>
-            <w:tcW w:type="dxa" w:w="4536"/>
+            <w:tcW w:type="dxa" w:w="3685"/>
             <w:tcMar>
               <w:top w:w="45" w:type="dxa"/>
               <w:left w:w="80" w:type="dxa"/>
@@ -14401,7 +14401,7 @@
         </w:tc>
         <w:tc>
           <w:tcPr>
-            <w:tcW w:type="dxa" w:w="4579"/>
+            <w:tcW w:type="dxa" w:w="3720"/>
             <w:tcMar>
               <w:top w:w="45" w:type="dxa"/>
               <w:left w:w="80" w:type="dxa"/>
@@ -14435,7 +14435,7 @@
         </w:trPr>
         <w:tc>
           <w:tcPr>
-            <w:tcW w:type="dxa" w:w="3744"/>
+            <w:tcW w:type="dxa" w:w="3041"/>
             <w:tcMar>
               <w:top w:w="45" w:type="dxa"/>
               <w:left w:w="80" w:type="dxa"/>
@@ -14464,7 +14464,7 @@
         </w:tc>
         <w:tc>
           <w:tcPr>
-            <w:tcW w:type="dxa" w:w="4536"/>
+            <w:tcW w:type="dxa" w:w="3685"/>
             <w:tcMar>
               <w:top w:w="45" w:type="dxa"/>
               <w:left w:w="80" w:type="dxa"/>
@@ -14493,7 +14493,7 @@
         </w:tc>
         <w:tc>
           <w:tcPr>
-            <w:tcW w:type="dxa" w:w="4536"/>
+            <w:tcW w:type="dxa" w:w="3685"/>
             <w:tcMar>
               <w:top w:w="45" w:type="dxa"/>
               <w:left w:w="80" w:type="dxa"/>
@@ -14522,7 +14522,7 @@
         </w:tc>
         <w:tc>
           <w:tcPr>
-            <w:tcW w:type="dxa" w:w="4579"/>
+            <w:tcW w:type="dxa" w:w="3720"/>
             <w:tcMar>
               <w:top w:w="45" w:type="dxa"/>
               <w:left w:w="80" w:type="dxa"/>
@@ -14556,7 +14556,7 @@
         </w:trPr>
         <w:tc>
           <w:tcPr>
-            <w:tcW w:type="dxa" w:w="3744"/>
+            <w:tcW w:type="dxa" w:w="3041"/>
             <w:tcMar>
               <w:top w:w="45" w:type="dxa"/>
               <w:left w:w="80" w:type="dxa"/>
@@ -14585,7 +14585,7 @@
         </w:tc>
         <w:tc>
           <w:tcPr>
-            <w:tcW w:type="dxa" w:w="4536"/>
+            <w:tcW w:type="dxa" w:w="3685"/>
             <w:tcMar>
               <w:top w:w="45" w:type="dxa"/>
               <w:left w:w="80" w:type="dxa"/>
@@ -14614,7 +14614,7 @@
         </w:tc>
         <w:tc>
           <w:tcPr>
-            <w:tcW w:type="dxa" w:w="4536"/>
+            <w:tcW w:type="dxa" w:w="3685"/>
             <w:tcMar>
               <w:top w:w="45" w:type="dxa"/>
               <w:left w:w="80" w:type="dxa"/>
@@ -14643,7 +14643,7 @@
         </w:tc>
         <w:tc>
           <w:tcPr>
-            <w:tcW w:type="dxa" w:w="4579"/>
+            <w:tcW w:type="dxa" w:w="3720"/>
             <w:tcMar>
               <w:top w:w="45" w:type="dxa"/>
               <w:left w:w="80" w:type="dxa"/>
@@ -14677,7 +14677,7 @@
         </w:trPr>
         <w:tc>
           <w:tcPr>
-            <w:tcW w:type="dxa" w:w="3744"/>
+            <w:tcW w:type="dxa" w:w="3041"/>
             <w:tcMar>
               <w:top w:w="45" w:type="dxa"/>
               <w:left w:w="80" w:type="dxa"/>
@@ -14707,7 +14707,7 @@
         </w:tc>
         <w:tc>
           <w:tcPr>
-            <w:tcW w:type="dxa" w:w="4536"/>
+            <w:tcW w:type="dxa" w:w="3685"/>
             <w:tcMar>
               <w:top w:w="45" w:type="dxa"/>
               <w:left w:w="80" w:type="dxa"/>
@@ -14737,7 +14737,7 @@
         </w:tc>
         <w:tc>
           <w:tcPr>
-            <w:tcW w:type="dxa" w:w="4536"/>
+            <w:tcW w:type="dxa" w:w="3685"/>
             <w:tcMar>
               <w:top w:w="45" w:type="dxa"/>
               <w:left w:w="80" w:type="dxa"/>
@@ -14767,7 +14767,7 @@
         </w:tc>
         <w:tc>
           <w:tcPr>
-            <w:tcW w:type="dxa" w:w="4579"/>
+            <w:tcW w:type="dxa" w:w="3720"/>
             <w:tcMar>
               <w:top w:w="45" w:type="dxa"/>
               <w:left w:w="80" w:type="dxa"/>
@@ -14802,7 +14802,7 @@
         </w:trPr>
         <w:tc>
           <w:tcPr>
-            <w:tcW w:type="dxa" w:w="3744"/>
+            <w:tcW w:type="dxa" w:w="3041"/>
             <w:tcMar>
               <w:top w:w="45" w:type="dxa"/>
               <w:left w:w="80" w:type="dxa"/>
@@ -14831,7 +14831,7 @@
         </w:tc>
         <w:tc>
           <w:tcPr>
-            <w:tcW w:type="dxa" w:w="4536"/>
+            <w:tcW w:type="dxa" w:w="3685"/>
             <w:tcMar>
               <w:top w:w="45" w:type="dxa"/>
               <w:left w:w="80" w:type="dxa"/>
@@ -14860,7 +14860,7 @@
         </w:tc>
         <w:tc>
           <w:tcPr>
-            <w:tcW w:type="dxa" w:w="4536"/>
+            <w:tcW w:type="dxa" w:w="3685"/>
             <w:tcMar>
               <w:top w:w="45" w:type="dxa"/>
               <w:left w:w="80" w:type="dxa"/>
@@ -14889,7 +14889,7 @@
         </w:tc>
         <w:tc>
           <w:tcPr>
-            <w:tcW w:type="dxa" w:w="4579"/>
+            <w:tcW w:type="dxa" w:w="3720"/>
             <w:tcMar>
               <w:top w:w="45" w:type="dxa"/>
               <w:left w:w="80" w:type="dxa"/>
@@ -14943,14 +14943,14 @@
         <w:tblLayout w:type="fixed"/>
       </w:tblPr>
       <w:tblGrid>
-        <w:gridCol w:w="7776"/>
+        <w:gridCol w:w="6316"/>
         <w:gridCol w:w="503"/>
-        <w:gridCol w:w="9619"/>
+        <w:gridCol w:w="7814"/>
       </w:tblGrid>
       <w:tr>
         <w:tc>
           <w:tcPr>
-            <w:tcW w:type="dxa" w:w="7776"/>
+            <w:tcW w:type="dxa" w:w="6317"/>
             <w:tcMar>
               <w:top w:w="0" w:type="dxa"/>
               <w:left w:w="0" w:type="dxa"/>
@@ -14962,7 +14962,7 @@
             <w:r>
               <w:drawing>
                 <wp:inline xmlns:a="http://schemas.openxmlformats.org/drawingml/2006/main" xmlns:pic="http://schemas.openxmlformats.org/drawingml/2006/picture">
-                  <wp:extent cx="4937760" cy="2634336"/>
+                  <wp:extent cx="4011210" cy="2140014"/>
                   <wp:docPr id="8" name="Picture 8"/>
                   <wp:cNvGraphicFramePr>
                     <a:graphicFrameLocks noChangeAspect="1"/>
@@ -14983,7 +14983,7 @@
                         <pic:spPr>
                           <a:xfrm>
                             <a:off x="0" y="0"/>
-                            <a:ext cx="4937760" cy="2634336"/>
+                            <a:ext cx="4011210" cy="2140014"/>
                           </a:xfrm>
                           <a:prstGeom prst="rect"/>
                         </pic:spPr>
@@ -15003,7 +15003,7 @@
         </w:tc>
         <w:tc>
           <w:tcPr>
-            <w:tcW w:type="dxa" w:w="9619"/>
+            <w:tcW w:type="dxa" w:w="7814"/>
             <w:tcMar>
               <w:top w:w="0" w:type="dxa"/>
               <w:left w:w="0" w:type="dxa"/>
@@ -15179,12 +15179,12 @@
         <w:tblLayout w:type="fixed"/>
       </w:tblPr>
       <w:tblGrid>
-        <w:gridCol w:w="17903"/>
+        <w:gridCol w:w="14544"/>
       </w:tblGrid>
       <w:tr>
         <w:tc>
           <w:tcPr>
-            <w:tcW w:type="dxa" w:w="17904"/>
+            <w:tcW w:type="dxa" w:w="14544"/>
             <w:shd w:val="clear" w:color="auto" w:fill="EFF1F5"/>
             <w:tcBorders>
               <w:top w:val="nil"/>
@@ -15278,13 +15278,13 @@
         <w:tblLayout w:type="fixed"/>
       </w:tblPr>
       <w:tblGrid>
-        <w:gridCol w:w="14735"/>
+        <w:gridCol w:w="11376"/>
         <w:gridCol w:w="3168"/>
       </w:tblGrid>
       <w:tr>
         <w:tc>
           <w:tcPr>
-            <w:tcW w:type="dxa" w:w="14736"/>
+            <w:tcW w:type="dxa" w:w="11376"/>
             <w:tcMar>
               <w:top w:w="0" w:type="dxa"/>
               <w:left w:w="0" w:type="dxa"/>
@@ -15402,7 +15402,7 @@
           <w:b/>
           <w:i w:val="0"/>
           <w:color w:val="13213F"/>
-          <w:sz w:val="36"/>
+          <w:sz w:val="32"/>
         </w:rPr>
         <w:t>9M26 results and the ALMEX lock-up expiry dominate the next six weeks</w:t>
       </w:r>
@@ -15427,15 +15427,15 @@
         <w:tblLayout w:type="fixed"/>
       </w:tblPr>
       <w:tblGrid>
-        <w:gridCol w:w="3024"/>
-        <w:gridCol w:w="5040"/>
-        <w:gridCol w:w="8063"/>
-        <w:gridCol w:w="1775"/>
+        <w:gridCol w:w="2456"/>
+        <w:gridCol w:w="4094"/>
+        <w:gridCol w:w="6550"/>
+        <w:gridCol w:w="1442"/>
       </w:tblGrid>
       <w:tr>
         <w:tc>
           <w:tcPr>
-            <w:tcW w:type="dxa" w:w="3024"/>
+            <w:tcW w:type="dxa" w:w="2457"/>
             <w:tcMar>
               <w:top w:w="110" w:type="dxa"/>
               <w:left w:w="0" w:type="dxa"/>
@@ -15464,7 +15464,7 @@
         </w:tc>
         <w:tc>
           <w:tcPr>
-            <w:tcW w:type="dxa" w:w="5040"/>
+            <w:tcW w:type="dxa" w:w="4094"/>
             <w:tcMar>
               <w:top w:w="110" w:type="dxa"/>
               <w:left w:w="0" w:type="dxa"/>
@@ -15493,7 +15493,7 @@
         </w:tc>
         <w:tc>
           <w:tcPr>
-            <w:tcW w:type="dxa" w:w="8064"/>
+            <w:tcW w:type="dxa" w:w="6551"/>
             <w:tcMar>
               <w:top w:w="110" w:type="dxa"/>
               <w:left w:w="0" w:type="dxa"/>
@@ -15522,7 +15522,7 @@
         </w:tc>
         <w:tc>
           <w:tcPr>
-            <w:tcW w:type="dxa" w:w="1776"/>
+            <w:tcW w:type="dxa" w:w="1442"/>
             <w:tcMar>
               <w:top w:w="110" w:type="dxa"/>
               <w:left w:w="0" w:type="dxa"/>
@@ -15556,7 +15556,7 @@
       <w:tr>
         <w:tc>
           <w:tcPr>
-            <w:tcW w:type="dxa" w:w="3024"/>
+            <w:tcW w:type="dxa" w:w="2457"/>
             <w:tcMar>
               <w:top w:w="110" w:type="dxa"/>
               <w:left w:w="0" w:type="dxa"/>
@@ -15585,7 +15585,7 @@
         </w:tc>
         <w:tc>
           <w:tcPr>
-            <w:tcW w:type="dxa" w:w="5040"/>
+            <w:tcW w:type="dxa" w:w="4094"/>
             <w:tcMar>
               <w:top w:w="110" w:type="dxa"/>
               <w:left w:w="0" w:type="dxa"/>
@@ -15614,7 +15614,7 @@
         </w:tc>
         <w:tc>
           <w:tcPr>
-            <w:tcW w:type="dxa" w:w="8064"/>
+            <w:tcW w:type="dxa" w:w="6551"/>
             <w:tcMar>
               <w:top w:w="110" w:type="dxa"/>
               <w:left w:w="0" w:type="dxa"/>
@@ -15643,7 +15643,7 @@
         </w:tc>
         <w:tc>
           <w:tcPr>
-            <w:tcW w:type="dxa" w:w="1776"/>
+            <w:tcW w:type="dxa" w:w="1442"/>
             <w:tcMar>
               <w:top w:w="110" w:type="dxa"/>
               <w:left w:w="0" w:type="dxa"/>
@@ -15677,7 +15677,7 @@
       <w:tr>
         <w:tc>
           <w:tcPr>
-            <w:tcW w:type="dxa" w:w="3024"/>
+            <w:tcW w:type="dxa" w:w="2457"/>
             <w:tcMar>
               <w:top w:w="110" w:type="dxa"/>
               <w:left w:w="0" w:type="dxa"/>
@@ -15706,7 +15706,7 @@
         </w:tc>
         <w:tc>
           <w:tcPr>
-            <w:tcW w:type="dxa" w:w="5040"/>
+            <w:tcW w:type="dxa" w:w="4094"/>
             <w:tcMar>
               <w:top w:w="110" w:type="dxa"/>
               <w:left w:w="0" w:type="dxa"/>
@@ -15735,7 +15735,7 @@
         </w:tc>
         <w:tc>
           <w:tcPr>
-            <w:tcW w:type="dxa" w:w="8064"/>
+            <w:tcW w:type="dxa" w:w="6551"/>
             <w:tcMar>
               <w:top w:w="110" w:type="dxa"/>
               <w:left w:w="0" w:type="dxa"/>
@@ -15764,7 +15764,7 @@
         </w:tc>
         <w:tc>
           <w:tcPr>
-            <w:tcW w:type="dxa" w:w="1776"/>
+            <w:tcW w:type="dxa" w:w="1442"/>
             <w:tcMar>
               <w:top w:w="110" w:type="dxa"/>
               <w:left w:w="0" w:type="dxa"/>
@@ -15798,7 +15798,7 @@
       <w:tr>
         <w:tc>
           <w:tcPr>
-            <w:tcW w:type="dxa" w:w="3024"/>
+            <w:tcW w:type="dxa" w:w="2457"/>
             <w:tcMar>
               <w:top w:w="110" w:type="dxa"/>
               <w:left w:w="0" w:type="dxa"/>
@@ -15827,7 +15827,7 @@
         </w:tc>
         <w:tc>
           <w:tcPr>
-            <w:tcW w:type="dxa" w:w="5040"/>
+            <w:tcW w:type="dxa" w:w="4094"/>
             <w:tcMar>
               <w:top w:w="110" w:type="dxa"/>
               <w:left w:w="0" w:type="dxa"/>
@@ -15856,7 +15856,7 @@
         </w:tc>
         <w:tc>
           <w:tcPr>
-            <w:tcW w:type="dxa" w:w="8064"/>
+            <w:tcW w:type="dxa" w:w="6551"/>
             <w:tcMar>
               <w:top w:w="110" w:type="dxa"/>
               <w:left w:w="0" w:type="dxa"/>
@@ -15885,7 +15885,7 @@
         </w:tc>
         <w:tc>
           <w:tcPr>
-            <w:tcW w:type="dxa" w:w="1776"/>
+            <w:tcW w:type="dxa" w:w="1442"/>
             <w:tcMar>
               <w:top w:w="110" w:type="dxa"/>
               <w:left w:w="0" w:type="dxa"/>
@@ -15919,7 +15919,7 @@
       <w:tr>
         <w:tc>
           <w:tcPr>
-            <w:tcW w:type="dxa" w:w="3024"/>
+            <w:tcW w:type="dxa" w:w="2457"/>
             <w:tcMar>
               <w:top w:w="110" w:type="dxa"/>
               <w:left w:w="0" w:type="dxa"/>
@@ -15948,7 +15948,7 @@
         </w:tc>
         <w:tc>
           <w:tcPr>
-            <w:tcW w:type="dxa" w:w="5040"/>
+            <w:tcW w:type="dxa" w:w="4094"/>
             <w:tcMar>
               <w:top w:w="110" w:type="dxa"/>
               <w:left w:w="0" w:type="dxa"/>
@@ -15977,7 +15977,7 @@
         </w:tc>
         <w:tc>
           <w:tcPr>
-            <w:tcW w:type="dxa" w:w="8064"/>
+            <w:tcW w:type="dxa" w:w="6551"/>
             <w:tcMar>
               <w:top w:w="110" w:type="dxa"/>
               <w:left w:w="0" w:type="dxa"/>
@@ -16006,7 +16006,7 @@
         </w:tc>
         <w:tc>
           <w:tcPr>
-            <w:tcW w:type="dxa" w:w="1776"/>
+            <w:tcW w:type="dxa" w:w="1442"/>
             <w:tcMar>
               <w:top w:w="110" w:type="dxa"/>
               <w:left w:w="0" w:type="dxa"/>
@@ -16040,7 +16040,7 @@
       <w:tr>
         <w:tc>
           <w:tcPr>
-            <w:tcW w:type="dxa" w:w="3024"/>
+            <w:tcW w:type="dxa" w:w="2457"/>
             <w:tcMar>
               <w:top w:w="110" w:type="dxa"/>
               <w:left w:w="0" w:type="dxa"/>
@@ -16069,7 +16069,7 @@
         </w:tc>
         <w:tc>
           <w:tcPr>
-            <w:tcW w:type="dxa" w:w="5040"/>
+            <w:tcW w:type="dxa" w:w="4094"/>
             <w:tcMar>
               <w:top w:w="110" w:type="dxa"/>
               <w:left w:w="0" w:type="dxa"/>
@@ -16098,7 +16098,7 @@
         </w:tc>
         <w:tc>
           <w:tcPr>
-            <w:tcW w:type="dxa" w:w="8064"/>
+            <w:tcW w:type="dxa" w:w="6551"/>
             <w:tcMar>
               <w:top w:w="110" w:type="dxa"/>
               <w:left w:w="0" w:type="dxa"/>
@@ -16127,7 +16127,7 @@
         </w:tc>
         <w:tc>
           <w:tcPr>
-            <w:tcW w:type="dxa" w:w="1776"/>
+            <w:tcW w:type="dxa" w:w="1442"/>
             <w:tcMar>
               <w:top w:w="110" w:type="dxa"/>
               <w:left w:w="0" w:type="dxa"/>
@@ -16161,7 +16161,7 @@
       <w:tr>
         <w:tc>
           <w:tcPr>
-            <w:tcW w:type="dxa" w:w="3024"/>
+            <w:tcW w:type="dxa" w:w="2457"/>
             <w:tcMar>
               <w:top w:w="110" w:type="dxa"/>
               <w:left w:w="0" w:type="dxa"/>
@@ -16190,7 +16190,7 @@
         </w:tc>
         <w:tc>
           <w:tcPr>
-            <w:tcW w:type="dxa" w:w="5040"/>
+            <w:tcW w:type="dxa" w:w="4094"/>
             <w:tcMar>
               <w:top w:w="110" w:type="dxa"/>
               <w:left w:w="0" w:type="dxa"/>
@@ -16219,7 +16219,7 @@
         </w:tc>
         <w:tc>
           <w:tcPr>
-            <w:tcW w:type="dxa" w:w="8064"/>
+            <w:tcW w:type="dxa" w:w="6551"/>
             <w:tcMar>
               <w:top w:w="110" w:type="dxa"/>
               <w:left w:w="0" w:type="dxa"/>
@@ -16248,7 +16248,7 @@
         </w:tc>
         <w:tc>
           <w:tcPr>
-            <w:tcW w:type="dxa" w:w="1776"/>
+            <w:tcW w:type="dxa" w:w="1442"/>
             <w:tcMar>
               <w:top w:w="110" w:type="dxa"/>
               <w:left w:w="0" w:type="dxa"/>
@@ -16282,7 +16282,7 @@
       <w:tr>
         <w:tc>
           <w:tcPr>
-            <w:tcW w:type="dxa" w:w="3024"/>
+            <w:tcW w:type="dxa" w:w="2457"/>
             <w:tcMar>
               <w:top w:w="110" w:type="dxa"/>
               <w:left w:w="0" w:type="dxa"/>
@@ -16311,7 +16311,7 @@
         </w:tc>
         <w:tc>
           <w:tcPr>
-            <w:tcW w:type="dxa" w:w="5040"/>
+            <w:tcW w:type="dxa" w:w="4094"/>
             <w:tcMar>
               <w:top w:w="110" w:type="dxa"/>
               <w:left w:w="0" w:type="dxa"/>
@@ -16340,7 +16340,7 @@
         </w:tc>
         <w:tc>
           <w:tcPr>
-            <w:tcW w:type="dxa" w:w="8064"/>
+            <w:tcW w:type="dxa" w:w="6551"/>
             <w:tcMar>
               <w:top w:w="110" w:type="dxa"/>
               <w:left w:w="0" w:type="dxa"/>
@@ -16369,7 +16369,7 @@
         </w:tc>
         <w:tc>
           <w:tcPr>
-            <w:tcW w:type="dxa" w:w="1776"/>
+            <w:tcW w:type="dxa" w:w="1442"/>
             <w:tcMar>
               <w:top w:w="110" w:type="dxa"/>
               <w:left w:w="0" w:type="dxa"/>
@@ -16432,13 +16432,13 @@
         <w:tblLayout w:type="fixed"/>
       </w:tblPr>
       <w:tblGrid>
-        <w:gridCol w:w="14735"/>
+        <w:gridCol w:w="11376"/>
         <w:gridCol w:w="3168"/>
       </w:tblGrid>
       <w:tr>
         <w:tc>
           <w:tcPr>
-            <w:tcW w:type="dxa" w:w="14736"/>
+            <w:tcW w:type="dxa" w:w="11376"/>
             <w:tcMar>
               <w:top w:w="0" w:type="dxa"/>
               <w:left w:w="0" w:type="dxa"/>
@@ -16556,7 +16556,7 @@
           <w:b/>
           <w:i w:val="0"/>
           <w:color w:val="13213F"/>
-          <w:sz w:val="36"/>
+          <w:sz w:val="32"/>
         </w:rPr>
         <w:t>What would make this thesis wrong</w:t>
       </w:r>
@@ -16581,14 +16581,14 @@
         <w:tblLayout w:type="fixed"/>
       </w:tblPr>
       <w:tblGrid>
-        <w:gridCol w:w="8807"/>
+        <w:gridCol w:w="7128"/>
         <w:gridCol w:w="288"/>
-        <w:gridCol w:w="8807"/>
+        <w:gridCol w:w="7128"/>
       </w:tblGrid>
       <w:tr>
         <w:tc>
           <w:tcPr>
-            <w:tcW w:type="dxa" w:w="8808"/>
+            <w:tcW w:type="dxa" w:w="7128"/>
             <w:shd w:val="clear" w:color="auto" w:fill="EFF1F5"/>
             <w:tcMar>
               <w:top w:w="160" w:type="dxa"/>
@@ -16628,7 +16628,7 @@
             </w:tblPr>
             <w:tblGrid>
               <w:gridCol w:w="936"/>
-              <w:gridCol w:w="7511"/>
+              <w:gridCol w:w="5832"/>
             </w:tblGrid>
             <w:tr>
               <w:tc>
@@ -16650,7 +16650,7 @@
               </w:tc>
               <w:tc>
                 <w:tcPr>
-                  <w:tcW w:type="dxa" w:w="7512"/>
+                  <w:tcW w:type="dxa" w:w="5832"/>
                 </w:tcPr>
                 <w:p>
                   <w:pPr>
@@ -16695,7 +16695,7 @@
         </w:tc>
         <w:tc>
           <w:tcPr>
-            <w:tcW w:type="dxa" w:w="8808"/>
+            <w:tcW w:type="dxa" w:w="7128"/>
             <w:shd w:val="clear" w:color="auto" w:fill="EFF1F5"/>
             <w:tcMar>
               <w:top w:w="160" w:type="dxa"/>
@@ -16735,7 +16735,7 @@
             </w:tblPr>
             <w:tblGrid>
               <w:gridCol w:w="936"/>
-              <w:gridCol w:w="7511"/>
+              <w:gridCol w:w="5832"/>
             </w:tblGrid>
             <w:tr>
               <w:tc>
@@ -16757,7 +16757,7 @@
               </w:tc>
               <w:tc>
                 <w:tcPr>
-                  <w:tcW w:type="dxa" w:w="7512"/>
+                  <w:tcW w:type="dxa" w:w="5832"/>
                 </w:tcPr>
                 <w:p>
                   <w:pPr>
@@ -16801,7 +16801,7 @@
         </w:trPr>
         <w:tc>
           <w:tcPr>
-            <w:tcW w:type="dxa" w:w="8808"/>
+            <w:tcW w:type="dxa" w:w="7128"/>
           </w:tcPr>
           <w:p/>
         </w:tc>
@@ -16813,7 +16813,7 @@
         </w:tc>
         <w:tc>
           <w:tcPr>
-            <w:tcW w:type="dxa" w:w="8808"/>
+            <w:tcW w:type="dxa" w:w="7128"/>
           </w:tcPr>
           <w:p/>
         </w:tc>
@@ -16821,7 +16821,7 @@
       <w:tr>
         <w:tc>
           <w:tcPr>
-            <w:tcW w:type="dxa" w:w="8808"/>
+            <w:tcW w:type="dxa" w:w="7128"/>
             <w:shd w:val="clear" w:color="auto" w:fill="EFF1F5"/>
             <w:tcMar>
               <w:top w:w="160" w:type="dxa"/>
@@ -16861,7 +16861,7 @@
             </w:tblPr>
             <w:tblGrid>
               <w:gridCol w:w="936"/>
-              <w:gridCol w:w="7511"/>
+              <w:gridCol w:w="5832"/>
             </w:tblGrid>
             <w:tr>
               <w:tc>
@@ -16883,7 +16883,7 @@
               </w:tc>
               <w:tc>
                 <w:tcPr>
-                  <w:tcW w:type="dxa" w:w="7512"/>
+                  <w:tcW w:type="dxa" w:w="5832"/>
                 </w:tcPr>
                 <w:p>
                   <w:pPr>
@@ -16928,7 +16928,7 @@
         </w:tc>
         <w:tc>
           <w:tcPr>
-            <w:tcW w:type="dxa" w:w="8808"/>
+            <w:tcW w:type="dxa" w:w="7128"/>
             <w:shd w:val="clear" w:color="auto" w:fill="EFF1F5"/>
             <w:tcMar>
               <w:top w:w="160" w:type="dxa"/>
@@ -16968,7 +16968,7 @@
             </w:tblPr>
             <w:tblGrid>
               <w:gridCol w:w="936"/>
-              <w:gridCol w:w="7511"/>
+              <w:gridCol w:w="5832"/>
             </w:tblGrid>
             <w:tr>
               <w:tc>
@@ -16990,7 +16990,7 @@
               </w:tc>
               <w:tc>
                 <w:tcPr>
-                  <w:tcW w:type="dxa" w:w="7512"/>
+                  <w:tcW w:type="dxa" w:w="5832"/>
                 </w:tcPr>
                 <w:p>
                   <w:pPr>
@@ -17034,7 +17034,7 @@
         </w:trPr>
         <w:tc>
           <w:tcPr>
-            <w:tcW w:type="dxa" w:w="8808"/>
+            <w:tcW w:type="dxa" w:w="7128"/>
           </w:tcPr>
           <w:p/>
         </w:tc>
@@ -17046,7 +17046,7 @@
         </w:tc>
         <w:tc>
           <w:tcPr>
-            <w:tcW w:type="dxa" w:w="8808"/>
+            <w:tcW w:type="dxa" w:w="7128"/>
           </w:tcPr>
           <w:p/>
         </w:tc>
@@ -17054,7 +17054,7 @@
       <w:tr>
         <w:tc>
           <w:tcPr>
-            <w:tcW w:type="dxa" w:w="8808"/>
+            <w:tcW w:type="dxa" w:w="7128"/>
             <w:shd w:val="clear" w:color="auto" w:fill="EFF1F5"/>
             <w:tcMar>
               <w:top w:w="160" w:type="dxa"/>
@@ -17094,7 +17094,7 @@
             </w:tblPr>
             <w:tblGrid>
               <w:gridCol w:w="936"/>
-              <w:gridCol w:w="7511"/>
+              <w:gridCol w:w="5832"/>
             </w:tblGrid>
             <w:tr>
               <w:tc>
@@ -17116,7 +17116,7 @@
               </w:tc>
               <w:tc>
                 <w:tcPr>
-                  <w:tcW w:type="dxa" w:w="7512"/>
+                  <w:tcW w:type="dxa" w:w="5832"/>
                 </w:tcPr>
                 <w:p>
                   <w:pPr>
@@ -17161,7 +17161,7 @@
         </w:tc>
         <w:tc>
           <w:tcPr>
-            <w:tcW w:type="dxa" w:w="8808"/>
+            <w:tcW w:type="dxa" w:w="7128"/>
             <w:shd w:val="clear" w:color="auto" w:fill="EFF1F5"/>
             <w:tcMar>
               <w:top w:w="160" w:type="dxa"/>
@@ -17201,7 +17201,7 @@
             </w:tblPr>
             <w:tblGrid>
               <w:gridCol w:w="936"/>
-              <w:gridCol w:w="7511"/>
+              <w:gridCol w:w="5832"/>
             </w:tblGrid>
             <w:tr>
               <w:tc>
@@ -17223,7 +17223,7 @@
               </w:tc>
               <w:tc>
                 <w:tcPr>
-                  <w:tcW w:type="dxa" w:w="7512"/>
+                  <w:tcW w:type="dxa" w:w="5832"/>
                 </w:tcPr>
                 <w:p>
                   <w:pPr>
@@ -17268,7 +17268,7 @@
         <w:sectPr>
           <w:footerReference w:type="default" r:id="rId9"/>
           <w:headerReference w:type="default" r:id="rId10"/>
-          <w:pgSz w:w="19200" w:h="10800" w:orient="landscape"/>
+          <w:pgSz w:w="15840" w:h="12240" w:orient="landscape"/>
           <w:pgMar w:top="504" w:right="648" w:bottom="648" w:left="648" w:header="288" w:footer="288" w:gutter="0"/>
           <w:cols w:space="720"/>
           <w:docGrid w:linePitch="360"/>
@@ -17295,16 +17295,16 @@
         <w:tblLayout w:type="fixed"/>
       </w:tblPr>
       <w:tblGrid>
-        <w:gridCol w:w="12600"/>
-        <w:gridCol w:w="6599"/>
+        <w:gridCol w:w="10395"/>
+        <w:gridCol w:w="5444"/>
       </w:tblGrid>
       <w:tr>
         <w:trPr>
-          <w:trHeight w:val="10296" w:hRule="exact"/>
+          <w:trHeight w:val="11736" w:hRule="exact"/>
         </w:trPr>
         <w:tc>
           <w:tcPr>
-            <w:tcW w:type="dxa" w:w="12600"/>
+            <w:tcW w:type="dxa" w:w="10395"/>
             <w:shd w:val="clear" w:color="auto" w:fill="13213F"/>
             <w:tcMar>
               <w:top w:w="1000" w:type="dxa"/>
@@ -17360,15 +17360,15 @@
               <w:tblLayout w:type="fixed"/>
             </w:tblPr>
             <w:tblGrid>
-              <w:gridCol w:w="2736"/>
-              <w:gridCol w:w="2736"/>
-              <w:gridCol w:w="2736"/>
-              <w:gridCol w:w="2736"/>
+              <w:gridCol w:w="2257"/>
+              <w:gridCol w:w="2257"/>
+              <w:gridCol w:w="2257"/>
+              <w:gridCol w:w="2257"/>
             </w:tblGrid>
             <w:tr>
               <w:tc>
                 <w:tcPr>
-                  <w:tcW w:type="dxa" w:w="2736"/>
+                  <w:tcW w:type="dxa" w:w="2257"/>
                   <w:tcMar>
                     <w:top w:w="0" w:type="dxa"/>
                     <w:left w:w="0" w:type="dxa"/>
@@ -17394,7 +17394,7 @@
               </w:tc>
               <w:tc>
                 <w:tcPr>
-                  <w:tcW w:type="dxa" w:w="2736"/>
+                  <w:tcW w:type="dxa" w:w="2257"/>
                   <w:tcMar>
                     <w:top w:w="0" w:type="dxa"/>
                     <w:left w:w="0" w:type="dxa"/>
@@ -17420,7 +17420,7 @@
               </w:tc>
               <w:tc>
                 <w:tcPr>
-                  <w:tcW w:type="dxa" w:w="2736"/>
+                  <w:tcW w:type="dxa" w:w="2257"/>
                   <w:tcMar>
                     <w:top w:w="0" w:type="dxa"/>
                     <w:left w:w="0" w:type="dxa"/>
@@ -17446,7 +17446,7 @@
               </w:tc>
               <w:tc>
                 <w:tcPr>
-                  <w:tcW w:type="dxa" w:w="2736"/>
+                  <w:tcW w:type="dxa" w:w="2257"/>
                   <w:tcMar>
                     <w:top w:w="0" w:type="dxa"/>
                     <w:left w:w="0" w:type="dxa"/>
@@ -17474,7 +17474,7 @@
             <w:tr>
               <w:tc>
                 <w:tcPr>
-                  <w:tcW w:type="dxa" w:w="2736"/>
+                  <w:tcW w:type="dxa" w:w="2257"/>
                   <w:tcMar>
                     <w:top w:w="0" w:type="dxa"/>
                     <w:left w:w="0" w:type="dxa"/>
@@ -17497,7 +17497,7 @@
               </w:tc>
               <w:tc>
                 <w:tcPr>
-                  <w:tcW w:type="dxa" w:w="2736"/>
+                  <w:tcW w:type="dxa" w:w="2257"/>
                   <w:tcMar>
                     <w:top w:w="0" w:type="dxa"/>
                     <w:left w:w="0" w:type="dxa"/>
@@ -17520,7 +17520,7 @@
               </w:tc>
               <w:tc>
                 <w:tcPr>
-                  <w:tcW w:type="dxa" w:w="2736"/>
+                  <w:tcW w:type="dxa" w:w="2257"/>
                   <w:tcMar>
                     <w:top w:w="0" w:type="dxa"/>
                     <w:left w:w="0" w:type="dxa"/>
@@ -17543,7 +17543,7 @@
               </w:tc>
               <w:tc>
                 <w:tcPr>
-                  <w:tcW w:type="dxa" w:w="2736"/>
+                  <w:tcW w:type="dxa" w:w="2257"/>
                   <w:tcMar>
                     <w:top w:w="0" w:type="dxa"/>
                     <w:left w:w="0" w:type="dxa"/>
@@ -17710,7 +17710,7 @@
         </w:tc>
         <w:tc>
           <w:tcPr>
-            <w:tcW w:type="dxa" w:w="6600"/>
+            <w:tcW w:type="dxa" w:w="5445"/>
             <w:shd w:val="clear" w:color="auto" w:fill="13213F"/>
             <w:tcMar>
               <w:top w:w="1000" w:type="dxa"/>
@@ -17744,12 +17744,12 @@
               <w:tblLayout w:type="fixed"/>
             </w:tblPr>
             <w:tblGrid>
-              <w:gridCol w:w="5735"/>
+              <w:gridCol w:w="4580"/>
             </w:tblGrid>
             <w:tr>
               <w:tc>
                 <w:tcPr>
-                  <w:tcW w:type="dxa" w:w="5736"/>
+                  <w:tcW w:type="dxa" w:w="4581"/>
                   <w:shd w:val="clear" w:color="auto" w:fill="22355E"/>
                   <w:tcMar>
                     <w:top w:w="200" w:type="dxa"/>
@@ -17828,7 +17828,7 @@
     <w:sectPr>
       <w:footerReference w:type="default" r:id="rId19"/>
       <w:headerReference w:type="default" r:id="rId20"/>
-      <w:pgSz w:w="19200" w:h="10800" w:orient="landscape"/>
+      <w:pgSz w:w="15840" w:h="12240" w:orient="landscape"/>
       <w:pgMar w:top="0" w:right="0" w:bottom="0" w:left="0" w:header="0" w:footer="0" w:gutter="0"/>
       <w:cols w:space="720"/>
       <w:docGrid w:linePitch="360"/>
@@ -17859,13 +17859,13 @@
       <w:tblLayout w:type="fixed"/>
     </w:tblPr>
     <w:tblGrid>
-      <w:gridCol w:w="16463"/>
+      <w:gridCol w:w="13104"/>
       <w:gridCol w:w="1440"/>
     </w:tblGrid>
     <w:tr>
       <w:tc>
         <w:tcPr>
-          <w:tcW w:type="dxa" w:w="16464"/>
+          <w:tcW w:type="dxa" w:w="13104"/>
         </w:tcPr>
         <w:p>
           <w:r>

</xml_diff>